<commit_message>
Updating DRR template and output to add dynamic QC Flag Template
</commit_message>
<xml_diff>
--- a/SFAN_SNPLPORE_DRR_Template.docx
+++ b/SFAN_SNPLPORE_DRR_Template.docx
@@ -1,6 +1,6 @@
 
 <file path=word/document.xml><?xml version="1.0" encoding="utf-8"?>
-<w:document xmlns:wpc="http://schemas.microsoft.com/office/word/2010/wordprocessingCanvas" xmlns:cx="http://schemas.microsoft.com/office/drawing/2014/chartex" xmlns:cx1="http://schemas.microsoft.com/office/drawing/2015/9/8/chartex" xmlns:cx2="http://schemas.microsoft.com/office/drawing/2015/10/21/chartex" xmlns:cx3="http://schemas.microsoft.com/office/drawing/2016/5/9/chartex" xmlns:cx4="http://schemas.microsoft.com/office/drawing/2016/5/10/chartex" xmlns:cx5="http://schemas.microsoft.com/office/drawing/2016/5/11/chartex" xmlns:cx6="http://schemas.microsoft.com/office/drawing/2016/5/12/chartex" xmlns:cx7="http://schemas.microsoft.com/office/drawing/2016/5/13/chartex" xmlns:cx8="http://schemas.microsoft.com/office/drawing/2016/5/14/chartex" xmlns:mc="http://schemas.openxmlformats.org/markup-compatibility/2006" xmlns:aink="http://schemas.microsoft.com/office/drawing/2016/ink" xmlns:am3d="http://schemas.microsoft.com/office/drawing/2017/model3d" xmlns:o="urn:schemas-microsoft-com:office:office" xmlns:oel="http://schemas.microsoft.com/office/2019/extlst" xmlns:r="http://schemas.openxmlformats.org/officeDocument/2006/relationships" xmlns:m="http://schemas.openxmlformats.org/officeDocument/2006/math" xmlns:v="urn:schemas-microsoft-com:vml" xmlns:wp14="http://schemas.microsoft.com/office/word/2010/wordprocessingDrawing" xmlns:wp="http://schemas.openxmlformats.org/drawingml/2006/wordprocessingDrawing" xmlns:w10="urn:schemas-microsoft-com:office:word" xmlns:w="http://schemas.openxmlformats.org/wordprocessingml/2006/main" xmlns:w14="http://schemas.microsoft.com/office/word/2010/wordml" xmlns:w15="http://schemas.microsoft.com/office/word/2012/wordml" xmlns:w16cex="http://schemas.microsoft.com/office/word/2018/wordml/cex" xmlns:w16cid="http://schemas.microsoft.com/office/word/2016/wordml/cid" xmlns:w16="http://schemas.microsoft.com/office/word/2018/wordml" xmlns:w16sdtdh="http://schemas.microsoft.com/office/word/2020/wordml/sdtdatahash" xmlns:w16se="http://schemas.microsoft.com/office/word/2015/wordml/symex" xmlns:wpg="http://schemas.microsoft.com/office/word/2010/wordprocessingGroup" xmlns:wpi="http://schemas.microsoft.com/office/word/2010/wordprocessingInk" xmlns:wne="http://schemas.microsoft.com/office/word/2006/wordml" xmlns:wps="http://schemas.microsoft.com/office/word/2010/wordprocessingShape" mc:Ignorable="w14 w15 w16se w16cid w16 w16cex w16sdtdh wp14">
+<w:document xmlns:wpc="http://schemas.microsoft.com/office/word/2010/wordprocessingCanvas" xmlns:cx="http://schemas.microsoft.com/office/drawing/2014/chartex" xmlns:cx1="http://schemas.microsoft.com/office/drawing/2015/9/8/chartex" xmlns:cx2="http://schemas.microsoft.com/office/drawing/2015/10/21/chartex" xmlns:cx3="http://schemas.microsoft.com/office/drawing/2016/5/9/chartex" xmlns:cx4="http://schemas.microsoft.com/office/drawing/2016/5/10/chartex" xmlns:cx5="http://schemas.microsoft.com/office/drawing/2016/5/11/chartex" xmlns:cx6="http://schemas.microsoft.com/office/drawing/2016/5/12/chartex" xmlns:cx7="http://schemas.microsoft.com/office/drawing/2016/5/13/chartex" xmlns:cx8="http://schemas.microsoft.com/office/drawing/2016/5/14/chartex" xmlns:mc="http://schemas.openxmlformats.org/markup-compatibility/2006" xmlns:aink="http://schemas.microsoft.com/office/drawing/2016/ink" xmlns:am3d="http://schemas.microsoft.com/office/drawing/2017/model3d" xmlns:o="urn:schemas-microsoft-com:office:office" xmlns:oel="http://schemas.microsoft.com/office/2019/extlst" xmlns:r="http://schemas.openxmlformats.org/officeDocument/2006/relationships" xmlns:m="http://schemas.openxmlformats.org/officeDocument/2006/math" xmlns:v="urn:schemas-microsoft-com:vml" xmlns:wp14="http://schemas.microsoft.com/office/word/2010/wordprocessingDrawing" xmlns:wp="http://schemas.openxmlformats.org/drawingml/2006/wordprocessingDrawing" xmlns:w10="urn:schemas-microsoft-com:office:word" xmlns:w="http://schemas.openxmlformats.org/wordprocessingml/2006/main" xmlns:w14="http://schemas.microsoft.com/office/word/2010/wordml" xmlns:w15="http://schemas.microsoft.com/office/word/2012/wordml" xmlns:w16cex="http://schemas.microsoft.com/office/word/2018/wordml/cex" xmlns:w16cid="http://schemas.microsoft.com/office/word/2016/wordml/cid" xmlns:w16="http://schemas.microsoft.com/office/word/2018/wordml" xmlns:w16du="http://schemas.microsoft.com/office/word/2023/wordml/word16du" xmlns:w16sdtdh="http://schemas.microsoft.com/office/word/2020/wordml/sdtdatahash" xmlns:w16sdtfl="http://schemas.microsoft.com/office/word/2024/wordml/sdtformatlock" xmlns:w16se="http://schemas.microsoft.com/office/word/2015/wordml/symex" xmlns:wpg="http://schemas.microsoft.com/office/word/2010/wordprocessingGroup" xmlns:wpi="http://schemas.microsoft.com/office/word/2010/wordprocessingInk" xmlns:wne="http://schemas.microsoft.com/office/word/2006/wordml" xmlns:wps="http://schemas.microsoft.com/office/word/2010/wordprocessingShape" mc:Ignorable="w14 w15 w16se w16cid w16 w16cex w16sdtdh w16sdtfl w16du wp14">
   <w:body>
     <w:p>
       <w:pPr>
@@ -1061,7 +1061,23 @@
         <w:pStyle w:val="FirstParagraph"/>
       </w:pPr>
       <w:r>
-        <w:t>Within the context of an annual data lifecycle workflow, data are reviewed and validated through data verification and validation procedures implemented by the San Francisco Bay Area Inventory &amp; Monitoring Network (SFAN). After surveys are completed, monitoring personnel perform data entry validation to confirm entered data matches what was recorded on original data forms. Fields are checked for accuracy and completeness, including correct site names, expected locations and standard date and time entries. Data are checked against field notes when appropriate. After data entry verification has been completed records are given a data processing level of “Provisional”.</w:t>
+        <w:t xml:space="preserve">Within the context of an annual data lifecycle workflow, data are reviewed and validated through data verification and validation procedures implemented by the San Francisco Bay Area Inventory &amp; Monitoring Network (SFAN). After surveys are completed, monitoring personnel perform </w:t>
+      </w:r>
+      <w:proofErr w:type="gramStart"/>
+      <w:r>
+        <w:t>data entry</w:t>
+      </w:r>
+      <w:proofErr w:type="gramEnd"/>
+      <w:r>
+        <w:t xml:space="preserve"> validation to confirm entered data matches what was recorded on original data forms. Fields are checked for accuracy and completeness, including correct site names, expected locations and standard date and time entries. Data </w:t>
+      </w:r>
+      <w:proofErr w:type="gramStart"/>
+      <w:r>
+        <w:t>are</w:t>
+      </w:r>
+      <w:proofErr w:type="gramEnd"/>
+      <w:r>
+        <w:t xml:space="preserve"> checked against field notes when appropriate. After data entry verification has been completed records are given a data processing level of “Provisional”.</w:t>
       </w:r>
     </w:p>
     <w:p>
@@ -1084,7 +1100,15 @@
         <w:t xml:space="preserve"> and 2024</w:t>
       </w:r>
       <w:r>
-        <w:t xml:space="preserve"> data has been through the data validation procedure with accompanying “Accepted” data processing status.</w:t>
+        <w:t xml:space="preserve"> data </w:t>
+      </w:r>
+      <w:proofErr w:type="gramStart"/>
+      <w:r>
+        <w:t>has</w:t>
+      </w:r>
+      <w:proofErr w:type="gramEnd"/>
+      <w:r>
+        <w:t xml:space="preserve"> been through the data validation procedure with accompanying “Accepted” data processing status.</w:t>
       </w:r>
       <w:r>
         <w:t xml:space="preserve"> Monitoring years 2009 – 2018 and </w:t>
@@ -1190,2230 +1214,6 @@
         </w:rPr>
         <w:t>Realized data quality control flags.</w:t>
       </w:r>
-    </w:p>
-    <w:tbl>
-      <w:tblPr>
-        <w:tblW w:w="9840" w:type="dxa"/>
-        <w:tblInd w:w="108" w:type="dxa"/>
-        <w:tblLook w:val="04A0" w:firstRow="1" w:lastRow="0" w:firstColumn="1" w:lastColumn="0" w:noHBand="0" w:noVBand="1"/>
-      </w:tblPr>
-      <w:tblGrid>
-        <w:gridCol w:w="1600"/>
-        <w:gridCol w:w="5500"/>
-        <w:gridCol w:w="2740"/>
-      </w:tblGrid>
-      <w:tr>
-        <w:trPr>
-          <w:trHeight w:val="300"/>
-        </w:trPr>
-        <w:tc>
-          <w:tcPr>
-            <w:tcW w:w="1600" w:type="dxa"/>
-            <w:tcBorders>
-              <w:top w:val="nil"/>
-              <w:left w:val="nil"/>
-              <w:bottom w:val="single" w:sz="4" w:space="0" w:color="auto"/>
-              <w:right w:val="nil"/>
-            </w:tcBorders>
-            <w:shd w:val="clear" w:color="auto" w:fill="auto"/>
-            <w:noWrap/>
-            <w:vAlign w:val="bottom"/>
-            <w:hideMark/>
-          </w:tcPr>
-          <w:p>
-            <w:pPr>
-              <w:spacing w:after="0"/>
-              <w:rPr>
-                <w:rFonts w:ascii="Aptos" w:eastAsia="Times New Roman" w:hAnsi="Aptos" w:cs="Times New Roman"/>
-                <w:b/>
-                <w:bCs/>
-                <w:color w:val="000000"/>
-                <w:sz w:val="22"/>
-                <w:szCs w:val="22"/>
-              </w:rPr>
-            </w:pPr>
-            <w:r>
-              <w:rPr>
-                <w:rFonts w:ascii="Aptos" w:eastAsia="Times New Roman" w:hAnsi="Aptos" w:cs="Times New Roman"/>
-                <w:b/>
-                <w:bCs/>
-                <w:color w:val="000000"/>
-                <w:sz w:val="22"/>
-                <w:szCs w:val="22"/>
-              </w:rPr>
-              <w:t>Flag Code</w:t>
-            </w:r>
-          </w:p>
-        </w:tc>
-        <w:tc>
-          <w:tcPr>
-            <w:tcW w:w="5500" w:type="dxa"/>
-            <w:tcBorders>
-              <w:left w:val="nil"/>
-              <w:bottom w:val="single" w:sz="4" w:space="0" w:color="auto"/>
-              <w:right w:val="nil"/>
-            </w:tcBorders>
-            <w:shd w:val="clear" w:color="auto" w:fill="auto"/>
-            <w:noWrap/>
-            <w:vAlign w:val="bottom"/>
-            <w:hideMark/>
-          </w:tcPr>
-          <w:p>
-            <w:pPr>
-              <w:spacing w:after="0"/>
-              <w:rPr>
-                <w:rFonts w:ascii="Aptos" w:eastAsia="Times New Roman" w:hAnsi="Aptos" w:cs="Times New Roman"/>
-                <w:b/>
-                <w:bCs/>
-                <w:color w:val="000000"/>
-                <w:sz w:val="22"/>
-                <w:szCs w:val="22"/>
-              </w:rPr>
-            </w:pPr>
-            <w:r>
-              <w:rPr>
-                <w:rFonts w:ascii="Aptos" w:eastAsia="Times New Roman" w:hAnsi="Aptos" w:cs="Times New Roman"/>
-                <w:b/>
-                <w:bCs/>
-                <w:color w:val="000000"/>
-                <w:sz w:val="22"/>
-                <w:szCs w:val="22"/>
-              </w:rPr>
-              <w:t>Flag</w:t>
-            </w:r>
-            <w:r>
-              <w:rPr>
-                <w:rFonts w:ascii="Aptos" w:eastAsia="Times New Roman" w:hAnsi="Aptos" w:cs="Times New Roman"/>
-                <w:b/>
-                <w:bCs/>
-                <w:color w:val="000000"/>
-                <w:sz w:val="22"/>
-                <w:szCs w:val="22"/>
-              </w:rPr>
-              <w:t xml:space="preserve"> </w:t>
-            </w:r>
-            <w:r>
-              <w:rPr>
-                <w:rFonts w:ascii="Aptos" w:eastAsia="Times New Roman" w:hAnsi="Aptos" w:cs="Times New Roman"/>
-                <w:b/>
-                <w:bCs/>
-                <w:color w:val="000000"/>
-                <w:sz w:val="22"/>
-                <w:szCs w:val="22"/>
-              </w:rPr>
-              <w:t>Definition</w:t>
-            </w:r>
-          </w:p>
-        </w:tc>
-        <w:tc>
-          <w:tcPr>
-            <w:tcW w:w="2740" w:type="dxa"/>
-            <w:tcBorders>
-              <w:top w:val="nil"/>
-              <w:left w:val="nil"/>
-              <w:bottom w:val="single" w:sz="4" w:space="0" w:color="auto"/>
-              <w:right w:val="nil"/>
-            </w:tcBorders>
-            <w:shd w:val="clear" w:color="auto" w:fill="auto"/>
-            <w:noWrap/>
-            <w:vAlign w:val="bottom"/>
-            <w:hideMark/>
-          </w:tcPr>
-          <w:p>
-            <w:pPr>
-              <w:spacing w:after="0"/>
-              <w:rPr>
-                <w:rFonts w:ascii="Aptos" w:eastAsia="Times New Roman" w:hAnsi="Aptos" w:cs="Times New Roman"/>
-                <w:b/>
-                <w:bCs/>
-                <w:color w:val="000000"/>
-                <w:sz w:val="22"/>
-                <w:szCs w:val="22"/>
-              </w:rPr>
-            </w:pPr>
-            <w:r>
-              <w:rPr>
-                <w:rFonts w:ascii="Aptos" w:eastAsia="Times New Roman" w:hAnsi="Aptos" w:cs="Times New Roman"/>
-                <w:b/>
-                <w:bCs/>
-                <w:color w:val="000000"/>
-                <w:sz w:val="22"/>
-                <w:szCs w:val="22"/>
-              </w:rPr>
-              <w:t>Analysis</w:t>
-            </w:r>
-            <w:r>
-              <w:rPr>
-                <w:rFonts w:ascii="Aptos" w:eastAsia="Times New Roman" w:hAnsi="Aptos" w:cs="Times New Roman"/>
-                <w:b/>
-                <w:bCs/>
-                <w:color w:val="000000"/>
-                <w:sz w:val="22"/>
-                <w:szCs w:val="22"/>
-              </w:rPr>
-              <w:t xml:space="preserve"> </w:t>
-            </w:r>
-            <w:r>
-              <w:rPr>
-                <w:rFonts w:ascii="Aptos" w:eastAsia="Times New Roman" w:hAnsi="Aptos" w:cs="Times New Roman"/>
-                <w:b/>
-                <w:bCs/>
-                <w:color w:val="000000"/>
-                <w:sz w:val="22"/>
-                <w:szCs w:val="22"/>
-              </w:rPr>
-              <w:t>Interpretation</w:t>
-            </w:r>
-          </w:p>
-        </w:tc>
-      </w:tr>
-      <w:tr>
-        <w:trPr>
-          <w:trHeight w:val="450"/>
-        </w:trPr>
-        <w:tc>
-          <w:tcPr>
-            <w:tcW w:w="1600" w:type="dxa"/>
-            <w:tcBorders>
-              <w:top w:val="nil"/>
-              <w:left w:val="nil"/>
-              <w:bottom w:val="nil"/>
-              <w:right w:val="nil"/>
-            </w:tcBorders>
-            <w:shd w:val="clear" w:color="auto" w:fill="auto"/>
-            <w:vAlign w:val="center"/>
-            <w:hideMark/>
-          </w:tcPr>
-          <w:p>
-            <w:pPr>
-              <w:spacing w:after="0"/>
-              <w:rPr>
-                <w:rFonts w:eastAsia="Times New Roman" w:cs="Arial"/>
-                <w:color w:val="000000"/>
-                <w:sz w:val="22"/>
-                <w:szCs w:val="22"/>
-              </w:rPr>
-            </w:pPr>
-            <w:r>
-              <w:rPr>
-                <w:rFonts w:eastAsia="Times New Roman" w:cs="Arial"/>
-                <w:color w:val="000000"/>
-                <w:sz w:val="22"/>
-                <w:szCs w:val="22"/>
-              </w:rPr>
-              <w:t>DFO</w:t>
-            </w:r>
-          </w:p>
-        </w:tc>
-        <w:tc>
-          <w:tcPr>
-            <w:tcW w:w="5500" w:type="dxa"/>
-            <w:tcBorders>
-              <w:top w:val="nil"/>
-              <w:left w:val="nil"/>
-              <w:bottom w:val="nil"/>
-              <w:right w:val="nil"/>
-            </w:tcBorders>
-            <w:shd w:val="clear" w:color="auto" w:fill="auto"/>
-            <w:vAlign w:val="center"/>
-            <w:hideMark/>
-          </w:tcPr>
-          <w:p>
-            <w:pPr>
-              <w:spacing w:after="0"/>
-              <w:rPr>
-                <w:rFonts w:eastAsia="Times New Roman" w:cs="Arial"/>
-                <w:color w:val="000000"/>
-                <w:sz w:val="22"/>
-                <w:szCs w:val="22"/>
-              </w:rPr>
-            </w:pPr>
-            <w:r>
-              <w:rPr>
-                <w:rFonts w:eastAsia="Times New Roman" w:cs="Arial"/>
-                <w:color w:val="000000"/>
-                <w:sz w:val="22"/>
-                <w:szCs w:val="22"/>
-              </w:rPr>
-              <w:t>Data field omission</w:t>
-            </w:r>
-          </w:p>
-        </w:tc>
-        <w:tc>
-          <w:tcPr>
-            <w:tcW w:w="2740" w:type="dxa"/>
-            <w:tcBorders>
-              <w:top w:val="nil"/>
-              <w:left w:val="nil"/>
-              <w:bottom w:val="nil"/>
-              <w:right w:val="nil"/>
-            </w:tcBorders>
-            <w:shd w:val="clear" w:color="auto" w:fill="auto"/>
-            <w:vAlign w:val="center"/>
-            <w:hideMark/>
-          </w:tcPr>
-          <w:p>
-            <w:pPr>
-              <w:spacing w:after="0"/>
-              <w:rPr>
-                <w:rFonts w:eastAsia="Times New Roman" w:cs="Arial"/>
-                <w:color w:val="000000"/>
-                <w:sz w:val="22"/>
-                <w:szCs w:val="22"/>
-              </w:rPr>
-            </w:pPr>
-            <w:r>
-              <w:rPr>
-                <w:rFonts w:eastAsia="Times New Roman" w:cs="Arial"/>
-                <w:color w:val="000000"/>
-                <w:sz w:val="22"/>
-                <w:szCs w:val="22"/>
-              </w:rPr>
-              <w:t>Use with caution in analysis</w:t>
-            </w:r>
-          </w:p>
-        </w:tc>
-      </w:tr>
-      <w:tr>
-        <w:trPr>
-          <w:trHeight w:val="780"/>
-        </w:trPr>
-        <w:tc>
-          <w:tcPr>
-            <w:tcW w:w="1600" w:type="dxa"/>
-            <w:tcBorders>
-              <w:top w:val="nil"/>
-              <w:left w:val="nil"/>
-              <w:bottom w:val="nil"/>
-              <w:right w:val="nil"/>
-            </w:tcBorders>
-            <w:shd w:val="clear" w:color="auto" w:fill="auto"/>
-            <w:vAlign w:val="center"/>
-            <w:hideMark/>
-          </w:tcPr>
-          <w:p>
-            <w:pPr>
-              <w:spacing w:after="0"/>
-              <w:rPr>
-                <w:rFonts w:eastAsia="Times New Roman" w:cs="Arial"/>
-                <w:color w:val="000000"/>
-                <w:sz w:val="22"/>
-                <w:szCs w:val="22"/>
-              </w:rPr>
-            </w:pPr>
-            <w:r>
-              <w:rPr>
-                <w:rFonts w:eastAsia="Times New Roman" w:cs="Arial"/>
-                <w:color w:val="000000"/>
-                <w:sz w:val="22"/>
-                <w:szCs w:val="22"/>
-              </w:rPr>
-              <w:t>ESBNA</w:t>
-            </w:r>
-          </w:p>
-        </w:tc>
-        <w:tc>
-          <w:tcPr>
-            <w:tcW w:w="5500" w:type="dxa"/>
-            <w:tcBorders>
-              <w:top w:val="nil"/>
-              <w:left w:val="nil"/>
-              <w:bottom w:val="nil"/>
-              <w:right w:val="nil"/>
-            </w:tcBorders>
-            <w:shd w:val="clear" w:color="auto" w:fill="auto"/>
-            <w:vAlign w:val="center"/>
-            <w:hideMark/>
-          </w:tcPr>
-          <w:p>
-            <w:pPr>
-              <w:spacing w:after="0"/>
-              <w:rPr>
-                <w:rFonts w:eastAsia="Times New Roman" w:cs="Arial"/>
-                <w:color w:val="000000"/>
-                <w:sz w:val="22"/>
-                <w:szCs w:val="22"/>
-              </w:rPr>
-            </w:pPr>
-            <w:r>
-              <w:rPr>
-                <w:rFonts w:eastAsia="Times New Roman" w:cs="Arial"/>
-                <w:color w:val="000000"/>
-                <w:sz w:val="22"/>
-                <w:szCs w:val="22"/>
-              </w:rPr>
-              <w:t xml:space="preserve">Event Summary Banded Number Not in Agreement with number of records for event in </w:t>
-            </w:r>
-            <w:proofErr w:type="spellStart"/>
-            <w:r>
-              <w:rPr>
-                <w:rFonts w:eastAsia="Times New Roman" w:cs="Arial"/>
-                <w:color w:val="000000"/>
-                <w:sz w:val="22"/>
-                <w:szCs w:val="22"/>
-              </w:rPr>
-              <w:t>tbl_SNPL_Banded</w:t>
-            </w:r>
-            <w:proofErr w:type="spellEnd"/>
-          </w:p>
-        </w:tc>
-        <w:tc>
-          <w:tcPr>
-            <w:tcW w:w="2740" w:type="dxa"/>
-            <w:tcBorders>
-              <w:top w:val="nil"/>
-              <w:left w:val="nil"/>
-              <w:bottom w:val="nil"/>
-              <w:right w:val="nil"/>
-            </w:tcBorders>
-            <w:shd w:val="clear" w:color="auto" w:fill="auto"/>
-            <w:vAlign w:val="center"/>
-            <w:hideMark/>
-          </w:tcPr>
-          <w:p>
-            <w:pPr>
-              <w:spacing w:after="0"/>
-              <w:rPr>
-                <w:rFonts w:eastAsia="Times New Roman" w:cs="Arial"/>
-                <w:color w:val="000000"/>
-                <w:sz w:val="22"/>
-                <w:szCs w:val="22"/>
-              </w:rPr>
-            </w:pPr>
-            <w:r>
-              <w:rPr>
-                <w:rFonts w:eastAsia="Times New Roman" w:cs="Arial"/>
-                <w:color w:val="000000"/>
-                <w:sz w:val="22"/>
-                <w:szCs w:val="22"/>
-              </w:rPr>
-              <w:t>Use with caution in analysis</w:t>
-            </w:r>
-          </w:p>
-        </w:tc>
-      </w:tr>
-      <w:tr>
-        <w:trPr>
-          <w:trHeight w:val="570"/>
-        </w:trPr>
-        <w:tc>
-          <w:tcPr>
-            <w:tcW w:w="1600" w:type="dxa"/>
-            <w:tcBorders>
-              <w:top w:val="nil"/>
-              <w:left w:val="nil"/>
-              <w:bottom w:val="nil"/>
-              <w:right w:val="nil"/>
-            </w:tcBorders>
-            <w:shd w:val="clear" w:color="auto" w:fill="auto"/>
-            <w:vAlign w:val="center"/>
-            <w:hideMark/>
-          </w:tcPr>
-          <w:p>
-            <w:pPr>
-              <w:spacing w:after="0"/>
-              <w:rPr>
-                <w:rFonts w:eastAsia="Times New Roman" w:cs="Arial"/>
-                <w:color w:val="000000"/>
-                <w:sz w:val="22"/>
-                <w:szCs w:val="22"/>
-              </w:rPr>
-            </w:pPr>
-            <w:r>
-              <w:rPr>
-                <w:rFonts w:eastAsia="Times New Roman" w:cs="Arial"/>
-                <w:color w:val="000000"/>
-                <w:sz w:val="22"/>
-                <w:szCs w:val="22"/>
-              </w:rPr>
-              <w:lastRenderedPageBreak/>
-              <w:t>LCAC</w:t>
-            </w:r>
-          </w:p>
-        </w:tc>
-        <w:tc>
-          <w:tcPr>
-            <w:tcW w:w="5500" w:type="dxa"/>
-            <w:tcBorders>
-              <w:top w:val="nil"/>
-              <w:left w:val="nil"/>
-              <w:bottom w:val="nil"/>
-              <w:right w:val="nil"/>
-            </w:tcBorders>
-            <w:shd w:val="clear" w:color="auto" w:fill="auto"/>
-            <w:vAlign w:val="center"/>
-            <w:hideMark/>
-          </w:tcPr>
-          <w:p>
-            <w:pPr>
-              <w:spacing w:after="0"/>
-              <w:rPr>
-                <w:rFonts w:eastAsia="Times New Roman" w:cs="Arial"/>
-                <w:color w:val="000000"/>
-                <w:sz w:val="22"/>
-                <w:szCs w:val="22"/>
-              </w:rPr>
-            </w:pPr>
-            <w:r>
-              <w:rPr>
-                <w:rFonts w:eastAsia="Times New Roman" w:cs="Arial"/>
-                <w:color w:val="000000"/>
-                <w:sz w:val="22"/>
-                <w:szCs w:val="22"/>
-              </w:rPr>
-              <w:t>Location code abbreviation changed</w:t>
-            </w:r>
-          </w:p>
-        </w:tc>
-        <w:tc>
-          <w:tcPr>
-            <w:tcW w:w="2740" w:type="dxa"/>
-            <w:tcBorders>
-              <w:top w:val="nil"/>
-              <w:left w:val="nil"/>
-              <w:bottom w:val="nil"/>
-              <w:right w:val="nil"/>
-            </w:tcBorders>
-            <w:shd w:val="clear" w:color="auto" w:fill="auto"/>
-            <w:vAlign w:val="center"/>
-            <w:hideMark/>
-          </w:tcPr>
-          <w:p>
-            <w:pPr>
-              <w:spacing w:after="0"/>
-              <w:rPr>
-                <w:rFonts w:eastAsia="Times New Roman" w:cs="Arial"/>
-                <w:color w:val="000000"/>
-                <w:sz w:val="22"/>
-                <w:szCs w:val="22"/>
-              </w:rPr>
-            </w:pPr>
-            <w:r>
-              <w:rPr>
-                <w:rFonts w:eastAsia="Times New Roman" w:cs="Arial"/>
-                <w:color w:val="000000"/>
-                <w:sz w:val="22"/>
-                <w:szCs w:val="22"/>
-              </w:rPr>
-              <w:t>No issues with use in analysis</w:t>
-            </w:r>
-          </w:p>
-        </w:tc>
-      </w:tr>
-      <w:tr>
-        <w:trPr>
-          <w:trHeight w:val="660"/>
-        </w:trPr>
-        <w:tc>
-          <w:tcPr>
-            <w:tcW w:w="1600" w:type="dxa"/>
-            <w:tcBorders>
-              <w:top w:val="nil"/>
-              <w:left w:val="nil"/>
-              <w:bottom w:val="nil"/>
-              <w:right w:val="nil"/>
-            </w:tcBorders>
-            <w:shd w:val="clear" w:color="auto" w:fill="auto"/>
-            <w:vAlign w:val="center"/>
-            <w:hideMark/>
-          </w:tcPr>
-          <w:p>
-            <w:pPr>
-              <w:spacing w:after="0"/>
-              <w:rPr>
-                <w:rFonts w:eastAsia="Times New Roman" w:cs="Arial"/>
-                <w:color w:val="000000"/>
-                <w:sz w:val="22"/>
-                <w:szCs w:val="22"/>
-              </w:rPr>
-            </w:pPr>
-            <w:r>
-              <w:rPr>
-                <w:rFonts w:eastAsia="Times New Roman" w:cs="Arial"/>
-                <w:color w:val="000000"/>
-                <w:sz w:val="22"/>
-                <w:szCs w:val="22"/>
-              </w:rPr>
-              <w:t>LCSBC</w:t>
-            </w:r>
-          </w:p>
-        </w:tc>
-        <w:tc>
-          <w:tcPr>
-            <w:tcW w:w="5500" w:type="dxa"/>
-            <w:tcBorders>
-              <w:top w:val="nil"/>
-              <w:left w:val="nil"/>
-              <w:bottom w:val="nil"/>
-              <w:right w:val="nil"/>
-            </w:tcBorders>
-            <w:shd w:val="clear" w:color="auto" w:fill="auto"/>
-            <w:vAlign w:val="center"/>
-            <w:hideMark/>
-          </w:tcPr>
-          <w:p>
-            <w:pPr>
-              <w:spacing w:after="0"/>
-              <w:rPr>
-                <w:rFonts w:eastAsia="Times New Roman" w:cs="Arial"/>
-                <w:color w:val="000000"/>
-                <w:sz w:val="22"/>
-                <w:szCs w:val="22"/>
-              </w:rPr>
-            </w:pPr>
-            <w:r>
-              <w:rPr>
-                <w:rFonts w:eastAsia="Times New Roman" w:cs="Arial"/>
-                <w:color w:val="000000"/>
-                <w:sz w:val="22"/>
-                <w:szCs w:val="22"/>
-              </w:rPr>
-              <w:t>Location coordinates set to beach centroid due to incorrect original data value</w:t>
-            </w:r>
-          </w:p>
-        </w:tc>
-        <w:tc>
-          <w:tcPr>
-            <w:tcW w:w="2740" w:type="dxa"/>
-            <w:tcBorders>
-              <w:top w:val="nil"/>
-              <w:left w:val="nil"/>
-              <w:bottom w:val="nil"/>
-              <w:right w:val="nil"/>
-            </w:tcBorders>
-            <w:shd w:val="clear" w:color="auto" w:fill="auto"/>
-            <w:vAlign w:val="center"/>
-            <w:hideMark/>
-          </w:tcPr>
-          <w:p>
-            <w:pPr>
-              <w:spacing w:after="0"/>
-              <w:rPr>
-                <w:rFonts w:eastAsia="Times New Roman" w:cs="Arial"/>
-                <w:color w:val="000000"/>
-                <w:sz w:val="22"/>
-                <w:szCs w:val="22"/>
-              </w:rPr>
-            </w:pPr>
-            <w:r>
-              <w:rPr>
-                <w:rFonts w:eastAsia="Times New Roman" w:cs="Arial"/>
-                <w:color w:val="000000"/>
-                <w:sz w:val="22"/>
-                <w:szCs w:val="22"/>
-              </w:rPr>
-              <w:t>Use with caution in a spatial analysis</w:t>
-            </w:r>
-          </w:p>
-        </w:tc>
-      </w:tr>
-      <w:tr>
-        <w:trPr>
-          <w:trHeight w:val="720"/>
-        </w:trPr>
-        <w:tc>
-          <w:tcPr>
-            <w:tcW w:w="1600" w:type="dxa"/>
-            <w:tcBorders>
-              <w:top w:val="nil"/>
-              <w:left w:val="nil"/>
-              <w:bottom w:val="nil"/>
-              <w:right w:val="nil"/>
-            </w:tcBorders>
-            <w:shd w:val="clear" w:color="auto" w:fill="auto"/>
-            <w:vAlign w:val="center"/>
-            <w:hideMark/>
-          </w:tcPr>
-          <w:p>
-            <w:pPr>
-              <w:spacing w:after="0"/>
-              <w:rPr>
-                <w:rFonts w:eastAsia="Times New Roman" w:cs="Arial"/>
-                <w:color w:val="000000"/>
-                <w:sz w:val="22"/>
-                <w:szCs w:val="22"/>
-              </w:rPr>
-            </w:pPr>
-            <w:r>
-              <w:rPr>
-                <w:rFonts w:eastAsia="Times New Roman" w:cs="Arial"/>
-                <w:color w:val="000000"/>
-                <w:sz w:val="22"/>
-                <w:szCs w:val="22"/>
-              </w:rPr>
-              <w:t>LEOT</w:t>
-            </w:r>
-          </w:p>
-        </w:tc>
-        <w:tc>
-          <w:tcPr>
-            <w:tcW w:w="5500" w:type="dxa"/>
-            <w:tcBorders>
-              <w:top w:val="nil"/>
-              <w:left w:val="nil"/>
-              <w:bottom w:val="nil"/>
-              <w:right w:val="nil"/>
-            </w:tcBorders>
-            <w:shd w:val="clear" w:color="auto" w:fill="auto"/>
-            <w:vAlign w:val="center"/>
-            <w:hideMark/>
-          </w:tcPr>
-          <w:p>
-            <w:pPr>
-              <w:spacing w:after="0"/>
-              <w:rPr>
-                <w:rFonts w:eastAsia="Times New Roman" w:cs="Arial"/>
-                <w:color w:val="000000"/>
-                <w:sz w:val="22"/>
-                <w:szCs w:val="22"/>
-              </w:rPr>
-            </w:pPr>
-            <w:r>
-              <w:rPr>
-                <w:rFonts w:eastAsia="Times New Roman" w:cs="Arial"/>
-                <w:color w:val="000000"/>
-                <w:sz w:val="22"/>
-                <w:szCs w:val="22"/>
-              </w:rPr>
-              <w:t>Logical Error Observation Time outside survey start or end time period.</w:t>
-            </w:r>
-          </w:p>
-        </w:tc>
-        <w:tc>
-          <w:tcPr>
-            <w:tcW w:w="2740" w:type="dxa"/>
-            <w:tcBorders>
-              <w:top w:val="nil"/>
-              <w:left w:val="nil"/>
-              <w:bottom w:val="nil"/>
-              <w:right w:val="nil"/>
-            </w:tcBorders>
-            <w:shd w:val="clear" w:color="auto" w:fill="auto"/>
-            <w:vAlign w:val="center"/>
-            <w:hideMark/>
-          </w:tcPr>
-          <w:p>
-            <w:pPr>
-              <w:spacing w:after="0"/>
-              <w:rPr>
-                <w:rFonts w:eastAsia="Times New Roman" w:cs="Arial"/>
-                <w:color w:val="000000"/>
-                <w:sz w:val="22"/>
-                <w:szCs w:val="22"/>
-              </w:rPr>
-            </w:pPr>
-            <w:r>
-              <w:rPr>
-                <w:rFonts w:eastAsia="Times New Roman" w:cs="Arial"/>
-                <w:color w:val="000000"/>
-                <w:sz w:val="22"/>
-                <w:szCs w:val="22"/>
-              </w:rPr>
-              <w:t>Use with caution in analysis</w:t>
-            </w:r>
-          </w:p>
-        </w:tc>
-      </w:tr>
-      <w:tr>
-        <w:trPr>
-          <w:trHeight w:val="675"/>
-        </w:trPr>
-        <w:tc>
-          <w:tcPr>
-            <w:tcW w:w="1600" w:type="dxa"/>
-            <w:tcBorders>
-              <w:top w:val="nil"/>
-              <w:left w:val="nil"/>
-              <w:bottom w:val="nil"/>
-              <w:right w:val="nil"/>
-            </w:tcBorders>
-            <w:shd w:val="clear" w:color="auto" w:fill="auto"/>
-            <w:vAlign w:val="center"/>
-            <w:hideMark/>
-          </w:tcPr>
-          <w:p>
-            <w:pPr>
-              <w:spacing w:after="0"/>
-              <w:rPr>
-                <w:rFonts w:eastAsia="Times New Roman" w:cs="Arial"/>
-                <w:color w:val="000000"/>
-                <w:sz w:val="22"/>
-                <w:szCs w:val="22"/>
-              </w:rPr>
-            </w:pPr>
-            <w:r>
-              <w:rPr>
-                <w:rFonts w:eastAsia="Times New Roman" w:cs="Arial"/>
-                <w:color w:val="000000"/>
-                <w:sz w:val="22"/>
-                <w:szCs w:val="22"/>
-              </w:rPr>
-              <w:t>LEPST</w:t>
-            </w:r>
-          </w:p>
-        </w:tc>
-        <w:tc>
-          <w:tcPr>
-            <w:tcW w:w="5500" w:type="dxa"/>
-            <w:tcBorders>
-              <w:top w:val="nil"/>
-              <w:left w:val="nil"/>
-              <w:bottom w:val="nil"/>
-              <w:right w:val="nil"/>
-            </w:tcBorders>
-            <w:shd w:val="clear" w:color="auto" w:fill="auto"/>
-            <w:vAlign w:val="center"/>
-            <w:hideMark/>
-          </w:tcPr>
-          <w:p>
-            <w:pPr>
-              <w:spacing w:after="0"/>
-              <w:rPr>
-                <w:rFonts w:eastAsia="Times New Roman" w:cs="Arial"/>
-                <w:color w:val="000000"/>
-                <w:sz w:val="22"/>
-                <w:szCs w:val="22"/>
-              </w:rPr>
-            </w:pPr>
-            <w:r>
-              <w:rPr>
-                <w:rFonts w:eastAsia="Times New Roman" w:cs="Arial"/>
-                <w:color w:val="000000"/>
-                <w:sz w:val="22"/>
-                <w:szCs w:val="22"/>
-              </w:rPr>
-              <w:t>Logical Error Predator Stop Time is more than the total survey time</w:t>
-            </w:r>
-          </w:p>
-        </w:tc>
-        <w:tc>
-          <w:tcPr>
-            <w:tcW w:w="2740" w:type="dxa"/>
-            <w:tcBorders>
-              <w:top w:val="nil"/>
-              <w:left w:val="nil"/>
-              <w:bottom w:val="nil"/>
-              <w:right w:val="nil"/>
-            </w:tcBorders>
-            <w:shd w:val="clear" w:color="auto" w:fill="auto"/>
-            <w:vAlign w:val="center"/>
-            <w:hideMark/>
-          </w:tcPr>
-          <w:p>
-            <w:pPr>
-              <w:spacing w:after="0"/>
-              <w:rPr>
-                <w:rFonts w:eastAsia="Times New Roman" w:cs="Arial"/>
-                <w:color w:val="000000"/>
-                <w:sz w:val="22"/>
-                <w:szCs w:val="22"/>
-              </w:rPr>
-            </w:pPr>
-            <w:r>
-              <w:rPr>
-                <w:rFonts w:eastAsia="Times New Roman" w:cs="Arial"/>
-                <w:color w:val="000000"/>
-                <w:sz w:val="22"/>
-                <w:szCs w:val="22"/>
-              </w:rPr>
-              <w:t>Use with caution in analysis</w:t>
-            </w:r>
-          </w:p>
-        </w:tc>
-      </w:tr>
-      <w:tr>
-        <w:trPr>
-          <w:trHeight w:val="585"/>
-        </w:trPr>
-        <w:tc>
-          <w:tcPr>
-            <w:tcW w:w="1600" w:type="dxa"/>
-            <w:tcBorders>
-              <w:top w:val="nil"/>
-              <w:left w:val="nil"/>
-              <w:bottom w:val="nil"/>
-              <w:right w:val="nil"/>
-            </w:tcBorders>
-            <w:shd w:val="clear" w:color="auto" w:fill="auto"/>
-            <w:vAlign w:val="center"/>
-            <w:hideMark/>
-          </w:tcPr>
-          <w:p>
-            <w:pPr>
-              <w:spacing w:after="0"/>
-              <w:rPr>
-                <w:rFonts w:eastAsia="Times New Roman" w:cs="Arial"/>
-                <w:color w:val="000000"/>
-                <w:sz w:val="22"/>
-                <w:szCs w:val="22"/>
-              </w:rPr>
-            </w:pPr>
-            <w:r>
-              <w:rPr>
-                <w:rFonts w:eastAsia="Times New Roman" w:cs="Arial"/>
-                <w:color w:val="000000"/>
-                <w:sz w:val="22"/>
-                <w:szCs w:val="22"/>
-              </w:rPr>
-              <w:t>LESPB</w:t>
-            </w:r>
-          </w:p>
-        </w:tc>
-        <w:tc>
-          <w:tcPr>
-            <w:tcW w:w="5500" w:type="dxa"/>
-            <w:tcBorders>
-              <w:top w:val="nil"/>
-              <w:left w:val="nil"/>
-              <w:bottom w:val="nil"/>
-              <w:right w:val="nil"/>
-            </w:tcBorders>
-            <w:shd w:val="clear" w:color="auto" w:fill="auto"/>
-            <w:vAlign w:val="center"/>
-            <w:hideMark/>
-          </w:tcPr>
-          <w:p>
-            <w:pPr>
-              <w:spacing w:after="0"/>
-              <w:rPr>
-                <w:rFonts w:eastAsia="Times New Roman" w:cs="Arial"/>
-                <w:color w:val="000000"/>
-                <w:sz w:val="22"/>
-                <w:szCs w:val="22"/>
-              </w:rPr>
-            </w:pPr>
-            <w:r>
-              <w:rPr>
-                <w:rFonts w:eastAsia="Times New Roman" w:cs="Arial"/>
-                <w:color w:val="000000"/>
-                <w:sz w:val="22"/>
-                <w:szCs w:val="22"/>
-              </w:rPr>
-              <w:t>Logical Error Snowy Plover Banded more than Total Snowy Plover</w:t>
-            </w:r>
-          </w:p>
-        </w:tc>
-        <w:tc>
-          <w:tcPr>
-            <w:tcW w:w="2740" w:type="dxa"/>
-            <w:tcBorders>
-              <w:top w:val="nil"/>
-              <w:left w:val="nil"/>
-              <w:bottom w:val="nil"/>
-              <w:right w:val="nil"/>
-            </w:tcBorders>
-            <w:shd w:val="clear" w:color="auto" w:fill="auto"/>
-            <w:vAlign w:val="center"/>
-            <w:hideMark/>
-          </w:tcPr>
-          <w:p>
-            <w:pPr>
-              <w:spacing w:after="0"/>
-              <w:rPr>
-                <w:rFonts w:eastAsia="Times New Roman" w:cs="Arial"/>
-                <w:color w:val="000000"/>
-                <w:sz w:val="22"/>
-                <w:szCs w:val="22"/>
-              </w:rPr>
-            </w:pPr>
-            <w:r>
-              <w:rPr>
-                <w:rFonts w:eastAsia="Times New Roman" w:cs="Arial"/>
-                <w:color w:val="000000"/>
-                <w:sz w:val="22"/>
-                <w:szCs w:val="22"/>
-              </w:rPr>
-              <w:t>Use with caution in analysis</w:t>
-            </w:r>
-          </w:p>
-        </w:tc>
-      </w:tr>
-      <w:tr>
-        <w:trPr>
-          <w:trHeight w:val="675"/>
-        </w:trPr>
-        <w:tc>
-          <w:tcPr>
-            <w:tcW w:w="1600" w:type="dxa"/>
-            <w:tcBorders>
-              <w:top w:val="nil"/>
-              <w:left w:val="nil"/>
-              <w:bottom w:val="nil"/>
-              <w:right w:val="nil"/>
-            </w:tcBorders>
-            <w:shd w:val="clear" w:color="auto" w:fill="auto"/>
-            <w:vAlign w:val="center"/>
-            <w:hideMark/>
-          </w:tcPr>
-          <w:p>
-            <w:pPr>
-              <w:spacing w:after="0"/>
-              <w:rPr>
-                <w:rFonts w:eastAsia="Times New Roman" w:cs="Arial"/>
-                <w:color w:val="000000"/>
-                <w:sz w:val="22"/>
-                <w:szCs w:val="22"/>
-              </w:rPr>
-            </w:pPr>
-            <w:r>
-              <w:rPr>
-                <w:rFonts w:eastAsia="Times New Roman" w:cs="Arial"/>
-                <w:color w:val="000000"/>
-                <w:sz w:val="22"/>
-                <w:szCs w:val="22"/>
-              </w:rPr>
-              <w:t>LESPC</w:t>
-            </w:r>
-          </w:p>
-        </w:tc>
-        <w:tc>
-          <w:tcPr>
-            <w:tcW w:w="5500" w:type="dxa"/>
-            <w:tcBorders>
-              <w:top w:val="nil"/>
-              <w:left w:val="nil"/>
-              <w:bottom w:val="nil"/>
-              <w:right w:val="nil"/>
-            </w:tcBorders>
-            <w:shd w:val="clear" w:color="auto" w:fill="auto"/>
-            <w:vAlign w:val="center"/>
-            <w:hideMark/>
-          </w:tcPr>
-          <w:p>
-            <w:pPr>
-              <w:spacing w:after="0"/>
-              <w:rPr>
-                <w:rFonts w:eastAsia="Times New Roman" w:cs="Arial"/>
-                <w:color w:val="000000"/>
-                <w:sz w:val="22"/>
-                <w:szCs w:val="22"/>
-              </w:rPr>
-            </w:pPr>
-            <w:r>
-              <w:rPr>
-                <w:rFonts w:eastAsia="Times New Roman" w:cs="Arial"/>
-                <w:color w:val="000000"/>
-                <w:sz w:val="22"/>
-                <w:szCs w:val="22"/>
-              </w:rPr>
-              <w:t>Logical Error Snowy Plover Checked more than Total Snowy Plover</w:t>
-            </w:r>
-          </w:p>
-        </w:tc>
-        <w:tc>
-          <w:tcPr>
-            <w:tcW w:w="2740" w:type="dxa"/>
-            <w:tcBorders>
-              <w:top w:val="nil"/>
-              <w:left w:val="nil"/>
-              <w:bottom w:val="nil"/>
-              <w:right w:val="nil"/>
-            </w:tcBorders>
-            <w:shd w:val="clear" w:color="auto" w:fill="auto"/>
-            <w:vAlign w:val="center"/>
-            <w:hideMark/>
-          </w:tcPr>
-          <w:p>
-            <w:pPr>
-              <w:spacing w:after="0"/>
-              <w:rPr>
-                <w:rFonts w:eastAsia="Times New Roman" w:cs="Arial"/>
-                <w:color w:val="000000"/>
-                <w:sz w:val="22"/>
-                <w:szCs w:val="22"/>
-              </w:rPr>
-            </w:pPr>
-            <w:r>
-              <w:rPr>
-                <w:rFonts w:eastAsia="Times New Roman" w:cs="Arial"/>
-                <w:color w:val="000000"/>
-                <w:sz w:val="22"/>
-                <w:szCs w:val="22"/>
-              </w:rPr>
-              <w:t>Use with caution in analysis</w:t>
-            </w:r>
-          </w:p>
-        </w:tc>
-      </w:tr>
-      <w:tr>
-        <w:trPr>
-          <w:trHeight w:val="615"/>
-        </w:trPr>
-        <w:tc>
-          <w:tcPr>
-            <w:tcW w:w="1600" w:type="dxa"/>
-            <w:tcBorders>
-              <w:top w:val="nil"/>
-              <w:left w:val="nil"/>
-              <w:bottom w:val="nil"/>
-              <w:right w:val="nil"/>
-            </w:tcBorders>
-            <w:shd w:val="clear" w:color="auto" w:fill="auto"/>
-            <w:vAlign w:val="center"/>
-            <w:hideMark/>
-          </w:tcPr>
-          <w:p>
-            <w:pPr>
-              <w:spacing w:after="0"/>
-              <w:rPr>
-                <w:rFonts w:eastAsia="Times New Roman" w:cs="Arial"/>
-                <w:color w:val="000000"/>
-                <w:sz w:val="22"/>
-                <w:szCs w:val="22"/>
-              </w:rPr>
-            </w:pPr>
-            <w:r>
-              <w:rPr>
-                <w:rFonts w:eastAsia="Times New Roman" w:cs="Arial"/>
-                <w:color w:val="000000"/>
-                <w:sz w:val="22"/>
-                <w:szCs w:val="22"/>
-              </w:rPr>
-              <w:t>NCD</w:t>
-            </w:r>
-          </w:p>
-        </w:tc>
-        <w:tc>
-          <w:tcPr>
-            <w:tcW w:w="5500" w:type="dxa"/>
-            <w:tcBorders>
-              <w:top w:val="nil"/>
-              <w:left w:val="nil"/>
-              <w:bottom w:val="nil"/>
-              <w:right w:val="nil"/>
-            </w:tcBorders>
-            <w:shd w:val="clear" w:color="auto" w:fill="auto"/>
-            <w:vAlign w:val="center"/>
-            <w:hideMark/>
-          </w:tcPr>
-          <w:p>
-            <w:pPr>
-              <w:spacing w:after="0"/>
-              <w:rPr>
-                <w:rFonts w:eastAsia="Times New Roman" w:cs="Arial"/>
-                <w:color w:val="000000"/>
-                <w:sz w:val="22"/>
-                <w:szCs w:val="22"/>
-              </w:rPr>
-            </w:pPr>
-            <w:r>
-              <w:rPr>
-                <w:rFonts w:eastAsia="Times New Roman" w:cs="Arial"/>
-                <w:color w:val="000000"/>
-                <w:sz w:val="22"/>
-                <w:szCs w:val="22"/>
-              </w:rPr>
-              <w:t>No Crew Defined</w:t>
-            </w:r>
-          </w:p>
-        </w:tc>
-        <w:tc>
-          <w:tcPr>
-            <w:tcW w:w="2740" w:type="dxa"/>
-            <w:tcBorders>
-              <w:top w:val="nil"/>
-              <w:left w:val="nil"/>
-              <w:bottom w:val="nil"/>
-              <w:right w:val="nil"/>
-            </w:tcBorders>
-            <w:shd w:val="clear" w:color="auto" w:fill="auto"/>
-            <w:vAlign w:val="center"/>
-            <w:hideMark/>
-          </w:tcPr>
-          <w:p>
-            <w:pPr>
-              <w:spacing w:after="0"/>
-              <w:rPr>
-                <w:rFonts w:eastAsia="Times New Roman" w:cs="Arial"/>
-                <w:color w:val="000000"/>
-                <w:sz w:val="22"/>
-                <w:szCs w:val="22"/>
-              </w:rPr>
-            </w:pPr>
-            <w:r>
-              <w:rPr>
-                <w:rFonts w:eastAsia="Times New Roman" w:cs="Arial"/>
-                <w:color w:val="000000"/>
-                <w:sz w:val="22"/>
-                <w:szCs w:val="22"/>
-              </w:rPr>
-              <w:t>No issues with use in analysis</w:t>
-            </w:r>
-          </w:p>
-        </w:tc>
-      </w:tr>
-      <w:tr>
-        <w:trPr>
-          <w:trHeight w:val="1095"/>
-        </w:trPr>
-        <w:tc>
-          <w:tcPr>
-            <w:tcW w:w="1600" w:type="dxa"/>
-            <w:tcBorders>
-              <w:top w:val="nil"/>
-              <w:left w:val="nil"/>
-              <w:bottom w:val="nil"/>
-              <w:right w:val="nil"/>
-            </w:tcBorders>
-            <w:shd w:val="clear" w:color="auto" w:fill="auto"/>
-            <w:vAlign w:val="center"/>
-            <w:hideMark/>
-          </w:tcPr>
-          <w:p>
-            <w:pPr>
-              <w:spacing w:after="0"/>
-              <w:rPr>
-                <w:rFonts w:eastAsia="Times New Roman" w:cs="Arial"/>
-                <w:color w:val="000000"/>
-                <w:sz w:val="22"/>
-                <w:szCs w:val="22"/>
-              </w:rPr>
-            </w:pPr>
-            <w:r>
-              <w:rPr>
-                <w:rFonts w:eastAsia="Times New Roman" w:cs="Arial"/>
-                <w:color w:val="000000"/>
-                <w:sz w:val="22"/>
-                <w:szCs w:val="22"/>
-              </w:rPr>
-              <w:t>NSBPLE</w:t>
-            </w:r>
-          </w:p>
-        </w:tc>
-        <w:tc>
-          <w:tcPr>
-            <w:tcW w:w="5500" w:type="dxa"/>
-            <w:tcBorders>
-              <w:top w:val="nil"/>
-              <w:left w:val="nil"/>
-              <w:bottom w:val="nil"/>
-              <w:right w:val="nil"/>
-            </w:tcBorders>
-            <w:shd w:val="clear" w:color="auto" w:fill="auto"/>
-            <w:vAlign w:val="center"/>
-            <w:hideMark/>
-          </w:tcPr>
-          <w:p>
-            <w:pPr>
-              <w:spacing w:after="0"/>
-              <w:rPr>
-                <w:rFonts w:eastAsia="Times New Roman" w:cs="Arial"/>
-                <w:color w:val="000000"/>
-                <w:sz w:val="22"/>
-                <w:szCs w:val="22"/>
-              </w:rPr>
-            </w:pPr>
-            <w:r>
-              <w:rPr>
-                <w:rFonts w:eastAsia="Times New Roman" w:cs="Arial"/>
-                <w:color w:val="000000"/>
-                <w:sz w:val="22"/>
-                <w:szCs w:val="22"/>
-              </w:rPr>
-              <w:t>Number of Summarized Banded Snowy Plovers Logical Error.  Summarized number of Bands Snowy Plovers is not the same as the tally of Banded observation records for the survey.</w:t>
-            </w:r>
-          </w:p>
-        </w:tc>
-        <w:tc>
-          <w:tcPr>
-            <w:tcW w:w="2740" w:type="dxa"/>
-            <w:tcBorders>
-              <w:top w:val="nil"/>
-              <w:left w:val="nil"/>
-              <w:bottom w:val="nil"/>
-              <w:right w:val="nil"/>
-            </w:tcBorders>
-            <w:shd w:val="clear" w:color="auto" w:fill="auto"/>
-            <w:vAlign w:val="center"/>
-            <w:hideMark/>
-          </w:tcPr>
-          <w:p>
-            <w:pPr>
-              <w:spacing w:after="0"/>
-              <w:rPr>
-                <w:rFonts w:eastAsia="Times New Roman" w:cs="Arial"/>
-                <w:color w:val="000000"/>
-                <w:sz w:val="22"/>
-                <w:szCs w:val="22"/>
-              </w:rPr>
-            </w:pPr>
-            <w:r>
-              <w:rPr>
-                <w:rFonts w:eastAsia="Times New Roman" w:cs="Arial"/>
-                <w:color w:val="000000"/>
-                <w:sz w:val="22"/>
-                <w:szCs w:val="22"/>
-              </w:rPr>
-              <w:t>Use with caution in analysis</w:t>
-            </w:r>
-          </w:p>
-        </w:tc>
-      </w:tr>
-      <w:tr>
-        <w:trPr>
-          <w:trHeight w:val="1080"/>
-        </w:trPr>
-        <w:tc>
-          <w:tcPr>
-            <w:tcW w:w="1600" w:type="dxa"/>
-            <w:tcBorders>
-              <w:top w:val="nil"/>
-              <w:left w:val="nil"/>
-              <w:bottom w:val="nil"/>
-              <w:right w:val="nil"/>
-            </w:tcBorders>
-            <w:shd w:val="clear" w:color="auto" w:fill="auto"/>
-            <w:vAlign w:val="center"/>
-            <w:hideMark/>
-          </w:tcPr>
-          <w:p>
-            <w:pPr>
-              <w:spacing w:after="0"/>
-              <w:rPr>
-                <w:rFonts w:eastAsia="Times New Roman" w:cs="Arial"/>
-                <w:color w:val="000000"/>
-                <w:sz w:val="22"/>
-                <w:szCs w:val="22"/>
-              </w:rPr>
-            </w:pPr>
-            <w:r>
-              <w:rPr>
-                <w:rFonts w:eastAsia="Times New Roman" w:cs="Arial"/>
-                <w:color w:val="000000"/>
-                <w:sz w:val="22"/>
-                <w:szCs w:val="22"/>
-              </w:rPr>
-              <w:t>NSPLE</w:t>
-            </w:r>
-          </w:p>
-        </w:tc>
-        <w:tc>
-          <w:tcPr>
-            <w:tcW w:w="5500" w:type="dxa"/>
-            <w:tcBorders>
-              <w:top w:val="nil"/>
-              <w:left w:val="nil"/>
-              <w:bottom w:val="nil"/>
-              <w:right w:val="nil"/>
-            </w:tcBorders>
-            <w:shd w:val="clear" w:color="auto" w:fill="auto"/>
-            <w:vAlign w:val="center"/>
-            <w:hideMark/>
-          </w:tcPr>
-          <w:p>
-            <w:pPr>
-              <w:spacing w:after="0"/>
-              <w:rPr>
-                <w:rFonts w:eastAsia="Times New Roman" w:cs="Arial"/>
-                <w:color w:val="000000"/>
-                <w:sz w:val="22"/>
-                <w:szCs w:val="22"/>
-              </w:rPr>
-            </w:pPr>
-            <w:r>
-              <w:rPr>
-                <w:rFonts w:eastAsia="Times New Roman" w:cs="Arial"/>
-                <w:color w:val="000000"/>
-                <w:sz w:val="22"/>
-                <w:szCs w:val="22"/>
-              </w:rPr>
-              <w:t>Number of Summarized Snowy Plovers Logical Error.  Summarized number of adults, hatchlings, or fledglings SNPL does not match the observed sum of adult (</w:t>
-            </w:r>
-            <w:proofErr w:type="spellStart"/>
-            <w:r>
-              <w:rPr>
-                <w:rFonts w:eastAsia="Times New Roman" w:cs="Arial"/>
-                <w:color w:val="000000"/>
-                <w:sz w:val="22"/>
-                <w:szCs w:val="22"/>
-              </w:rPr>
-              <w:t>Male+Female+Unk</w:t>
-            </w:r>
-            <w:proofErr w:type="spellEnd"/>
-            <w:r>
-              <w:rPr>
-                <w:rFonts w:eastAsia="Times New Roman" w:cs="Arial"/>
-                <w:color w:val="000000"/>
-                <w:sz w:val="22"/>
-                <w:szCs w:val="22"/>
-              </w:rPr>
-              <w:t>), hatchlings, or fledglings</w:t>
-            </w:r>
-          </w:p>
-        </w:tc>
-        <w:tc>
-          <w:tcPr>
-            <w:tcW w:w="2740" w:type="dxa"/>
-            <w:tcBorders>
-              <w:top w:val="nil"/>
-              <w:left w:val="nil"/>
-              <w:bottom w:val="nil"/>
-              <w:right w:val="nil"/>
-            </w:tcBorders>
-            <w:shd w:val="clear" w:color="auto" w:fill="auto"/>
-            <w:vAlign w:val="center"/>
-            <w:hideMark/>
-          </w:tcPr>
-          <w:p>
-            <w:pPr>
-              <w:spacing w:after="0"/>
-              <w:rPr>
-                <w:rFonts w:eastAsia="Times New Roman" w:cs="Arial"/>
-                <w:color w:val="000000"/>
-                <w:sz w:val="22"/>
-                <w:szCs w:val="22"/>
-              </w:rPr>
-            </w:pPr>
-            <w:r>
-              <w:rPr>
-                <w:rFonts w:eastAsia="Times New Roman" w:cs="Arial"/>
-                <w:color w:val="000000"/>
-                <w:sz w:val="22"/>
-                <w:szCs w:val="22"/>
-              </w:rPr>
-              <w:t>Use with caution in analysis</w:t>
-            </w:r>
-          </w:p>
-        </w:tc>
-      </w:tr>
-      <w:tr>
-        <w:trPr>
-          <w:trHeight w:val="705"/>
-        </w:trPr>
-        <w:tc>
-          <w:tcPr>
-            <w:tcW w:w="1600" w:type="dxa"/>
-            <w:tcBorders>
-              <w:top w:val="nil"/>
-              <w:left w:val="nil"/>
-              <w:bottom w:val="nil"/>
-              <w:right w:val="nil"/>
-            </w:tcBorders>
-            <w:shd w:val="clear" w:color="auto" w:fill="auto"/>
-            <w:vAlign w:val="center"/>
-            <w:hideMark/>
-          </w:tcPr>
-          <w:p>
-            <w:pPr>
-              <w:spacing w:after="0"/>
-              <w:rPr>
-                <w:rFonts w:eastAsia="Times New Roman" w:cs="Arial"/>
-                <w:color w:val="000000"/>
-                <w:sz w:val="22"/>
-                <w:szCs w:val="22"/>
-              </w:rPr>
-            </w:pPr>
-            <w:r>
-              <w:rPr>
-                <w:rFonts w:eastAsia="Times New Roman" w:cs="Arial"/>
-                <w:color w:val="000000"/>
-                <w:sz w:val="22"/>
-                <w:szCs w:val="22"/>
-              </w:rPr>
-              <w:t>ODEC</w:t>
-            </w:r>
-          </w:p>
-        </w:tc>
-        <w:tc>
-          <w:tcPr>
-            <w:tcW w:w="5500" w:type="dxa"/>
-            <w:tcBorders>
-              <w:top w:val="nil"/>
-              <w:left w:val="nil"/>
-              <w:bottom w:val="nil"/>
-              <w:right w:val="nil"/>
-            </w:tcBorders>
-            <w:shd w:val="clear" w:color="auto" w:fill="auto"/>
-            <w:vAlign w:val="center"/>
-            <w:hideMark/>
-          </w:tcPr>
-          <w:p>
-            <w:pPr>
-              <w:spacing w:after="0"/>
-              <w:rPr>
-                <w:rFonts w:eastAsia="Times New Roman" w:cs="Arial"/>
-                <w:color w:val="000000"/>
-                <w:sz w:val="22"/>
-                <w:szCs w:val="22"/>
-              </w:rPr>
-            </w:pPr>
-            <w:r>
-              <w:rPr>
-                <w:rFonts w:eastAsia="Times New Roman" w:cs="Arial"/>
-                <w:color w:val="000000"/>
-                <w:sz w:val="22"/>
-                <w:szCs w:val="22"/>
-              </w:rPr>
-              <w:t>Original data entry value corrected during data review</w:t>
-            </w:r>
-          </w:p>
-        </w:tc>
-        <w:tc>
-          <w:tcPr>
-            <w:tcW w:w="2740" w:type="dxa"/>
-            <w:tcBorders>
-              <w:top w:val="nil"/>
-              <w:left w:val="nil"/>
-              <w:bottom w:val="nil"/>
-              <w:right w:val="nil"/>
-            </w:tcBorders>
-            <w:shd w:val="clear" w:color="auto" w:fill="auto"/>
-            <w:vAlign w:val="center"/>
-            <w:hideMark/>
-          </w:tcPr>
-          <w:p>
-            <w:pPr>
-              <w:spacing w:after="0"/>
-              <w:rPr>
-                <w:rFonts w:eastAsia="Times New Roman" w:cs="Arial"/>
-                <w:color w:val="000000"/>
-                <w:sz w:val="22"/>
-                <w:szCs w:val="22"/>
-              </w:rPr>
-            </w:pPr>
-            <w:r>
-              <w:rPr>
-                <w:rFonts w:eastAsia="Times New Roman" w:cs="Arial"/>
-                <w:color w:val="000000"/>
-                <w:sz w:val="22"/>
-                <w:szCs w:val="22"/>
-              </w:rPr>
-              <w:t>No issues with use in analysis</w:t>
-            </w:r>
-          </w:p>
-        </w:tc>
-      </w:tr>
-      <w:tr>
-        <w:trPr>
-          <w:trHeight w:val="660"/>
-        </w:trPr>
-        <w:tc>
-          <w:tcPr>
-            <w:tcW w:w="1600" w:type="dxa"/>
-            <w:tcBorders>
-              <w:top w:val="nil"/>
-              <w:left w:val="nil"/>
-              <w:bottom w:val="nil"/>
-              <w:right w:val="nil"/>
-            </w:tcBorders>
-            <w:shd w:val="clear" w:color="auto" w:fill="auto"/>
-            <w:vAlign w:val="center"/>
-            <w:hideMark/>
-          </w:tcPr>
-          <w:p>
-            <w:pPr>
-              <w:spacing w:after="0"/>
-              <w:rPr>
-                <w:rFonts w:eastAsia="Times New Roman" w:cs="Arial"/>
-                <w:color w:val="000000"/>
-                <w:sz w:val="22"/>
-                <w:szCs w:val="22"/>
-              </w:rPr>
-            </w:pPr>
-            <w:r>
-              <w:rPr>
-                <w:rFonts w:eastAsia="Times New Roman" w:cs="Arial"/>
-                <w:color w:val="000000"/>
-                <w:sz w:val="22"/>
-                <w:szCs w:val="22"/>
-              </w:rPr>
-              <w:t>ODEU</w:t>
-            </w:r>
-          </w:p>
-        </w:tc>
-        <w:tc>
-          <w:tcPr>
-            <w:tcW w:w="5500" w:type="dxa"/>
-            <w:tcBorders>
-              <w:top w:val="nil"/>
-              <w:left w:val="nil"/>
-              <w:bottom w:val="nil"/>
-              <w:right w:val="nil"/>
-            </w:tcBorders>
-            <w:shd w:val="clear" w:color="auto" w:fill="auto"/>
-            <w:vAlign w:val="center"/>
-            <w:hideMark/>
-          </w:tcPr>
-          <w:p>
-            <w:pPr>
-              <w:spacing w:after="0"/>
-              <w:rPr>
-                <w:rFonts w:eastAsia="Times New Roman" w:cs="Arial"/>
-                <w:color w:val="000000"/>
-                <w:sz w:val="22"/>
-                <w:szCs w:val="22"/>
-              </w:rPr>
-            </w:pPr>
-            <w:r>
-              <w:rPr>
-                <w:rFonts w:eastAsia="Times New Roman" w:cs="Arial"/>
-                <w:color w:val="000000"/>
-                <w:sz w:val="22"/>
-                <w:szCs w:val="22"/>
-              </w:rPr>
-              <w:t>Original data entry value updated</w:t>
-            </w:r>
-          </w:p>
-        </w:tc>
-        <w:tc>
-          <w:tcPr>
-            <w:tcW w:w="2740" w:type="dxa"/>
-            <w:tcBorders>
-              <w:top w:val="nil"/>
-              <w:left w:val="nil"/>
-              <w:bottom w:val="nil"/>
-              <w:right w:val="nil"/>
-            </w:tcBorders>
-            <w:shd w:val="clear" w:color="auto" w:fill="auto"/>
-            <w:vAlign w:val="center"/>
-            <w:hideMark/>
-          </w:tcPr>
-          <w:p>
-            <w:pPr>
-              <w:spacing w:after="0"/>
-              <w:rPr>
-                <w:rFonts w:eastAsia="Times New Roman" w:cs="Arial"/>
-                <w:color w:val="000000"/>
-                <w:sz w:val="22"/>
-                <w:szCs w:val="22"/>
-              </w:rPr>
-            </w:pPr>
-            <w:r>
-              <w:rPr>
-                <w:rFonts w:eastAsia="Times New Roman" w:cs="Arial"/>
-                <w:color w:val="000000"/>
-                <w:sz w:val="22"/>
-                <w:szCs w:val="22"/>
-              </w:rPr>
-              <w:t>No issues with use in analysis</w:t>
-            </w:r>
-          </w:p>
-        </w:tc>
-      </w:tr>
-      <w:tr>
-        <w:trPr>
-          <w:trHeight w:val="1080"/>
-        </w:trPr>
-        <w:tc>
-          <w:tcPr>
-            <w:tcW w:w="1600" w:type="dxa"/>
-            <w:tcBorders>
-              <w:top w:val="nil"/>
-              <w:left w:val="nil"/>
-              <w:bottom w:val="nil"/>
-              <w:right w:val="nil"/>
-            </w:tcBorders>
-            <w:shd w:val="clear" w:color="auto" w:fill="auto"/>
-            <w:vAlign w:val="center"/>
-            <w:hideMark/>
-          </w:tcPr>
-          <w:p>
-            <w:pPr>
-              <w:spacing w:after="0"/>
-              <w:rPr>
-                <w:rFonts w:eastAsia="Times New Roman" w:cs="Arial"/>
-                <w:color w:val="000000"/>
-                <w:sz w:val="22"/>
-                <w:szCs w:val="22"/>
-              </w:rPr>
-            </w:pPr>
-            <w:r>
-              <w:rPr>
-                <w:rFonts w:eastAsia="Times New Roman" w:cs="Arial"/>
-                <w:color w:val="000000"/>
-                <w:sz w:val="22"/>
-                <w:szCs w:val="22"/>
-              </w:rPr>
-              <w:t>ONBLE</w:t>
-            </w:r>
-          </w:p>
-        </w:tc>
-        <w:tc>
-          <w:tcPr>
-            <w:tcW w:w="5500" w:type="dxa"/>
-            <w:tcBorders>
-              <w:top w:val="nil"/>
-              <w:left w:val="nil"/>
-              <w:bottom w:val="nil"/>
-              <w:right w:val="nil"/>
-            </w:tcBorders>
-            <w:shd w:val="clear" w:color="auto" w:fill="auto"/>
-            <w:vAlign w:val="center"/>
-            <w:hideMark/>
-          </w:tcPr>
-          <w:p>
-            <w:pPr>
-              <w:spacing w:after="0"/>
-              <w:rPr>
-                <w:rFonts w:eastAsia="Times New Roman" w:cs="Arial"/>
-                <w:color w:val="000000"/>
-                <w:sz w:val="22"/>
-                <w:szCs w:val="22"/>
-              </w:rPr>
-            </w:pPr>
-            <w:r>
-              <w:rPr>
-                <w:rFonts w:eastAsia="Times New Roman" w:cs="Arial"/>
-                <w:color w:val="000000"/>
-                <w:sz w:val="22"/>
-                <w:szCs w:val="22"/>
-              </w:rPr>
-              <w:t xml:space="preserve">Observation Number Banded Logical Error. Observation has banded data and summary field </w:t>
-            </w:r>
-            <w:proofErr w:type="spellStart"/>
-            <w:r>
-              <w:rPr>
-                <w:rFonts w:eastAsia="Times New Roman" w:cs="Arial"/>
-                <w:color w:val="000000"/>
-                <w:sz w:val="22"/>
-                <w:szCs w:val="22"/>
-              </w:rPr>
-              <w:t>SNPL_Banded</w:t>
-            </w:r>
-            <w:proofErr w:type="spellEnd"/>
-            <w:r>
-              <w:rPr>
-                <w:rFonts w:eastAsia="Times New Roman" w:cs="Arial"/>
-                <w:color w:val="000000"/>
-                <w:sz w:val="22"/>
-                <w:szCs w:val="22"/>
-              </w:rPr>
-              <w:t xml:space="preserve"> in observations is 0 or null. </w:t>
-            </w:r>
-          </w:p>
-        </w:tc>
-        <w:tc>
-          <w:tcPr>
-            <w:tcW w:w="2740" w:type="dxa"/>
-            <w:tcBorders>
-              <w:top w:val="nil"/>
-              <w:left w:val="nil"/>
-              <w:bottom w:val="nil"/>
-              <w:right w:val="nil"/>
-            </w:tcBorders>
-            <w:shd w:val="clear" w:color="auto" w:fill="auto"/>
-            <w:vAlign w:val="center"/>
-            <w:hideMark/>
-          </w:tcPr>
-          <w:p>
-            <w:pPr>
-              <w:spacing w:after="0"/>
-              <w:rPr>
-                <w:rFonts w:eastAsia="Times New Roman" w:cs="Arial"/>
-                <w:color w:val="000000"/>
-                <w:sz w:val="22"/>
-                <w:szCs w:val="22"/>
-              </w:rPr>
-            </w:pPr>
-            <w:r>
-              <w:rPr>
-                <w:rFonts w:eastAsia="Times New Roman" w:cs="Arial"/>
-                <w:color w:val="000000"/>
-                <w:sz w:val="22"/>
-                <w:szCs w:val="22"/>
-              </w:rPr>
-              <w:t>Use with caution in analysis</w:t>
-            </w:r>
-          </w:p>
-        </w:tc>
-      </w:tr>
-      <w:tr>
-        <w:trPr>
-          <w:trHeight w:val="1080"/>
-        </w:trPr>
-        <w:tc>
-          <w:tcPr>
-            <w:tcW w:w="1600" w:type="dxa"/>
-            <w:tcBorders>
-              <w:top w:val="nil"/>
-              <w:left w:val="nil"/>
-              <w:bottom w:val="nil"/>
-              <w:right w:val="nil"/>
-            </w:tcBorders>
-            <w:shd w:val="clear" w:color="auto" w:fill="auto"/>
-            <w:vAlign w:val="center"/>
-            <w:hideMark/>
-          </w:tcPr>
-          <w:p>
-            <w:pPr>
-              <w:spacing w:after="0"/>
-              <w:rPr>
-                <w:rFonts w:eastAsia="Times New Roman" w:cs="Arial"/>
-                <w:color w:val="000000"/>
-                <w:sz w:val="22"/>
-                <w:szCs w:val="22"/>
-              </w:rPr>
-            </w:pPr>
-            <w:r>
-              <w:rPr>
-                <w:rFonts w:eastAsia="Times New Roman" w:cs="Arial"/>
-                <w:color w:val="000000"/>
-                <w:sz w:val="22"/>
-                <w:szCs w:val="22"/>
-              </w:rPr>
-              <w:t>ONBM</w:t>
-            </w:r>
-          </w:p>
-        </w:tc>
-        <w:tc>
-          <w:tcPr>
-            <w:tcW w:w="5500" w:type="dxa"/>
-            <w:tcBorders>
-              <w:top w:val="nil"/>
-              <w:left w:val="nil"/>
-              <w:bottom w:val="nil"/>
-              <w:right w:val="nil"/>
-            </w:tcBorders>
-            <w:shd w:val="clear" w:color="auto" w:fill="auto"/>
-            <w:vAlign w:val="center"/>
-            <w:hideMark/>
-          </w:tcPr>
-          <w:p>
-            <w:pPr>
-              <w:spacing w:after="0"/>
-              <w:rPr>
-                <w:rFonts w:eastAsia="Times New Roman" w:cs="Arial"/>
-                <w:color w:val="000000"/>
-                <w:sz w:val="22"/>
-                <w:szCs w:val="22"/>
-              </w:rPr>
-            </w:pPr>
-            <w:r>
-              <w:rPr>
-                <w:rFonts w:eastAsia="Times New Roman" w:cs="Arial"/>
-                <w:color w:val="000000"/>
-                <w:sz w:val="22"/>
-                <w:szCs w:val="22"/>
-              </w:rPr>
-              <w:t xml:space="preserve">Observation Number Banded in plover observation </w:t>
-            </w:r>
-            <w:proofErr w:type="spellStart"/>
-            <w:r>
-              <w:rPr>
-                <w:rFonts w:eastAsia="Times New Roman" w:cs="Arial"/>
-                <w:color w:val="000000"/>
-                <w:sz w:val="22"/>
-                <w:szCs w:val="22"/>
-              </w:rPr>
-              <w:t>SNPL_Bands</w:t>
-            </w:r>
-            <w:proofErr w:type="spellEnd"/>
-            <w:r>
-              <w:rPr>
-                <w:rFonts w:eastAsia="Times New Roman" w:cs="Arial"/>
-                <w:color w:val="000000"/>
-                <w:sz w:val="22"/>
-                <w:szCs w:val="22"/>
-              </w:rPr>
-              <w:t xml:space="preserve"> fields does not Match the number of records in </w:t>
-            </w:r>
-            <w:proofErr w:type="spellStart"/>
-            <w:r>
-              <w:rPr>
-                <w:rFonts w:eastAsia="Times New Roman" w:cs="Arial"/>
-                <w:color w:val="000000"/>
-                <w:sz w:val="22"/>
-                <w:szCs w:val="22"/>
-              </w:rPr>
-              <w:t>tbl_SNPLBanded</w:t>
-            </w:r>
-            <w:proofErr w:type="spellEnd"/>
-            <w:r>
-              <w:rPr>
-                <w:rFonts w:eastAsia="Times New Roman" w:cs="Arial"/>
-                <w:color w:val="000000"/>
-                <w:sz w:val="22"/>
-                <w:szCs w:val="22"/>
-              </w:rPr>
-              <w:t xml:space="preserve"> for the survey data and time.</w:t>
-            </w:r>
-          </w:p>
-        </w:tc>
-        <w:tc>
-          <w:tcPr>
-            <w:tcW w:w="2740" w:type="dxa"/>
-            <w:tcBorders>
-              <w:top w:val="nil"/>
-              <w:left w:val="nil"/>
-              <w:bottom w:val="nil"/>
-              <w:right w:val="nil"/>
-            </w:tcBorders>
-            <w:shd w:val="clear" w:color="auto" w:fill="auto"/>
-            <w:vAlign w:val="center"/>
-            <w:hideMark/>
-          </w:tcPr>
-          <w:p>
-            <w:pPr>
-              <w:spacing w:after="0"/>
-              <w:rPr>
-                <w:rFonts w:eastAsia="Times New Roman" w:cs="Arial"/>
-                <w:color w:val="000000"/>
-                <w:sz w:val="22"/>
-                <w:szCs w:val="22"/>
-              </w:rPr>
-            </w:pPr>
-            <w:r>
-              <w:rPr>
-                <w:rFonts w:eastAsia="Times New Roman" w:cs="Arial"/>
-                <w:color w:val="000000"/>
-                <w:sz w:val="22"/>
-                <w:szCs w:val="22"/>
-              </w:rPr>
-              <w:t>Use with caution in analysis</w:t>
-            </w:r>
-          </w:p>
-        </w:tc>
-      </w:tr>
-      <w:tr>
-        <w:trPr>
-          <w:trHeight w:val="615"/>
-        </w:trPr>
-        <w:tc>
-          <w:tcPr>
-            <w:tcW w:w="1600" w:type="dxa"/>
-            <w:tcBorders>
-              <w:top w:val="nil"/>
-              <w:left w:val="nil"/>
-              <w:bottom w:val="nil"/>
-              <w:right w:val="nil"/>
-            </w:tcBorders>
-            <w:shd w:val="clear" w:color="auto" w:fill="auto"/>
-            <w:vAlign w:val="center"/>
-            <w:hideMark/>
-          </w:tcPr>
-          <w:p>
-            <w:pPr>
-              <w:spacing w:after="0"/>
-              <w:rPr>
-                <w:rFonts w:eastAsia="Times New Roman" w:cs="Arial"/>
-                <w:color w:val="000000"/>
-                <w:sz w:val="22"/>
-                <w:szCs w:val="22"/>
-              </w:rPr>
-            </w:pPr>
-            <w:r>
-              <w:rPr>
-                <w:rFonts w:eastAsia="Times New Roman" w:cs="Arial"/>
-                <w:color w:val="000000"/>
-                <w:sz w:val="22"/>
-                <w:szCs w:val="22"/>
-              </w:rPr>
-              <w:t>OUC</w:t>
-            </w:r>
-          </w:p>
-        </w:tc>
-        <w:tc>
-          <w:tcPr>
-            <w:tcW w:w="5500" w:type="dxa"/>
-            <w:tcBorders>
-              <w:top w:val="nil"/>
-              <w:left w:val="nil"/>
-              <w:bottom w:val="nil"/>
-              <w:right w:val="nil"/>
-            </w:tcBorders>
-            <w:shd w:val="clear" w:color="auto" w:fill="auto"/>
-            <w:vAlign w:val="center"/>
-            <w:hideMark/>
-          </w:tcPr>
-          <w:p>
-            <w:pPr>
-              <w:spacing w:after="0"/>
-              <w:rPr>
-                <w:rFonts w:eastAsia="Times New Roman" w:cs="Arial"/>
-                <w:color w:val="000000"/>
-                <w:sz w:val="22"/>
-                <w:szCs w:val="22"/>
-              </w:rPr>
-            </w:pPr>
-            <w:r>
-              <w:rPr>
-                <w:rFonts w:eastAsia="Times New Roman" w:cs="Arial"/>
-                <w:color w:val="000000"/>
-                <w:sz w:val="22"/>
-                <w:szCs w:val="22"/>
-              </w:rPr>
-              <w:t>Observation value not certain</w:t>
-            </w:r>
-          </w:p>
-        </w:tc>
-        <w:tc>
-          <w:tcPr>
-            <w:tcW w:w="2740" w:type="dxa"/>
-            <w:tcBorders>
-              <w:top w:val="nil"/>
-              <w:left w:val="nil"/>
-              <w:bottom w:val="nil"/>
-              <w:right w:val="nil"/>
-            </w:tcBorders>
-            <w:shd w:val="clear" w:color="auto" w:fill="auto"/>
-            <w:vAlign w:val="center"/>
-            <w:hideMark/>
-          </w:tcPr>
-          <w:p>
-            <w:pPr>
-              <w:spacing w:after="0"/>
-              <w:rPr>
-                <w:rFonts w:eastAsia="Times New Roman" w:cs="Arial"/>
-                <w:color w:val="000000"/>
-                <w:sz w:val="22"/>
-                <w:szCs w:val="22"/>
-              </w:rPr>
-            </w:pPr>
-            <w:r>
-              <w:rPr>
-                <w:rFonts w:eastAsia="Times New Roman" w:cs="Arial"/>
-                <w:color w:val="000000"/>
-                <w:sz w:val="22"/>
-                <w:szCs w:val="22"/>
-              </w:rPr>
-              <w:t>Use with caution in analysis</w:t>
-            </w:r>
-          </w:p>
-        </w:tc>
-      </w:tr>
-      <w:tr>
-        <w:trPr>
-          <w:trHeight w:val="570"/>
-        </w:trPr>
-        <w:tc>
-          <w:tcPr>
-            <w:tcW w:w="1600" w:type="dxa"/>
-            <w:tcBorders>
-              <w:top w:val="nil"/>
-              <w:left w:val="nil"/>
-              <w:bottom w:val="nil"/>
-              <w:right w:val="nil"/>
-            </w:tcBorders>
-            <w:shd w:val="clear" w:color="auto" w:fill="auto"/>
-            <w:vAlign w:val="center"/>
-            <w:hideMark/>
-          </w:tcPr>
-          <w:p>
-            <w:pPr>
-              <w:spacing w:after="0"/>
-              <w:rPr>
-                <w:rFonts w:eastAsia="Times New Roman" w:cs="Arial"/>
-                <w:color w:val="000000"/>
-                <w:sz w:val="22"/>
-                <w:szCs w:val="22"/>
-              </w:rPr>
-            </w:pPr>
-            <w:r>
-              <w:rPr>
-                <w:rFonts w:eastAsia="Times New Roman" w:cs="Arial"/>
-                <w:color w:val="000000"/>
-                <w:sz w:val="22"/>
-                <w:szCs w:val="22"/>
-              </w:rPr>
-              <w:t>RICNC</w:t>
-            </w:r>
-          </w:p>
-        </w:tc>
-        <w:tc>
-          <w:tcPr>
-            <w:tcW w:w="5500" w:type="dxa"/>
-            <w:tcBorders>
-              <w:top w:val="nil"/>
-              <w:left w:val="nil"/>
-              <w:bottom w:val="nil"/>
-              <w:right w:val="nil"/>
-            </w:tcBorders>
-            <w:shd w:val="clear" w:color="auto" w:fill="auto"/>
-            <w:vAlign w:val="center"/>
-            <w:hideMark/>
-          </w:tcPr>
-          <w:p>
-            <w:pPr>
-              <w:spacing w:after="0"/>
-              <w:rPr>
-                <w:rFonts w:eastAsia="Times New Roman" w:cs="Arial"/>
-                <w:color w:val="000000"/>
-                <w:sz w:val="22"/>
-                <w:szCs w:val="22"/>
-              </w:rPr>
-            </w:pPr>
-            <w:r>
-              <w:rPr>
-                <w:rFonts w:eastAsia="Times New Roman" w:cs="Arial"/>
-                <w:color w:val="000000"/>
-                <w:sz w:val="22"/>
-                <w:szCs w:val="22"/>
-              </w:rPr>
-              <w:t>Record imported from chick nest check table '</w:t>
-            </w:r>
-            <w:proofErr w:type="spellStart"/>
-            <w:r>
-              <w:rPr>
-                <w:rFonts w:eastAsia="Times New Roman" w:cs="Arial"/>
-                <w:color w:val="000000"/>
-                <w:sz w:val="22"/>
-                <w:szCs w:val="22"/>
-              </w:rPr>
-              <w:t>tbl_Nest_Checks_Legacy</w:t>
-            </w:r>
-            <w:proofErr w:type="spellEnd"/>
-            <w:r>
-              <w:rPr>
-                <w:rFonts w:eastAsia="Times New Roman" w:cs="Arial"/>
-                <w:color w:val="000000"/>
-                <w:sz w:val="22"/>
-                <w:szCs w:val="22"/>
-              </w:rPr>
-              <w:t>'</w:t>
-            </w:r>
-          </w:p>
-        </w:tc>
-        <w:tc>
-          <w:tcPr>
-            <w:tcW w:w="2740" w:type="dxa"/>
-            <w:tcBorders>
-              <w:top w:val="nil"/>
-              <w:left w:val="nil"/>
-              <w:bottom w:val="nil"/>
-              <w:right w:val="nil"/>
-            </w:tcBorders>
-            <w:shd w:val="clear" w:color="auto" w:fill="auto"/>
-            <w:vAlign w:val="center"/>
-            <w:hideMark/>
-          </w:tcPr>
-          <w:p>
-            <w:pPr>
-              <w:spacing w:after="0"/>
-              <w:rPr>
-                <w:rFonts w:eastAsia="Times New Roman" w:cs="Arial"/>
-                <w:color w:val="000000"/>
-                <w:sz w:val="22"/>
-                <w:szCs w:val="22"/>
-              </w:rPr>
-            </w:pPr>
-            <w:r>
-              <w:rPr>
-                <w:rFonts w:eastAsia="Times New Roman" w:cs="Arial"/>
-                <w:color w:val="000000"/>
-                <w:sz w:val="22"/>
-                <w:szCs w:val="22"/>
-              </w:rPr>
-              <w:t>No issues with use in analysis</w:t>
-            </w:r>
-          </w:p>
-        </w:tc>
-      </w:tr>
-      <w:tr>
-        <w:trPr>
-          <w:trHeight w:val="630"/>
-        </w:trPr>
-        <w:tc>
-          <w:tcPr>
-            <w:tcW w:w="1600" w:type="dxa"/>
-            <w:tcBorders>
-              <w:top w:val="nil"/>
-              <w:left w:val="nil"/>
-              <w:bottom w:val="nil"/>
-              <w:right w:val="nil"/>
-            </w:tcBorders>
-            <w:shd w:val="clear" w:color="auto" w:fill="auto"/>
-            <w:vAlign w:val="center"/>
-            <w:hideMark/>
-          </w:tcPr>
-          <w:p>
-            <w:pPr>
-              <w:spacing w:after="0"/>
-              <w:rPr>
-                <w:rFonts w:eastAsia="Times New Roman" w:cs="Arial"/>
-                <w:color w:val="000000"/>
-                <w:sz w:val="22"/>
-                <w:szCs w:val="22"/>
-              </w:rPr>
-            </w:pPr>
-            <w:r>
-              <w:rPr>
-                <w:rFonts w:eastAsia="Times New Roman" w:cs="Arial"/>
-                <w:color w:val="000000"/>
-                <w:sz w:val="22"/>
-                <w:szCs w:val="22"/>
-              </w:rPr>
-              <w:t>SNBO</w:t>
-            </w:r>
-          </w:p>
-        </w:tc>
-        <w:tc>
-          <w:tcPr>
-            <w:tcW w:w="5500" w:type="dxa"/>
-            <w:tcBorders>
-              <w:top w:val="nil"/>
-              <w:left w:val="nil"/>
-              <w:bottom w:val="nil"/>
-              <w:right w:val="nil"/>
-            </w:tcBorders>
-            <w:shd w:val="clear" w:color="auto" w:fill="auto"/>
-            <w:vAlign w:val="center"/>
-            <w:hideMark/>
-          </w:tcPr>
-          <w:p>
-            <w:pPr>
-              <w:spacing w:after="0"/>
-              <w:rPr>
-                <w:rFonts w:eastAsia="Times New Roman" w:cs="Arial"/>
-                <w:color w:val="000000"/>
-                <w:sz w:val="22"/>
-                <w:szCs w:val="22"/>
-              </w:rPr>
-            </w:pPr>
-            <w:r>
-              <w:rPr>
-                <w:rFonts w:eastAsia="Times New Roman" w:cs="Arial"/>
-                <w:color w:val="000000"/>
-                <w:sz w:val="22"/>
-                <w:szCs w:val="22"/>
-              </w:rPr>
-              <w:t>Snowy Plover Band Record Omission. Expecting record in Snowy Plover Bands but none are present.</w:t>
-            </w:r>
-          </w:p>
-        </w:tc>
-        <w:tc>
-          <w:tcPr>
-            <w:tcW w:w="2740" w:type="dxa"/>
-            <w:tcBorders>
-              <w:top w:val="nil"/>
-              <w:left w:val="nil"/>
-              <w:bottom w:val="nil"/>
-              <w:right w:val="nil"/>
-            </w:tcBorders>
-            <w:shd w:val="clear" w:color="auto" w:fill="auto"/>
-            <w:vAlign w:val="center"/>
-            <w:hideMark/>
-          </w:tcPr>
-          <w:p>
-            <w:pPr>
-              <w:spacing w:after="0"/>
-              <w:rPr>
-                <w:rFonts w:eastAsia="Times New Roman" w:cs="Arial"/>
-                <w:color w:val="000000"/>
-                <w:sz w:val="22"/>
-                <w:szCs w:val="22"/>
-              </w:rPr>
-            </w:pPr>
-            <w:r>
-              <w:rPr>
-                <w:rFonts w:eastAsia="Times New Roman" w:cs="Arial"/>
-                <w:color w:val="000000"/>
-                <w:sz w:val="22"/>
-                <w:szCs w:val="22"/>
-              </w:rPr>
-              <w:t>Use with caution in analysis</w:t>
-            </w:r>
-          </w:p>
-        </w:tc>
-      </w:tr>
-    </w:tbl>
-    <w:p>
-      <w:pPr>
-        <w:pStyle w:val="TableCaption"/>
-        <w:rPr>
-          <w:b/>
-          <w:bCs/>
-        </w:rPr>
-      </w:pPr>
     </w:p>
     <w:p>
       <w:pPr>
@@ -3760,6 +1560,7 @@
                 <w:sz w:val="22"/>
                 <w:szCs w:val="22"/>
               </w:rPr>
+              <w:lastRenderedPageBreak/>
               <w:t>Events</w:t>
             </w:r>
           </w:p>
@@ -4216,6 +2017,7 @@
         </w:rPr>
         <w:t xml:space="preserve"> </w:t>
       </w:r>
+      <w:proofErr w:type="gramStart"/>
       <w:r>
         <w:rPr>
           <w:sz w:val="22"/>
@@ -4224,12 +2026,29 @@
         </w:rPr>
         <w:t>a</w:t>
       </w:r>
+      <w:proofErr w:type="gramEnd"/>
       <w:r>
         <w:rPr>
           <w:sz w:val="22"/>
           <w:szCs w:val="22"/>
         </w:rPr>
-        <w:t xml:space="preserve"> The </w:t>
+        <w:t xml:space="preserve"> </w:t>
+      </w:r>
+      <w:proofErr w:type="gramStart"/>
+      <w:r>
+        <w:rPr>
+          <w:sz w:val="22"/>
+          <w:szCs w:val="22"/>
+        </w:rPr>
+        <w:t>The</w:t>
+      </w:r>
+      <w:proofErr w:type="gramEnd"/>
+      <w:r>
+        <w:rPr>
+          <w:sz w:val="22"/>
+          <w:szCs w:val="22"/>
+        </w:rPr>
+        <w:t xml:space="preserve"> </w:t>
       </w:r>
       <w:r>
         <w:rPr>
@@ -4312,6 +2131,7 @@
         <w:pStyle w:val="SourceCode"/>
       </w:pPr>
       <w:proofErr w:type="spellStart"/>
+      <w:proofErr w:type="gramStart"/>
       <w:r>
         <w:rPr>
           <w:rStyle w:val="VerbatimChar"/>
@@ -4326,6 +2146,7 @@
         <w:t>::</w:t>
       </w:r>
       <w:proofErr w:type="spellStart"/>
+      <w:proofErr w:type="gramEnd"/>
       <w:r>
         <w:rPr>
           <w:rStyle w:val="VerbatimChar"/>
@@ -4371,6 +2192,7 @@
         <w:br/>
       </w:r>
       <w:proofErr w:type="spellStart"/>
+      <w:proofErr w:type="gramStart"/>
       <w:r>
         <w:rPr>
           <w:rStyle w:val="VerbatimChar"/>
@@ -4385,11 +2207,19 @@
         <w:t>::</w:t>
       </w:r>
       <w:proofErr w:type="spellStart"/>
-      <w:r>
-        <w:rPr>
-          <w:rStyle w:val="VerbatimChar"/>
-        </w:rPr>
-        <w:t>get_data_packages</w:t>
+      <w:proofErr w:type="gramEnd"/>
+      <w:r>
+        <w:rPr>
+          <w:rStyle w:val="VerbatimChar"/>
+        </w:rPr>
+        <w:t>get_data_</w:t>
+      </w:r>
+      <w:proofErr w:type="gramStart"/>
+      <w:r>
+        <w:rPr>
+          <w:rStyle w:val="VerbatimChar"/>
+        </w:rPr>
+        <w:t>packages</w:t>
       </w:r>
       <w:proofErr w:type="spellEnd"/>
       <w:r>
@@ -4398,6 +2228,7 @@
         </w:rPr>
         <w:t>(</w:t>
       </w:r>
+      <w:proofErr w:type="gramEnd"/>
       <w:r>
         <w:rPr>
           <w:rStyle w:val="VerbatimChar"/>
@@ -4428,6 +2259,7 @@
         <w:t xml:space="preserve"> &lt;- </w:t>
       </w:r>
       <w:proofErr w:type="spellStart"/>
+      <w:proofErr w:type="gramStart"/>
       <w:r>
         <w:rPr>
           <w:rStyle w:val="VerbatimChar"/>
@@ -4442,11 +2274,19 @@
         <w:t>::</w:t>
       </w:r>
       <w:proofErr w:type="spellStart"/>
-      <w:r>
-        <w:rPr>
-          <w:rStyle w:val="VerbatimChar"/>
-        </w:rPr>
-        <w:t>load_data_package</w:t>
+      <w:proofErr w:type="gramEnd"/>
+      <w:r>
+        <w:rPr>
+          <w:rStyle w:val="VerbatimChar"/>
+        </w:rPr>
+        <w:t>load_data_</w:t>
+      </w:r>
+      <w:proofErr w:type="gramStart"/>
+      <w:r>
+        <w:rPr>
+          <w:rStyle w:val="VerbatimChar"/>
+        </w:rPr>
+        <w:t>package</w:t>
       </w:r>
       <w:proofErr w:type="spellEnd"/>
       <w:r>
@@ -4455,6 +2295,7 @@
         </w:rPr>
         <w:t>(</w:t>
       </w:r>
+      <w:proofErr w:type="gramEnd"/>
       <w:r>
         <w:rPr>
           <w:rStyle w:val="VerbatimChar"/>
@@ -4474,9 +2315,17 @@
         <w:rPr>
           <w:rStyle w:val="VerbatimChar"/>
         </w:rPr>
-        <w:t>list2env(</w:t>
+        <w:t>list2</w:t>
+      </w:r>
+      <w:proofErr w:type="gramStart"/>
+      <w:r>
+        <w:rPr>
+          <w:rStyle w:val="VerbatimChar"/>
+        </w:rPr>
+        <w:t>env(</w:t>
       </w:r>
       <w:proofErr w:type="spellStart"/>
+      <w:proofErr w:type="gramEnd"/>
       <w:r>
         <w:rPr>
           <w:rStyle w:val="VerbatimChar"/>
@@ -4502,7 +2351,14 @@
         <w:rPr>
           <w:rStyle w:val="VerbatimChar"/>
         </w:rPr>
-        <w:t xml:space="preserve"> = .</w:t>
+        <w:t xml:space="preserve"> </w:t>
+      </w:r>
+      <w:proofErr w:type="gramStart"/>
+      <w:r>
+        <w:rPr>
+          <w:rStyle w:val="VerbatimChar"/>
+        </w:rPr>
+        <w:t>= .</w:t>
       </w:r>
       <w:proofErr w:type="spellStart"/>
       <w:r>
@@ -4512,6 +2368,7 @@
         <w:t>GlobalEnv</w:t>
       </w:r>
       <w:proofErr w:type="spellEnd"/>
+      <w:proofErr w:type="gramEnd"/>
       <w:r>
         <w:rPr>
           <w:rStyle w:val="VerbatimChar"/>
@@ -4551,8 +2408,19 @@
         <w:pStyle w:val="BodyText"/>
       </w:pPr>
       <w:r>
+        <w:t xml:space="preserve">During surveys, observers walk along the shoreline of the survey area and keep the entire width of the beach in sight. Every 50-100 m, observers stop walking to scan the beach ahead of their location with binoculars. If a plover(s) is observed, observers approach the bird(s) no closer than 10 m away to record the age, sex, and leg band colors (if leg bands are present) of the bird(s). Additionally, observers record the date, location, and time of the sighting. After recording, observers walk around the birds to avoid disturbing the </w:t>
+      </w:r>
+      <w:r>
         <w:lastRenderedPageBreak/>
-        <w:t>During surveys, observers walk along the shoreline of the survey area and keep the entire width of the beach in sight. Every 50-100 m, observers stop walking to scan the beach ahead of their location with binoculars. If a plover(s) is observed, observers approach the bird(s) no closer than 10 m away to record the age, sex, and leg band colors (if leg bands are present) of the bird(s). Additionally, observers record the date, location, and time of the sighting. After recording, observers walk around the birds to avoid disturbing the birds/flushing, and continue their 50-100 m walking intervals along the shoreline of the survey area.</w:t>
+        <w:t>birds/</w:t>
+      </w:r>
+      <w:proofErr w:type="gramStart"/>
+      <w:r>
+        <w:t>flushing, and</w:t>
+      </w:r>
+      <w:proofErr w:type="gramEnd"/>
+      <w:r>
+        <w:t xml:space="preserve"> continue their 50-100 m walking intervals along the shoreline of the survey area.</w:t>
       </w:r>
     </w:p>
     <w:p>
@@ -4568,7 +2436,15 @@
         <w:pStyle w:val="BodyText"/>
       </w:pPr>
       <w:r>
-        <w:t>If a nest is found to be inactive during a visit, the cause of loss is determined and recorded. In the event that the adult plovers abandoned the nest, or the eggs in the nest have failed to hatch after 35 days, a plover biologist collects the unhatched eggs for further analysis.</w:t>
+        <w:t xml:space="preserve">If a nest is found to be inactive during a visit, the cause of loss is determined and recorded. </w:t>
+      </w:r>
+      <w:proofErr w:type="gramStart"/>
+      <w:r>
+        <w:t>In the event that</w:t>
+      </w:r>
+      <w:proofErr w:type="gramEnd"/>
+      <w:r>
+        <w:t xml:space="preserve"> the adult plovers abandoned the nest, or the eggs in the nest have failed to hatch after 35 days, a plover biologist collects the unhatched eggs for further analysis.</w:t>
       </w:r>
     </w:p>
     <w:p>
@@ -4654,7 +2530,15 @@
         <w:t>SNPL_Time</w:t>
       </w:r>
       <w:r>
-        <w:t xml:space="preserve"> column that contains the UTC time and offset, recommended by the IMD Data Cleanup SOP (Quevedo and Sherman 2023), while retaining a local time for easier reading for SFAN when referring back to these datasets. Please note that column </w:t>
+        <w:t xml:space="preserve"> column that contains the UTC time and offset, recommended by the IMD Data Cleanup SOP (Quevedo and Sherman 2023), while retaining a local time for easier reading for SFAN when </w:t>
+      </w:r>
+      <w:proofErr w:type="gramStart"/>
+      <w:r>
+        <w:t>referring back</w:t>
+      </w:r>
+      <w:proofErr w:type="gramEnd"/>
+      <w:r>
+        <w:t xml:space="preserve"> to these datasets. Please note that column </w:t>
       </w:r>
       <w:r>
         <w:rPr>
@@ -4689,42 +2573,53 @@
         <w:t>Unit_Code</w:t>
       </w:r>
       <w:r>
-        <w:t xml:space="preserve"> was added to explicitly state which park </w:t>
-      </w:r>
+        <w:t xml:space="preserve"> was added to explicitly state which park unit the observation was recorded in, in accordance with the IMD Data Cleanup SOP (Quevedo and Sherman 2023) guidance for datasets to be self-documenting.</w:t>
+      </w:r>
+    </w:p>
+    <w:p>
+      <w:pPr>
+        <w:pStyle w:val="BodyText"/>
+      </w:pPr>
+      <w:r>
+        <w:t xml:space="preserve">In datasets “SFAN_SNPL_ChickBands.csv” and “SFAN_SNPL_Events.csv”, column </w:t>
+      </w:r>
+      <w:r>
+        <w:rPr>
+          <w:rStyle w:val="VerbatimChar"/>
+        </w:rPr>
+        <w:t>Scientific_Name</w:t>
+      </w:r>
+      <w:r>
+        <w:t xml:space="preserve"> was added to explicitly state which organism was surveyed, in accordance with the IMD Data Cleanup SOP (Quevedo and Sherman 2023) guidance for datasets to be self-documenting.</w:t>
+      </w:r>
+    </w:p>
+    <w:p>
+      <w:pPr>
+        <w:pStyle w:val="BodyText"/>
+      </w:pPr>
       <w:r>
         <w:lastRenderedPageBreak/>
-        <w:t>unit the observation was recorded in, in accordance with the IMD Data Cleanup SOP (Quevedo and Sherman 2023) guidance for datasets to be self-documenting.</w:t>
-      </w:r>
-    </w:p>
-    <w:p>
-      <w:pPr>
-        <w:pStyle w:val="BodyText"/>
-      </w:pPr>
-      <w:r>
-        <w:t xml:space="preserve">In datasets “SFAN_SNPL_ChickBands.csv” and “SFAN_SNPL_Events.csv”, column </w:t>
-      </w:r>
-      <w:r>
-        <w:rPr>
-          <w:rStyle w:val="VerbatimChar"/>
-        </w:rPr>
-        <w:t>Scientific_Name</w:t>
-      </w:r>
-      <w:r>
-        <w:t xml:space="preserve"> was added to explicitly state which organism was surveyed, in accordance with the IMD Data Cleanup SOP (Quevedo and Sherman 2023) guidance for datasets to be self-documenting.</w:t>
-      </w:r>
-    </w:p>
-    <w:p>
-      <w:pPr>
-        <w:pStyle w:val="BodyText"/>
-      </w:pPr>
-      <w:r>
         <w:t xml:space="preserve">In datasets “SFAN_SNPL_Nesting.csv,” “SFAN_SNPL_Observations.csv,” and “SFAN_SNPL_Predators.csv,” columns and values for UTM coordinates were converted to latitude and longitude coordinates through usage of QCkit’s </w:t>
       </w:r>
       <w:r>
         <w:rPr>
           <w:rStyle w:val="VerbatimChar"/>
         </w:rPr>
-        <w:t>generate_ll_from_utm()</w:t>
+        <w:t>generate_ll_from_</w:t>
+      </w:r>
+      <w:proofErr w:type="gramStart"/>
+      <w:r>
+        <w:rPr>
+          <w:rStyle w:val="VerbatimChar"/>
+        </w:rPr>
+        <w:t>utm(</w:t>
+      </w:r>
+      <w:proofErr w:type="gramEnd"/>
+      <w:r>
+        <w:rPr>
+          <w:rStyle w:val="VerbatimChar"/>
+        </w:rPr>
+        <w:t>)</w:t>
       </w:r>
       <w:r>
         <w:t xml:space="preserve"> function (Baker et al. 2024b), as recommended by the IMD Data Cleanup SOP (Quevedo and Sherman 2023).</w:t>
@@ -4957,7 +2852,6 @@
       <w:bookmarkStart w:id="24" w:name="ref-QCkit"/>
       <w:bookmarkEnd w:id="23"/>
       <w:r>
-        <w:lastRenderedPageBreak/>
         <w:t xml:space="preserve">Baker, R., I. Quevedo, and J. Patterson. 2024b, February. QCkit v0.1.4. National Park Service; </w:t>
       </w:r>
       <w:hyperlink r:id="rId15">
@@ -5000,6 +2894,7 @@
       <w:bookmarkStart w:id="26" w:name="ref-package"/>
       <w:bookmarkEnd w:id="25"/>
       <w:r>
+        <w:lastRenderedPageBreak/>
         <w:t xml:space="preserve">Brown, J. R., and A. Ron. 2024a. Snowy Plover Monitoring at Point Reyes National Seashore, 1997-2023. National Park Service; </w:t>
       </w:r>
       <w:hyperlink r:id="rId17">
@@ -5145,7 +3040,23 @@
         <w:pStyle w:val="BodyText"/>
       </w:pPr>
       <w:r>
-        <w:t xml:space="preserve">qa_f132_MoreCheckedSNPL_ThanTotal - Returns surveys that have more SNPL checked for bands than the total SNPL (SNPL_Adult, SNPL_Hatchling,SNPL_Fledgling). QC default value is </w:t>
+        <w:t>qa_f132_MoreCheckedSNPL_ThanTotal - Returns surveys that have more SNPL checked for bands than the total SNPL (SNPL_Adult, SNPL_</w:t>
+      </w:r>
+      <w:proofErr w:type="gramStart"/>
+      <w:r>
+        <w:t>Hatchling,SNPL</w:t>
+      </w:r>
+      <w:proofErr w:type="gramEnd"/>
+      <w:r>
+        <w:t xml:space="preserve">_Fledgling). </w:t>
+      </w:r>
+      <w:proofErr w:type="gramStart"/>
+      <w:r>
+        <w:t>QC</w:t>
+      </w:r>
+      <w:proofErr w:type="gramEnd"/>
+      <w:r>
+        <w:t xml:space="preserve"> default value is </w:t>
       </w:r>
       <w:r>
         <w:rPr>
@@ -5196,14 +3107,56 @@
         <w:pStyle w:val="BodyText"/>
       </w:pPr>
       <w:r>
+        <w:t xml:space="preserve">qa_h102_Missing_Observers - Returns records where there is a blank observer field in for the survey or no observer has been provided. Delete the blank record in the survey form. QC default value is </w:t>
+      </w:r>
+      <w:r>
+        <w:rPr>
+          <w:rStyle w:val="VerbatimChar"/>
+        </w:rPr>
+        <w:t>NCD</w:t>
+      </w:r>
+      <w:r>
+        <w:t>.</w:t>
+      </w:r>
+    </w:p>
+    <w:p>
+      <w:pPr>
+        <w:pStyle w:val="BodyText"/>
+      </w:pPr>
+      <w:r>
+        <w:t xml:space="preserve">qa_j102_SNPL_ObservationTime_Error - Returns SNPL observation records where the observation time is outside the start or end times of survey event. Time should be entered in </w:t>
+      </w:r>
+      <w:proofErr w:type="gramStart"/>
+      <w:r>
+        <w:t>24 hour</w:t>
+      </w:r>
+      <w:proofErr w:type="gramEnd"/>
+      <w:r>
+        <w:t xml:space="preserve"> military format. QC default value is </w:t>
+      </w:r>
+      <w:r>
+        <w:rPr>
+          <w:rStyle w:val="VerbatimChar"/>
+        </w:rPr>
+        <w:t>LEOT</w:t>
+      </w:r>
+      <w:r>
+        <w:t>.</w:t>
+      </w:r>
+    </w:p>
+    <w:p>
+      <w:pPr>
+        <w:pStyle w:val="BodyText"/>
+      </w:pPr>
+      <w:r>
         <w:lastRenderedPageBreak/>
-        <w:t xml:space="preserve">qa_h102_Missing_Observers - Returns records where there is a blank observer field in for the survey or no observer has been provided. Delete the blank record in the survey form. QC default value is </w:t>
-      </w:r>
-      <w:r>
-        <w:rPr>
-          <w:rStyle w:val="VerbatimChar"/>
-        </w:rPr>
-        <w:t>NCD</w:t>
+        <w:t xml:space="preserve">qa_j132_NestID_Year_Mismatch - Returns records from SNPL_Obsevations where the survey year of the nest ID used does not match that in tblNestMaster. QC default value is </w:t>
+      </w:r>
+      <w:r>
+        <w:rPr>
+          <w:rStyle w:val="VerbatimChar"/>
+        </w:rPr>
+        <w:t>OEYDNM</w:t>
       </w:r>
       <w:r>
         <w:t>.</w:t>
@@ -5214,13 +3167,13 @@
         <w:pStyle w:val="BodyText"/>
       </w:pPr>
       <w:r>
-        <w:t xml:space="preserve">qa_j102_SNPL_ObservationTime_Error - Returns SNPL observation records where the observation time is outside the start or end times of survey event. Time should be entered in 24 hour military format. QC default value is </w:t>
-      </w:r>
-      <w:r>
-        <w:rPr>
-          <w:rStyle w:val="VerbatimChar"/>
-        </w:rPr>
-        <w:t>LEOT</w:t>
+        <w:t xml:space="preserve">qa_j142_Missing_Band_Totals - Returns records where there is data in tblSNPLBanded table for a specific observation time and the SNPL_Bands field in tblSNPLObservations is 0 or blank. QC default value is </w:t>
+      </w:r>
+      <w:r>
+        <w:rPr>
+          <w:rStyle w:val="VerbatimChar"/>
+        </w:rPr>
+        <w:t>ONBLE</w:t>
       </w:r>
       <w:r>
         <w:t>.</w:t>
@@ -5231,13 +3184,13 @@
         <w:pStyle w:val="BodyText"/>
       </w:pPr>
       <w:r>
-        <w:t xml:space="preserve">qa_j132_NestID_Year_Mismatch - Returns records from SNPL_Obsevations where the survey year of the nest ID used does not match that in tblNestMaster. QC default value is </w:t>
-      </w:r>
-      <w:r>
-        <w:rPr>
-          <w:rStyle w:val="VerbatimChar"/>
-        </w:rPr>
-        <w:t>OEYDNM</w:t>
+        <w:t xml:space="preserve">qa_j152_Missing_Band_Data_X - Returns records where there are no records in tblSNPLBanded, but where the SNPL_Bands field in tblSNPLObservations is greater than 0. QC default value is </w:t>
+      </w:r>
+      <w:r>
+        <w:rPr>
+          <w:rStyle w:val="VerbatimChar"/>
+        </w:rPr>
+        <w:t>SNBO</w:t>
       </w:r>
       <w:r>
         <w:t>.</w:t>
@@ -5248,41 +3201,15 @@
         <w:pStyle w:val="BodyText"/>
       </w:pPr>
       <w:r>
-        <w:t xml:space="preserve">qa_j142_Missing_Band_Totals - Returns records where there is data in tblSNPLBanded table for a specific observation time and the SNPL_Bands field in tblSNPLObservations is 0 or blank. QC default value is </w:t>
-      </w:r>
-      <w:r>
-        <w:rPr>
-          <w:rStyle w:val="VerbatimChar"/>
-        </w:rPr>
-        <w:t>ONBLE</w:t>
-      </w:r>
-      <w:r>
-        <w:t>.</w:t>
-      </w:r>
-    </w:p>
-    <w:p>
-      <w:pPr>
-        <w:pStyle w:val="BodyText"/>
-      </w:pPr>
-      <w:r>
-        <w:t xml:space="preserve">qa_j152_Missing_Band_Data_X - Returns records where there are no records in tblSNPLBanded, but where the SNPL_Bands field in tblSNPLObservations is greater than 0. QC default value is </w:t>
-      </w:r>
-      <w:r>
-        <w:rPr>
-          <w:rStyle w:val="VerbatimChar"/>
-        </w:rPr>
-        <w:t>SNBO</w:t>
-      </w:r>
-      <w:r>
-        <w:t>.</w:t>
-      </w:r>
-    </w:p>
-    <w:p>
-      <w:pPr>
-        <w:pStyle w:val="BodyText"/>
-      </w:pPr>
-      <w:r>
-        <w:t xml:space="preserve">qa_j162_Mismatched_Band_Obs - Returns records where there where the SNPL_Bands field in tblSNPLObservations does not match the number of records in tbl_SNPLBanded for the survey data and time. QC default value is </w:t>
+        <w:t xml:space="preserve">qa_j162_Mismatched_Band_Obs - Returns </w:t>
+      </w:r>
+      <w:proofErr w:type="gramStart"/>
+      <w:r>
+        <w:t>records where there</w:t>
+      </w:r>
+      <w:proofErr w:type="gramEnd"/>
+      <w:r>
+        <w:t xml:space="preserve"> where the SNPL_Bands field in tblSNPLObservations does not match the number of records in tbl_SNPLBanded for the survey data and time. QC default value is </w:t>
       </w:r>
       <w:r>
         <w:rPr>
@@ -5341,7 +3268,7 @@
 </file>
 
 <file path=word/endnotes.xml><?xml version="1.0" encoding="utf-8"?>
-<w:endnotes xmlns:wpc="http://schemas.microsoft.com/office/word/2010/wordprocessingCanvas" xmlns:cx="http://schemas.microsoft.com/office/drawing/2014/chartex" xmlns:cx1="http://schemas.microsoft.com/office/drawing/2015/9/8/chartex" xmlns:cx2="http://schemas.microsoft.com/office/drawing/2015/10/21/chartex" xmlns:cx3="http://schemas.microsoft.com/office/drawing/2016/5/9/chartex" xmlns:cx4="http://schemas.microsoft.com/office/drawing/2016/5/10/chartex" xmlns:cx5="http://schemas.microsoft.com/office/drawing/2016/5/11/chartex" xmlns:cx6="http://schemas.microsoft.com/office/drawing/2016/5/12/chartex" xmlns:cx7="http://schemas.microsoft.com/office/drawing/2016/5/13/chartex" xmlns:cx8="http://schemas.microsoft.com/office/drawing/2016/5/14/chartex" xmlns:mc="http://schemas.openxmlformats.org/markup-compatibility/2006" xmlns:aink="http://schemas.microsoft.com/office/drawing/2016/ink" xmlns:am3d="http://schemas.microsoft.com/office/drawing/2017/model3d" xmlns:o="urn:schemas-microsoft-com:office:office" xmlns:oel="http://schemas.microsoft.com/office/2019/extlst" xmlns:r="http://schemas.openxmlformats.org/officeDocument/2006/relationships" xmlns:m="http://schemas.openxmlformats.org/officeDocument/2006/math" xmlns:v="urn:schemas-microsoft-com:vml" xmlns:wp14="http://schemas.microsoft.com/office/word/2010/wordprocessingDrawing" xmlns:wp="http://schemas.openxmlformats.org/drawingml/2006/wordprocessingDrawing" xmlns:w10="urn:schemas-microsoft-com:office:word" xmlns:w="http://schemas.openxmlformats.org/wordprocessingml/2006/main" xmlns:w14="http://schemas.microsoft.com/office/word/2010/wordml" xmlns:w15="http://schemas.microsoft.com/office/word/2012/wordml" xmlns:w16cex="http://schemas.microsoft.com/office/word/2018/wordml/cex" xmlns:w16cid="http://schemas.microsoft.com/office/word/2016/wordml/cid" xmlns:w16="http://schemas.microsoft.com/office/word/2018/wordml" xmlns:w16sdtdh="http://schemas.microsoft.com/office/word/2020/wordml/sdtdatahash" xmlns:w16se="http://schemas.microsoft.com/office/word/2015/wordml/symex" xmlns:wpg="http://schemas.microsoft.com/office/word/2010/wordprocessingGroup" xmlns:wpi="http://schemas.microsoft.com/office/word/2010/wordprocessingInk" xmlns:wne="http://schemas.microsoft.com/office/word/2006/wordml" xmlns:wps="http://schemas.microsoft.com/office/word/2010/wordprocessingShape" mc:Ignorable="w14 w15 w16se w16cid w16 w16cex w16sdtdh wp14">
+<w:endnotes xmlns:wpc="http://schemas.microsoft.com/office/word/2010/wordprocessingCanvas" xmlns:cx="http://schemas.microsoft.com/office/drawing/2014/chartex" xmlns:cx1="http://schemas.microsoft.com/office/drawing/2015/9/8/chartex" xmlns:cx2="http://schemas.microsoft.com/office/drawing/2015/10/21/chartex" xmlns:cx3="http://schemas.microsoft.com/office/drawing/2016/5/9/chartex" xmlns:cx4="http://schemas.microsoft.com/office/drawing/2016/5/10/chartex" xmlns:cx5="http://schemas.microsoft.com/office/drawing/2016/5/11/chartex" xmlns:cx6="http://schemas.microsoft.com/office/drawing/2016/5/12/chartex" xmlns:cx7="http://schemas.microsoft.com/office/drawing/2016/5/13/chartex" xmlns:cx8="http://schemas.microsoft.com/office/drawing/2016/5/14/chartex" xmlns:mc="http://schemas.openxmlformats.org/markup-compatibility/2006" xmlns:aink="http://schemas.microsoft.com/office/drawing/2016/ink" xmlns:am3d="http://schemas.microsoft.com/office/drawing/2017/model3d" xmlns:o="urn:schemas-microsoft-com:office:office" xmlns:oel="http://schemas.microsoft.com/office/2019/extlst" xmlns:r="http://schemas.openxmlformats.org/officeDocument/2006/relationships" xmlns:m="http://schemas.openxmlformats.org/officeDocument/2006/math" xmlns:v="urn:schemas-microsoft-com:vml" xmlns:wp14="http://schemas.microsoft.com/office/word/2010/wordprocessingDrawing" xmlns:wp="http://schemas.openxmlformats.org/drawingml/2006/wordprocessingDrawing" xmlns:w10="urn:schemas-microsoft-com:office:word" xmlns:w="http://schemas.openxmlformats.org/wordprocessingml/2006/main" xmlns:w14="http://schemas.microsoft.com/office/word/2010/wordml" xmlns:w15="http://schemas.microsoft.com/office/word/2012/wordml" xmlns:w16cex="http://schemas.microsoft.com/office/word/2018/wordml/cex" xmlns:w16cid="http://schemas.microsoft.com/office/word/2016/wordml/cid" xmlns:w16="http://schemas.microsoft.com/office/word/2018/wordml" xmlns:w16du="http://schemas.microsoft.com/office/word/2023/wordml/word16du" xmlns:w16sdtdh="http://schemas.microsoft.com/office/word/2020/wordml/sdtdatahash" xmlns:w16sdtfl="http://schemas.microsoft.com/office/word/2024/wordml/sdtformatlock" xmlns:w16se="http://schemas.microsoft.com/office/word/2015/wordml/symex" xmlns:wpg="http://schemas.microsoft.com/office/word/2010/wordprocessingGroup" xmlns:wpi="http://schemas.microsoft.com/office/word/2010/wordprocessingInk" xmlns:wne="http://schemas.microsoft.com/office/word/2006/wordml" xmlns:wps="http://schemas.microsoft.com/office/word/2010/wordprocessingShape" mc:Ignorable="w14 w15 w16se w16cid w16 w16cex w16sdtdh w16sdtfl w16du wp14">
   <w:endnote w:type="separator" w:id="-1">
     <w:p>
       <w:pPr>
@@ -5366,7 +3293,7 @@
 </file>
 
 <file path=word/footer1.xml><?xml version="1.0" encoding="utf-8"?>
-<w:ftr xmlns:wpc="http://schemas.microsoft.com/office/word/2010/wordprocessingCanvas" xmlns:cx="http://schemas.microsoft.com/office/drawing/2014/chartex" xmlns:cx1="http://schemas.microsoft.com/office/drawing/2015/9/8/chartex" xmlns:cx2="http://schemas.microsoft.com/office/drawing/2015/10/21/chartex" xmlns:cx3="http://schemas.microsoft.com/office/drawing/2016/5/9/chartex" xmlns:cx4="http://schemas.microsoft.com/office/drawing/2016/5/10/chartex" xmlns:cx5="http://schemas.microsoft.com/office/drawing/2016/5/11/chartex" xmlns:cx6="http://schemas.microsoft.com/office/drawing/2016/5/12/chartex" xmlns:cx7="http://schemas.microsoft.com/office/drawing/2016/5/13/chartex" xmlns:cx8="http://schemas.microsoft.com/office/drawing/2016/5/14/chartex" xmlns:mc="http://schemas.openxmlformats.org/markup-compatibility/2006" xmlns:aink="http://schemas.microsoft.com/office/drawing/2016/ink" xmlns:am3d="http://schemas.microsoft.com/office/drawing/2017/model3d" xmlns:o="urn:schemas-microsoft-com:office:office" xmlns:oel="http://schemas.microsoft.com/office/2019/extlst" xmlns:r="http://schemas.openxmlformats.org/officeDocument/2006/relationships" xmlns:m="http://schemas.openxmlformats.org/officeDocument/2006/math" xmlns:v="urn:schemas-microsoft-com:vml" xmlns:wp14="http://schemas.microsoft.com/office/word/2010/wordprocessingDrawing" xmlns:wp="http://schemas.openxmlformats.org/drawingml/2006/wordprocessingDrawing" xmlns:w10="urn:schemas-microsoft-com:office:word" xmlns:w="http://schemas.openxmlformats.org/wordprocessingml/2006/main" xmlns:w14="http://schemas.microsoft.com/office/word/2010/wordml" xmlns:w15="http://schemas.microsoft.com/office/word/2012/wordml" xmlns:w16cex="http://schemas.microsoft.com/office/word/2018/wordml/cex" xmlns:w16cid="http://schemas.microsoft.com/office/word/2016/wordml/cid" xmlns:w16="http://schemas.microsoft.com/office/word/2018/wordml" xmlns:w16sdtdh="http://schemas.microsoft.com/office/word/2020/wordml/sdtdatahash" xmlns:w16se="http://schemas.microsoft.com/office/word/2015/wordml/symex" xmlns:wpg="http://schemas.microsoft.com/office/word/2010/wordprocessingGroup" xmlns:wpi="http://schemas.microsoft.com/office/word/2010/wordprocessingInk" xmlns:wne="http://schemas.microsoft.com/office/word/2006/wordml" xmlns:wps="http://schemas.microsoft.com/office/word/2010/wordprocessingShape" mc:Ignorable="w14 w15 w16se w16cid w16 w16cex w16sdtdh wp14">
+<w:ftr xmlns:wpc="http://schemas.microsoft.com/office/word/2010/wordprocessingCanvas" xmlns:cx="http://schemas.microsoft.com/office/drawing/2014/chartex" xmlns:cx1="http://schemas.microsoft.com/office/drawing/2015/9/8/chartex" xmlns:cx2="http://schemas.microsoft.com/office/drawing/2015/10/21/chartex" xmlns:cx3="http://schemas.microsoft.com/office/drawing/2016/5/9/chartex" xmlns:cx4="http://schemas.microsoft.com/office/drawing/2016/5/10/chartex" xmlns:cx5="http://schemas.microsoft.com/office/drawing/2016/5/11/chartex" xmlns:cx6="http://schemas.microsoft.com/office/drawing/2016/5/12/chartex" xmlns:cx7="http://schemas.microsoft.com/office/drawing/2016/5/13/chartex" xmlns:cx8="http://schemas.microsoft.com/office/drawing/2016/5/14/chartex" xmlns:mc="http://schemas.openxmlformats.org/markup-compatibility/2006" xmlns:aink="http://schemas.microsoft.com/office/drawing/2016/ink" xmlns:am3d="http://schemas.microsoft.com/office/drawing/2017/model3d" xmlns:o="urn:schemas-microsoft-com:office:office" xmlns:oel="http://schemas.microsoft.com/office/2019/extlst" xmlns:r="http://schemas.openxmlformats.org/officeDocument/2006/relationships" xmlns:m="http://schemas.openxmlformats.org/officeDocument/2006/math" xmlns:v="urn:schemas-microsoft-com:vml" xmlns:wp14="http://schemas.microsoft.com/office/word/2010/wordprocessingDrawing" xmlns:wp="http://schemas.openxmlformats.org/drawingml/2006/wordprocessingDrawing" xmlns:w10="urn:schemas-microsoft-com:office:word" xmlns:w="http://schemas.openxmlformats.org/wordprocessingml/2006/main" xmlns:w14="http://schemas.microsoft.com/office/word/2010/wordml" xmlns:w15="http://schemas.microsoft.com/office/word/2012/wordml" xmlns:w16cex="http://schemas.microsoft.com/office/word/2018/wordml/cex" xmlns:w16cid="http://schemas.microsoft.com/office/word/2016/wordml/cid" xmlns:w16="http://schemas.microsoft.com/office/word/2018/wordml" xmlns:w16du="http://schemas.microsoft.com/office/word/2023/wordml/word16du" xmlns:w16sdtdh="http://schemas.microsoft.com/office/word/2020/wordml/sdtdatahash" xmlns:w16sdtfl="http://schemas.microsoft.com/office/word/2024/wordml/sdtformatlock" xmlns:w16se="http://schemas.microsoft.com/office/word/2015/wordml/symex" xmlns:wpg="http://schemas.microsoft.com/office/word/2010/wordprocessingGroup" xmlns:wpi="http://schemas.microsoft.com/office/word/2010/wordprocessingInk" xmlns:wne="http://schemas.microsoft.com/office/word/2006/wordml" xmlns:wps="http://schemas.microsoft.com/office/word/2010/wordprocessingShape" mc:Ignorable="w14 w15 w16se w16cid w16 w16cex w16sdtdh w16sdtfl w16du wp14">
   <w:sdt>
     <w:sdtPr>
       <w:id w:val="683564432"/>
@@ -5419,7 +3346,7 @@
 </file>
 
 <file path=word/footnotes.xml><?xml version="1.0" encoding="utf-8"?>
-<w:footnotes xmlns:wpc="http://schemas.microsoft.com/office/word/2010/wordprocessingCanvas" xmlns:cx="http://schemas.microsoft.com/office/drawing/2014/chartex" xmlns:cx1="http://schemas.microsoft.com/office/drawing/2015/9/8/chartex" xmlns:cx2="http://schemas.microsoft.com/office/drawing/2015/10/21/chartex" xmlns:cx3="http://schemas.microsoft.com/office/drawing/2016/5/9/chartex" xmlns:cx4="http://schemas.microsoft.com/office/drawing/2016/5/10/chartex" xmlns:cx5="http://schemas.microsoft.com/office/drawing/2016/5/11/chartex" xmlns:cx6="http://schemas.microsoft.com/office/drawing/2016/5/12/chartex" xmlns:cx7="http://schemas.microsoft.com/office/drawing/2016/5/13/chartex" xmlns:cx8="http://schemas.microsoft.com/office/drawing/2016/5/14/chartex" xmlns:mc="http://schemas.openxmlformats.org/markup-compatibility/2006" xmlns:aink="http://schemas.microsoft.com/office/drawing/2016/ink" xmlns:am3d="http://schemas.microsoft.com/office/drawing/2017/model3d" xmlns:o="urn:schemas-microsoft-com:office:office" xmlns:oel="http://schemas.microsoft.com/office/2019/extlst" xmlns:r="http://schemas.openxmlformats.org/officeDocument/2006/relationships" xmlns:m="http://schemas.openxmlformats.org/officeDocument/2006/math" xmlns:v="urn:schemas-microsoft-com:vml" xmlns:wp14="http://schemas.microsoft.com/office/word/2010/wordprocessingDrawing" xmlns:wp="http://schemas.openxmlformats.org/drawingml/2006/wordprocessingDrawing" xmlns:w10="urn:schemas-microsoft-com:office:word" xmlns:w="http://schemas.openxmlformats.org/wordprocessingml/2006/main" xmlns:w14="http://schemas.microsoft.com/office/word/2010/wordml" xmlns:w15="http://schemas.microsoft.com/office/word/2012/wordml" xmlns:w16cex="http://schemas.microsoft.com/office/word/2018/wordml/cex" xmlns:w16cid="http://schemas.microsoft.com/office/word/2016/wordml/cid" xmlns:w16="http://schemas.microsoft.com/office/word/2018/wordml" xmlns:w16sdtdh="http://schemas.microsoft.com/office/word/2020/wordml/sdtdatahash" xmlns:w16se="http://schemas.microsoft.com/office/word/2015/wordml/symex" xmlns:wpg="http://schemas.microsoft.com/office/word/2010/wordprocessingGroup" xmlns:wpi="http://schemas.microsoft.com/office/word/2010/wordprocessingInk" xmlns:wne="http://schemas.microsoft.com/office/word/2006/wordml" xmlns:wps="http://schemas.microsoft.com/office/word/2010/wordprocessingShape" mc:Ignorable="w14 w15 w16se w16cid w16 w16cex w16sdtdh wp14">
+<w:footnotes xmlns:wpc="http://schemas.microsoft.com/office/word/2010/wordprocessingCanvas" xmlns:cx="http://schemas.microsoft.com/office/drawing/2014/chartex" xmlns:cx1="http://schemas.microsoft.com/office/drawing/2015/9/8/chartex" xmlns:cx2="http://schemas.microsoft.com/office/drawing/2015/10/21/chartex" xmlns:cx3="http://schemas.microsoft.com/office/drawing/2016/5/9/chartex" xmlns:cx4="http://schemas.microsoft.com/office/drawing/2016/5/10/chartex" xmlns:cx5="http://schemas.microsoft.com/office/drawing/2016/5/11/chartex" xmlns:cx6="http://schemas.microsoft.com/office/drawing/2016/5/12/chartex" xmlns:cx7="http://schemas.microsoft.com/office/drawing/2016/5/13/chartex" xmlns:cx8="http://schemas.microsoft.com/office/drawing/2016/5/14/chartex" xmlns:mc="http://schemas.openxmlformats.org/markup-compatibility/2006" xmlns:aink="http://schemas.microsoft.com/office/drawing/2016/ink" xmlns:am3d="http://schemas.microsoft.com/office/drawing/2017/model3d" xmlns:o="urn:schemas-microsoft-com:office:office" xmlns:oel="http://schemas.microsoft.com/office/2019/extlst" xmlns:r="http://schemas.openxmlformats.org/officeDocument/2006/relationships" xmlns:m="http://schemas.openxmlformats.org/officeDocument/2006/math" xmlns:v="urn:schemas-microsoft-com:vml" xmlns:wp14="http://schemas.microsoft.com/office/word/2010/wordprocessingDrawing" xmlns:wp="http://schemas.openxmlformats.org/drawingml/2006/wordprocessingDrawing" xmlns:w10="urn:schemas-microsoft-com:office:word" xmlns:w="http://schemas.openxmlformats.org/wordprocessingml/2006/main" xmlns:w14="http://schemas.microsoft.com/office/word/2010/wordml" xmlns:w15="http://schemas.microsoft.com/office/word/2012/wordml" xmlns:w16cex="http://schemas.microsoft.com/office/word/2018/wordml/cex" xmlns:w16cid="http://schemas.microsoft.com/office/word/2016/wordml/cid" xmlns:w16="http://schemas.microsoft.com/office/word/2018/wordml" xmlns:w16du="http://schemas.microsoft.com/office/word/2023/wordml/word16du" xmlns:w16sdtdh="http://schemas.microsoft.com/office/word/2020/wordml/sdtdatahash" xmlns:w16sdtfl="http://schemas.microsoft.com/office/word/2024/wordml/sdtformatlock" xmlns:w16se="http://schemas.microsoft.com/office/word/2015/wordml/symex" xmlns:wpg="http://schemas.microsoft.com/office/word/2010/wordprocessingGroup" xmlns:wpi="http://schemas.microsoft.com/office/word/2010/wordprocessingInk" xmlns:wne="http://schemas.microsoft.com/office/word/2006/wordml" xmlns:wps="http://schemas.microsoft.com/office/word/2010/wordprocessingShape" mc:Ignorable="w14 w15 w16se w16cid w16 w16cex w16sdtdh w16sdtfl w16du wp14">
   <w:footnote w:type="separator" w:id="-1">
     <w:p>
       <w:pPr>
@@ -5444,7 +3371,7 @@
 </file>
 
 <file path=word/numbering.xml><?xml version="1.0" encoding="utf-8"?>
-<w:numbering xmlns:wpc="http://schemas.microsoft.com/office/word/2010/wordprocessingCanvas" xmlns:cx="http://schemas.microsoft.com/office/drawing/2014/chartex" xmlns:cx1="http://schemas.microsoft.com/office/drawing/2015/9/8/chartex" xmlns:cx2="http://schemas.microsoft.com/office/drawing/2015/10/21/chartex" xmlns:cx3="http://schemas.microsoft.com/office/drawing/2016/5/9/chartex" xmlns:cx4="http://schemas.microsoft.com/office/drawing/2016/5/10/chartex" xmlns:cx5="http://schemas.microsoft.com/office/drawing/2016/5/11/chartex" xmlns:cx6="http://schemas.microsoft.com/office/drawing/2016/5/12/chartex" xmlns:cx7="http://schemas.microsoft.com/office/drawing/2016/5/13/chartex" xmlns:cx8="http://schemas.microsoft.com/office/drawing/2016/5/14/chartex" xmlns:mc="http://schemas.openxmlformats.org/markup-compatibility/2006" xmlns:aink="http://schemas.microsoft.com/office/drawing/2016/ink" xmlns:am3d="http://schemas.microsoft.com/office/drawing/2017/model3d" xmlns:o="urn:schemas-microsoft-com:office:office" xmlns:oel="http://schemas.microsoft.com/office/2019/extlst" xmlns:r="http://schemas.openxmlformats.org/officeDocument/2006/relationships" xmlns:m="http://schemas.openxmlformats.org/officeDocument/2006/math" xmlns:v="urn:schemas-microsoft-com:vml" xmlns:wp14="http://schemas.microsoft.com/office/word/2010/wordprocessingDrawing" xmlns:wp="http://schemas.openxmlformats.org/drawingml/2006/wordprocessingDrawing" xmlns:w10="urn:schemas-microsoft-com:office:word" xmlns:w="http://schemas.openxmlformats.org/wordprocessingml/2006/main" xmlns:w14="http://schemas.microsoft.com/office/word/2010/wordml" xmlns:w15="http://schemas.microsoft.com/office/word/2012/wordml" xmlns:w16cex="http://schemas.microsoft.com/office/word/2018/wordml/cex" xmlns:w16cid="http://schemas.microsoft.com/office/word/2016/wordml/cid" xmlns:w16="http://schemas.microsoft.com/office/word/2018/wordml" xmlns:w16sdtdh="http://schemas.microsoft.com/office/word/2020/wordml/sdtdatahash" xmlns:w16se="http://schemas.microsoft.com/office/word/2015/wordml/symex" xmlns:wpg="http://schemas.microsoft.com/office/word/2010/wordprocessingGroup" xmlns:wpi="http://schemas.microsoft.com/office/word/2010/wordprocessingInk" xmlns:wne="http://schemas.microsoft.com/office/word/2006/wordml" xmlns:wps="http://schemas.microsoft.com/office/word/2010/wordprocessingShape" mc:Ignorable="w14 w15 w16se w16cid w16 w16cex w16sdtdh wp14">
+<w:numbering xmlns:wpc="http://schemas.microsoft.com/office/word/2010/wordprocessingCanvas" xmlns:cx="http://schemas.microsoft.com/office/drawing/2014/chartex" xmlns:cx1="http://schemas.microsoft.com/office/drawing/2015/9/8/chartex" xmlns:cx2="http://schemas.microsoft.com/office/drawing/2015/10/21/chartex" xmlns:cx3="http://schemas.microsoft.com/office/drawing/2016/5/9/chartex" xmlns:cx4="http://schemas.microsoft.com/office/drawing/2016/5/10/chartex" xmlns:cx5="http://schemas.microsoft.com/office/drawing/2016/5/11/chartex" xmlns:cx6="http://schemas.microsoft.com/office/drawing/2016/5/12/chartex" xmlns:cx7="http://schemas.microsoft.com/office/drawing/2016/5/13/chartex" xmlns:cx8="http://schemas.microsoft.com/office/drawing/2016/5/14/chartex" xmlns:mc="http://schemas.openxmlformats.org/markup-compatibility/2006" xmlns:aink="http://schemas.microsoft.com/office/drawing/2016/ink" xmlns:am3d="http://schemas.microsoft.com/office/drawing/2017/model3d" xmlns:o="urn:schemas-microsoft-com:office:office" xmlns:oel="http://schemas.microsoft.com/office/2019/extlst" xmlns:r="http://schemas.openxmlformats.org/officeDocument/2006/relationships" xmlns:m="http://schemas.openxmlformats.org/officeDocument/2006/math" xmlns:v="urn:schemas-microsoft-com:vml" xmlns:wp14="http://schemas.microsoft.com/office/word/2010/wordprocessingDrawing" xmlns:wp="http://schemas.openxmlformats.org/drawingml/2006/wordprocessingDrawing" xmlns:w10="urn:schemas-microsoft-com:office:word" xmlns:w="http://schemas.openxmlformats.org/wordprocessingml/2006/main" xmlns:w14="http://schemas.microsoft.com/office/word/2010/wordml" xmlns:w15="http://schemas.microsoft.com/office/word/2012/wordml" xmlns:w16cex="http://schemas.microsoft.com/office/word/2018/wordml/cex" xmlns:w16cid="http://schemas.microsoft.com/office/word/2016/wordml/cid" xmlns:w16="http://schemas.microsoft.com/office/word/2018/wordml" xmlns:w16du="http://schemas.microsoft.com/office/word/2023/wordml/word16du" xmlns:w16sdtdh="http://schemas.microsoft.com/office/word/2020/wordml/sdtdatahash" xmlns:w16sdtfl="http://schemas.microsoft.com/office/word/2024/wordml/sdtformatlock" xmlns:w16se="http://schemas.microsoft.com/office/word/2015/wordml/symex" xmlns:wpg="http://schemas.microsoft.com/office/word/2010/wordprocessingGroup" xmlns:wpi="http://schemas.microsoft.com/office/word/2010/wordprocessingInk" xmlns:wne="http://schemas.microsoft.com/office/word/2006/wordml" xmlns:wps="http://schemas.microsoft.com/office/word/2010/wordprocessingShape" mc:Ignorable="w14 w15 w16se w16cid w16 w16cex w16sdtdh w16sdtfl w16du wp14">
   <w:abstractNum w:abstractNumId="0" w15:restartNumberingAfterBreak="0">
     <w:nsid w:val="0000A990"/>
     <w:multiLevelType w:val="multilevel"/>
@@ -5529,7 +3456,7 @@
 </file>
 
 <file path=word/styles.xml><?xml version="1.0" encoding="utf-8"?>
-<w:styles xmlns:mc="http://schemas.openxmlformats.org/markup-compatibility/2006" xmlns:r="http://schemas.openxmlformats.org/officeDocument/2006/relationships" xmlns:w="http://schemas.openxmlformats.org/wordprocessingml/2006/main" xmlns:w14="http://schemas.microsoft.com/office/word/2010/wordml" xmlns:w15="http://schemas.microsoft.com/office/word/2012/wordml" xmlns:w16cex="http://schemas.microsoft.com/office/word/2018/wordml/cex" xmlns:w16cid="http://schemas.microsoft.com/office/word/2016/wordml/cid" xmlns:w16="http://schemas.microsoft.com/office/word/2018/wordml" xmlns:w16sdtdh="http://schemas.microsoft.com/office/word/2020/wordml/sdtdatahash" xmlns:w16se="http://schemas.microsoft.com/office/word/2015/wordml/symex" mc:Ignorable="w14 w15 w16se w16cid w16 w16cex w16sdtdh">
+<w:styles xmlns:mc="http://schemas.openxmlformats.org/markup-compatibility/2006" xmlns:r="http://schemas.openxmlformats.org/officeDocument/2006/relationships" xmlns:w="http://schemas.openxmlformats.org/wordprocessingml/2006/main" xmlns:w14="http://schemas.microsoft.com/office/word/2010/wordml" xmlns:w15="http://schemas.microsoft.com/office/word/2012/wordml" xmlns:w16cex="http://schemas.microsoft.com/office/word/2018/wordml/cex" xmlns:w16cid="http://schemas.microsoft.com/office/word/2016/wordml/cid" xmlns:w16="http://schemas.microsoft.com/office/word/2018/wordml" xmlns:w16du="http://schemas.microsoft.com/office/word/2023/wordml/word16du" xmlns:w16sdtdh="http://schemas.microsoft.com/office/word/2020/wordml/sdtdatahash" xmlns:w16sdtfl="http://schemas.microsoft.com/office/word/2024/wordml/sdtformatlock" xmlns:w16se="http://schemas.microsoft.com/office/word/2015/wordml/symex" mc:Ignorable="w14 w15 w16se w16cid w16 w16cex w16sdtdh w16sdtfl w16du">
   <w:docDefaults>
     <w:rPrDefault>
       <w:rPr>
@@ -7132,26 +5059,6 @@
 </file>
 
 <file path=customXml/item1.xml><?xml version="1.0" encoding="utf-8"?>
-<p:properties xmlns:p="http://schemas.microsoft.com/office/2006/metadata/properties" xmlns:xsi="http://www.w3.org/2001/XMLSchema-instance" xmlns:pc="http://schemas.microsoft.com/office/infopath/2007/PartnerControls">
-  <documentManagement>
-    <lcf76f155ced4ddcb4097134ff3c332f xmlns="ad085b6c-7437-411b-8b38-47c968abd347">
-      <Terms xmlns="http://schemas.microsoft.com/office/infopath/2007/PartnerControls"/>
-    </lcf76f155ced4ddcb4097134ff3c332f>
-    <TaxCatchAll xmlns="31062a0d-ede8-4112-b4bb-00a9c1bc8e16" xsi:nil="true"/>
-  </documentManagement>
-</p:properties>
-</file>
-
-<file path=customXml/item2.xml><?xml version="1.0" encoding="utf-8"?>
-<?mso-contentType ?>
-<FormTemplates xmlns="http://schemas.microsoft.com/sharepoint/v3/contenttype/forms">
-  <Display>DocumentLibraryForm</Display>
-  <Edit>DocumentLibraryForm</Edit>
-  <New>DocumentLibraryForm</New>
-</FormTemplates>
-</file>
-
-<file path=customXml/item3.xml><?xml version="1.0" encoding="utf-8"?>
 <ct:contentTypeSchema xmlns:ct="http://schemas.microsoft.com/office/2006/metadata/contentType" xmlns:ma="http://schemas.microsoft.com/office/2006/metadata/properties/metaAttributes" ct:_="" ma:_="" ma:contentTypeName="Document" ma:contentTypeID="0x010100082CD3E31919CD4D8655811E15D5BC27" ma:contentTypeVersion="15" ma:contentTypeDescription="Create a new document." ma:contentTypeScope="" ma:versionID="729ac04ea1630219c040c2ff78caacb6">
   <xsd:schema xmlns:xsd="http://www.w3.org/2001/XMLSchema" xmlns:xs="http://www.w3.org/2001/XMLSchema" xmlns:p="http://schemas.microsoft.com/office/2006/metadata/properties" xmlns:ns2="ad085b6c-7437-411b-8b38-47c968abd347" xmlns:ns3="4671cff1-bb98-4362-b999-0807e48a599e" xmlns:ns4="31062a0d-ede8-4112-b4bb-00a9c1bc8e16" targetNamespace="http://schemas.microsoft.com/office/2006/metadata/properties" ma:root="true" ma:fieldsID="241d4379ad00e4ac2cac03ddcde72730" ns2:_="" ns3:_="" ns4:_="">
     <xsd:import namespace="ad085b6c-7437-411b-8b38-47c968abd347"/>
@@ -7391,26 +5298,27 @@
 </ct:contentTypeSchema>
 </file>
 
-<file path=customXml/itemProps1.xml><?xml version="1.0" encoding="utf-8"?>
-<ds:datastoreItem xmlns:ds="http://schemas.openxmlformats.org/officeDocument/2006/customXml" ds:itemID="{91F9EDDB-208F-4099-BB03-B0E33B4BAF4C}">
-  <ds:schemaRefs>
-    <ds:schemaRef ds:uri="http://schemas.microsoft.com/office/2006/metadata/properties"/>
-    <ds:schemaRef ds:uri="http://schemas.microsoft.com/office/infopath/2007/PartnerControls"/>
-    <ds:schemaRef ds:uri="ad085b6c-7437-411b-8b38-47c968abd347"/>
-    <ds:schemaRef ds:uri="31062a0d-ede8-4112-b4bb-00a9c1bc8e16"/>
-  </ds:schemaRefs>
-</ds:datastoreItem>
+<file path=customXml/item2.xml><?xml version="1.0" encoding="utf-8"?>
+<?mso-contentType ?>
+<FormTemplates xmlns="http://schemas.microsoft.com/sharepoint/v3/contenttype/forms">
+  <Display>DocumentLibraryForm</Display>
+  <Edit>DocumentLibraryForm</Edit>
+  <New>DocumentLibraryForm</New>
+</FormTemplates>
 </file>
 
-<file path=customXml/itemProps2.xml><?xml version="1.0" encoding="utf-8"?>
-<ds:datastoreItem xmlns:ds="http://schemas.openxmlformats.org/officeDocument/2006/customXml" ds:itemID="{1574FA4D-C623-4478-BD29-C9A7DCE7A61F}">
-  <ds:schemaRefs>
-    <ds:schemaRef ds:uri="http://schemas.microsoft.com/sharepoint/v3/contenttype/forms"/>
-  </ds:schemaRefs>
-</ds:datastoreItem>
+<file path=customXml/item3.xml><?xml version="1.0" encoding="utf-8"?>
+<p:properties xmlns:p="http://schemas.microsoft.com/office/2006/metadata/properties" xmlns:xsi="http://www.w3.org/2001/XMLSchema-instance" xmlns:pc="http://schemas.microsoft.com/office/infopath/2007/PartnerControls">
+  <documentManagement>
+    <lcf76f155ced4ddcb4097134ff3c332f xmlns="ad085b6c-7437-411b-8b38-47c968abd347">
+      <Terms xmlns="http://schemas.microsoft.com/office/infopath/2007/PartnerControls"/>
+    </lcf76f155ced4ddcb4097134ff3c332f>
+    <TaxCatchAll xmlns="31062a0d-ede8-4112-b4bb-00a9c1bc8e16" xsi:nil="true"/>
+  </documentManagement>
+</p:properties>
 </file>
 
-<file path=customXml/itemProps3.xml><?xml version="1.0" encoding="utf-8"?>
+<file path=customXml/itemProps1.xml><?xml version="1.0" encoding="utf-8"?>
 <ds:datastoreItem xmlns:ds="http://schemas.openxmlformats.org/officeDocument/2006/customXml" ds:itemID="{9C72E5BE-70BD-49BD-B0FF-C90E276FBC07}">
   <ds:schemaRefs>
     <ds:schemaRef ds:uri="http://schemas.microsoft.com/office/2006/metadata/contentType"/>
@@ -7428,4 +5336,29 @@
     <ds:schemaRef ds:uri="http://schemas.microsoft.com/internal/obd"/>
   </ds:schemaRefs>
 </ds:datastoreItem>
+</file>
+
+<file path=customXml/itemProps2.xml><?xml version="1.0" encoding="utf-8"?>
+<ds:datastoreItem xmlns:ds="http://schemas.openxmlformats.org/officeDocument/2006/customXml" ds:itemID="{1574FA4D-C623-4478-BD29-C9A7DCE7A61F}">
+  <ds:schemaRefs>
+    <ds:schemaRef ds:uri="http://schemas.microsoft.com/sharepoint/v3/contenttype/forms"/>
+  </ds:schemaRefs>
+</ds:datastoreItem>
+</file>
+
+<file path=customXml/itemProps3.xml><?xml version="1.0" encoding="utf-8"?>
+<ds:datastoreItem xmlns:ds="http://schemas.openxmlformats.org/officeDocument/2006/customXml" ds:itemID="{91F9EDDB-208F-4099-BB03-B0E33B4BAF4C}">
+  <ds:schemaRefs>
+    <ds:schemaRef ds:uri="http://schemas.microsoft.com/office/2006/metadata/properties"/>
+    <ds:schemaRef ds:uri="http://schemas.microsoft.com/office/infopath/2007/PartnerControls"/>
+    <ds:schemaRef ds:uri="ad085b6c-7437-411b-8b38-47c968abd347"/>
+    <ds:schemaRef ds:uri="31062a0d-ede8-4112-b4bb-00a9c1bc8e16"/>
+  </ds:schemaRefs>
+</ds:datastoreItem>
+</file>
+
+<file path=docMetadata/LabelInfo.xml><?xml version="1.0" encoding="utf-8"?>
+<clbl:labelList xmlns:clbl="http://schemas.microsoft.com/office/2020/mipLabelMetadata">
+  <clbl:label id="{6dd02d64-b7f3-43f7-a145-cfd68d338edf}" enabled="1" method="Standard" siteId="{0693b5ba-4b18-4d7b-9341-f32f400a5494}" contentBits="0" removed="0"/>
+</clbl:labelList>
 </file>
</xml_diff>

<commit_message>
Daniel Branch  - Updates for through 2025 Data Package and Data Release Report - updates for Darwin Core Standards, etc.
* Updating Repo with 2025 data for 05/2026 data package

* Updates to DRR script and processing of DRR for 2025 field season.

* Removing redundant documentation- now located on sharepoint site

* Updating tables and metadata with 5/19 Parker Kaye comments and new database FE and BE

* 5/20/26 edits amending QC flags, column names in Bands and ChickBands

* Updating DRR template and output to add dynamic QC Flag Template

* Fixing error noted on 05/26/26 with QC flags
</commit_message>
<xml_diff>
--- a/SFAN_SNPLPORE_DRR_Template.docx
+++ b/SFAN_SNPLPORE_DRR_Template.docx
@@ -1,6 +1,6 @@
 
 <file path=word/document.xml><?xml version="1.0" encoding="utf-8"?>
-<w:document xmlns:wpc="http://schemas.microsoft.com/office/word/2010/wordprocessingCanvas" xmlns:cx="http://schemas.microsoft.com/office/drawing/2014/chartex" xmlns:cx1="http://schemas.microsoft.com/office/drawing/2015/9/8/chartex" xmlns:cx2="http://schemas.microsoft.com/office/drawing/2015/10/21/chartex" xmlns:cx3="http://schemas.microsoft.com/office/drawing/2016/5/9/chartex" xmlns:cx4="http://schemas.microsoft.com/office/drawing/2016/5/10/chartex" xmlns:cx5="http://schemas.microsoft.com/office/drawing/2016/5/11/chartex" xmlns:cx6="http://schemas.microsoft.com/office/drawing/2016/5/12/chartex" xmlns:cx7="http://schemas.microsoft.com/office/drawing/2016/5/13/chartex" xmlns:cx8="http://schemas.microsoft.com/office/drawing/2016/5/14/chartex" xmlns:mc="http://schemas.openxmlformats.org/markup-compatibility/2006" xmlns:aink="http://schemas.microsoft.com/office/drawing/2016/ink" xmlns:am3d="http://schemas.microsoft.com/office/drawing/2017/model3d" xmlns:o="urn:schemas-microsoft-com:office:office" xmlns:oel="http://schemas.microsoft.com/office/2019/extlst" xmlns:r="http://schemas.openxmlformats.org/officeDocument/2006/relationships" xmlns:m="http://schemas.openxmlformats.org/officeDocument/2006/math" xmlns:v="urn:schemas-microsoft-com:vml" xmlns:wp14="http://schemas.microsoft.com/office/word/2010/wordprocessingDrawing" xmlns:wp="http://schemas.openxmlformats.org/drawingml/2006/wordprocessingDrawing" xmlns:w10="urn:schemas-microsoft-com:office:word" xmlns:w="http://schemas.openxmlformats.org/wordprocessingml/2006/main" xmlns:w14="http://schemas.microsoft.com/office/word/2010/wordml" xmlns:w15="http://schemas.microsoft.com/office/word/2012/wordml" xmlns:w16cex="http://schemas.microsoft.com/office/word/2018/wordml/cex" xmlns:w16cid="http://schemas.microsoft.com/office/word/2016/wordml/cid" xmlns:w16="http://schemas.microsoft.com/office/word/2018/wordml" xmlns:w16sdtdh="http://schemas.microsoft.com/office/word/2020/wordml/sdtdatahash" xmlns:w16se="http://schemas.microsoft.com/office/word/2015/wordml/symex" xmlns:wpg="http://schemas.microsoft.com/office/word/2010/wordprocessingGroup" xmlns:wpi="http://schemas.microsoft.com/office/word/2010/wordprocessingInk" xmlns:wne="http://schemas.microsoft.com/office/word/2006/wordml" xmlns:wps="http://schemas.microsoft.com/office/word/2010/wordprocessingShape" mc:Ignorable="w14 w15 w16se w16cid w16 w16cex w16sdtdh wp14">
+<w:document xmlns:wpc="http://schemas.microsoft.com/office/word/2010/wordprocessingCanvas" xmlns:cx="http://schemas.microsoft.com/office/drawing/2014/chartex" xmlns:cx1="http://schemas.microsoft.com/office/drawing/2015/9/8/chartex" xmlns:cx2="http://schemas.microsoft.com/office/drawing/2015/10/21/chartex" xmlns:cx3="http://schemas.microsoft.com/office/drawing/2016/5/9/chartex" xmlns:cx4="http://schemas.microsoft.com/office/drawing/2016/5/10/chartex" xmlns:cx5="http://schemas.microsoft.com/office/drawing/2016/5/11/chartex" xmlns:cx6="http://schemas.microsoft.com/office/drawing/2016/5/12/chartex" xmlns:cx7="http://schemas.microsoft.com/office/drawing/2016/5/13/chartex" xmlns:cx8="http://schemas.microsoft.com/office/drawing/2016/5/14/chartex" xmlns:mc="http://schemas.openxmlformats.org/markup-compatibility/2006" xmlns:aink="http://schemas.microsoft.com/office/drawing/2016/ink" xmlns:am3d="http://schemas.microsoft.com/office/drawing/2017/model3d" xmlns:o="urn:schemas-microsoft-com:office:office" xmlns:oel="http://schemas.microsoft.com/office/2019/extlst" xmlns:r="http://schemas.openxmlformats.org/officeDocument/2006/relationships" xmlns:m="http://schemas.openxmlformats.org/officeDocument/2006/math" xmlns:v="urn:schemas-microsoft-com:vml" xmlns:wp14="http://schemas.microsoft.com/office/word/2010/wordprocessingDrawing" xmlns:wp="http://schemas.openxmlformats.org/drawingml/2006/wordprocessingDrawing" xmlns:w10="urn:schemas-microsoft-com:office:word" xmlns:w="http://schemas.openxmlformats.org/wordprocessingml/2006/main" xmlns:w14="http://schemas.microsoft.com/office/word/2010/wordml" xmlns:w15="http://schemas.microsoft.com/office/word/2012/wordml" xmlns:w16cex="http://schemas.microsoft.com/office/word/2018/wordml/cex" xmlns:w16cid="http://schemas.microsoft.com/office/word/2016/wordml/cid" xmlns:w16="http://schemas.microsoft.com/office/word/2018/wordml" xmlns:w16du="http://schemas.microsoft.com/office/word/2023/wordml/word16du" xmlns:w16sdtdh="http://schemas.microsoft.com/office/word/2020/wordml/sdtdatahash" xmlns:w16sdtfl="http://schemas.microsoft.com/office/word/2024/wordml/sdtformatlock" xmlns:w16se="http://schemas.microsoft.com/office/word/2015/wordml/symex" xmlns:wpg="http://schemas.microsoft.com/office/word/2010/wordprocessingGroup" xmlns:wpi="http://schemas.microsoft.com/office/word/2010/wordprocessingInk" xmlns:wne="http://schemas.microsoft.com/office/word/2006/wordml" xmlns:wps="http://schemas.microsoft.com/office/word/2010/wordprocessingShape" mc:Ignorable="w14 w15 w16se w16cid w16 w16cex w16sdtdh w16sdtfl w16du wp14">
   <w:body>
     <w:p>
       <w:pPr>
@@ -1061,7 +1061,23 @@
         <w:pStyle w:val="FirstParagraph"/>
       </w:pPr>
       <w:r>
-        <w:t>Within the context of an annual data lifecycle workflow, data are reviewed and validated through data verification and validation procedures implemented by the San Francisco Bay Area Inventory &amp; Monitoring Network (SFAN). After surveys are completed, monitoring personnel perform data entry validation to confirm entered data matches what was recorded on original data forms. Fields are checked for accuracy and completeness, including correct site names, expected locations and standard date and time entries. Data are checked against field notes when appropriate. After data entry verification has been completed records are given a data processing level of “Provisional”.</w:t>
+        <w:t xml:space="preserve">Within the context of an annual data lifecycle workflow, data are reviewed and validated through data verification and validation procedures implemented by the San Francisco Bay Area Inventory &amp; Monitoring Network (SFAN). After surveys are completed, monitoring personnel perform </w:t>
+      </w:r>
+      <w:proofErr w:type="gramStart"/>
+      <w:r>
+        <w:t>data entry</w:t>
+      </w:r>
+      <w:proofErr w:type="gramEnd"/>
+      <w:r>
+        <w:t xml:space="preserve"> validation to confirm entered data matches what was recorded on original data forms. Fields are checked for accuracy and completeness, including correct site names, expected locations and standard date and time entries. Data </w:t>
+      </w:r>
+      <w:proofErr w:type="gramStart"/>
+      <w:r>
+        <w:t>are</w:t>
+      </w:r>
+      <w:proofErr w:type="gramEnd"/>
+      <w:r>
+        <w:t xml:space="preserve"> checked against field notes when appropriate. After data entry verification has been completed records are given a data processing level of “Provisional”.</w:t>
       </w:r>
     </w:p>
     <w:p>
@@ -1084,7 +1100,15 @@
         <w:t xml:space="preserve"> and 2024</w:t>
       </w:r>
       <w:r>
-        <w:t xml:space="preserve"> data has been through the data validation procedure with accompanying “Accepted” data processing status.</w:t>
+        <w:t xml:space="preserve"> data </w:t>
+      </w:r>
+      <w:proofErr w:type="gramStart"/>
+      <w:r>
+        <w:t>has</w:t>
+      </w:r>
+      <w:proofErr w:type="gramEnd"/>
+      <w:r>
+        <w:t xml:space="preserve"> been through the data validation procedure with accompanying “Accepted” data processing status.</w:t>
       </w:r>
       <w:r>
         <w:t xml:space="preserve"> Monitoring years 2009 – 2018 and </w:t>
@@ -1190,2230 +1214,6 @@
         </w:rPr>
         <w:t>Realized data quality control flags.</w:t>
       </w:r>
-    </w:p>
-    <w:tbl>
-      <w:tblPr>
-        <w:tblW w:w="9840" w:type="dxa"/>
-        <w:tblInd w:w="108" w:type="dxa"/>
-        <w:tblLook w:val="04A0" w:firstRow="1" w:lastRow="0" w:firstColumn="1" w:lastColumn="0" w:noHBand="0" w:noVBand="1"/>
-      </w:tblPr>
-      <w:tblGrid>
-        <w:gridCol w:w="1600"/>
-        <w:gridCol w:w="5500"/>
-        <w:gridCol w:w="2740"/>
-      </w:tblGrid>
-      <w:tr>
-        <w:trPr>
-          <w:trHeight w:val="300"/>
-        </w:trPr>
-        <w:tc>
-          <w:tcPr>
-            <w:tcW w:w="1600" w:type="dxa"/>
-            <w:tcBorders>
-              <w:top w:val="nil"/>
-              <w:left w:val="nil"/>
-              <w:bottom w:val="single" w:sz="4" w:space="0" w:color="auto"/>
-              <w:right w:val="nil"/>
-            </w:tcBorders>
-            <w:shd w:val="clear" w:color="auto" w:fill="auto"/>
-            <w:noWrap/>
-            <w:vAlign w:val="bottom"/>
-            <w:hideMark/>
-          </w:tcPr>
-          <w:p>
-            <w:pPr>
-              <w:spacing w:after="0"/>
-              <w:rPr>
-                <w:rFonts w:ascii="Aptos" w:eastAsia="Times New Roman" w:hAnsi="Aptos" w:cs="Times New Roman"/>
-                <w:b/>
-                <w:bCs/>
-                <w:color w:val="000000"/>
-                <w:sz w:val="22"/>
-                <w:szCs w:val="22"/>
-              </w:rPr>
-            </w:pPr>
-            <w:r>
-              <w:rPr>
-                <w:rFonts w:ascii="Aptos" w:eastAsia="Times New Roman" w:hAnsi="Aptos" w:cs="Times New Roman"/>
-                <w:b/>
-                <w:bCs/>
-                <w:color w:val="000000"/>
-                <w:sz w:val="22"/>
-                <w:szCs w:val="22"/>
-              </w:rPr>
-              <w:t>Flag Code</w:t>
-            </w:r>
-          </w:p>
-        </w:tc>
-        <w:tc>
-          <w:tcPr>
-            <w:tcW w:w="5500" w:type="dxa"/>
-            <w:tcBorders>
-              <w:left w:val="nil"/>
-              <w:bottom w:val="single" w:sz="4" w:space="0" w:color="auto"/>
-              <w:right w:val="nil"/>
-            </w:tcBorders>
-            <w:shd w:val="clear" w:color="auto" w:fill="auto"/>
-            <w:noWrap/>
-            <w:vAlign w:val="bottom"/>
-            <w:hideMark/>
-          </w:tcPr>
-          <w:p>
-            <w:pPr>
-              <w:spacing w:after="0"/>
-              <w:rPr>
-                <w:rFonts w:ascii="Aptos" w:eastAsia="Times New Roman" w:hAnsi="Aptos" w:cs="Times New Roman"/>
-                <w:b/>
-                <w:bCs/>
-                <w:color w:val="000000"/>
-                <w:sz w:val="22"/>
-                <w:szCs w:val="22"/>
-              </w:rPr>
-            </w:pPr>
-            <w:r>
-              <w:rPr>
-                <w:rFonts w:ascii="Aptos" w:eastAsia="Times New Roman" w:hAnsi="Aptos" w:cs="Times New Roman"/>
-                <w:b/>
-                <w:bCs/>
-                <w:color w:val="000000"/>
-                <w:sz w:val="22"/>
-                <w:szCs w:val="22"/>
-              </w:rPr>
-              <w:t>Flag</w:t>
-            </w:r>
-            <w:r>
-              <w:rPr>
-                <w:rFonts w:ascii="Aptos" w:eastAsia="Times New Roman" w:hAnsi="Aptos" w:cs="Times New Roman"/>
-                <w:b/>
-                <w:bCs/>
-                <w:color w:val="000000"/>
-                <w:sz w:val="22"/>
-                <w:szCs w:val="22"/>
-              </w:rPr>
-              <w:t xml:space="preserve"> </w:t>
-            </w:r>
-            <w:r>
-              <w:rPr>
-                <w:rFonts w:ascii="Aptos" w:eastAsia="Times New Roman" w:hAnsi="Aptos" w:cs="Times New Roman"/>
-                <w:b/>
-                <w:bCs/>
-                <w:color w:val="000000"/>
-                <w:sz w:val="22"/>
-                <w:szCs w:val="22"/>
-              </w:rPr>
-              <w:t>Definition</w:t>
-            </w:r>
-          </w:p>
-        </w:tc>
-        <w:tc>
-          <w:tcPr>
-            <w:tcW w:w="2740" w:type="dxa"/>
-            <w:tcBorders>
-              <w:top w:val="nil"/>
-              <w:left w:val="nil"/>
-              <w:bottom w:val="single" w:sz="4" w:space="0" w:color="auto"/>
-              <w:right w:val="nil"/>
-            </w:tcBorders>
-            <w:shd w:val="clear" w:color="auto" w:fill="auto"/>
-            <w:noWrap/>
-            <w:vAlign w:val="bottom"/>
-            <w:hideMark/>
-          </w:tcPr>
-          <w:p>
-            <w:pPr>
-              <w:spacing w:after="0"/>
-              <w:rPr>
-                <w:rFonts w:ascii="Aptos" w:eastAsia="Times New Roman" w:hAnsi="Aptos" w:cs="Times New Roman"/>
-                <w:b/>
-                <w:bCs/>
-                <w:color w:val="000000"/>
-                <w:sz w:val="22"/>
-                <w:szCs w:val="22"/>
-              </w:rPr>
-            </w:pPr>
-            <w:r>
-              <w:rPr>
-                <w:rFonts w:ascii="Aptos" w:eastAsia="Times New Roman" w:hAnsi="Aptos" w:cs="Times New Roman"/>
-                <w:b/>
-                <w:bCs/>
-                <w:color w:val="000000"/>
-                <w:sz w:val="22"/>
-                <w:szCs w:val="22"/>
-              </w:rPr>
-              <w:t>Analysis</w:t>
-            </w:r>
-            <w:r>
-              <w:rPr>
-                <w:rFonts w:ascii="Aptos" w:eastAsia="Times New Roman" w:hAnsi="Aptos" w:cs="Times New Roman"/>
-                <w:b/>
-                <w:bCs/>
-                <w:color w:val="000000"/>
-                <w:sz w:val="22"/>
-                <w:szCs w:val="22"/>
-              </w:rPr>
-              <w:t xml:space="preserve"> </w:t>
-            </w:r>
-            <w:r>
-              <w:rPr>
-                <w:rFonts w:ascii="Aptos" w:eastAsia="Times New Roman" w:hAnsi="Aptos" w:cs="Times New Roman"/>
-                <w:b/>
-                <w:bCs/>
-                <w:color w:val="000000"/>
-                <w:sz w:val="22"/>
-                <w:szCs w:val="22"/>
-              </w:rPr>
-              <w:t>Interpretation</w:t>
-            </w:r>
-          </w:p>
-        </w:tc>
-      </w:tr>
-      <w:tr>
-        <w:trPr>
-          <w:trHeight w:val="450"/>
-        </w:trPr>
-        <w:tc>
-          <w:tcPr>
-            <w:tcW w:w="1600" w:type="dxa"/>
-            <w:tcBorders>
-              <w:top w:val="nil"/>
-              <w:left w:val="nil"/>
-              <w:bottom w:val="nil"/>
-              <w:right w:val="nil"/>
-            </w:tcBorders>
-            <w:shd w:val="clear" w:color="auto" w:fill="auto"/>
-            <w:vAlign w:val="center"/>
-            <w:hideMark/>
-          </w:tcPr>
-          <w:p>
-            <w:pPr>
-              <w:spacing w:after="0"/>
-              <w:rPr>
-                <w:rFonts w:eastAsia="Times New Roman" w:cs="Arial"/>
-                <w:color w:val="000000"/>
-                <w:sz w:val="22"/>
-                <w:szCs w:val="22"/>
-              </w:rPr>
-            </w:pPr>
-            <w:r>
-              <w:rPr>
-                <w:rFonts w:eastAsia="Times New Roman" w:cs="Arial"/>
-                <w:color w:val="000000"/>
-                <w:sz w:val="22"/>
-                <w:szCs w:val="22"/>
-              </w:rPr>
-              <w:t>DFO</w:t>
-            </w:r>
-          </w:p>
-        </w:tc>
-        <w:tc>
-          <w:tcPr>
-            <w:tcW w:w="5500" w:type="dxa"/>
-            <w:tcBorders>
-              <w:top w:val="nil"/>
-              <w:left w:val="nil"/>
-              <w:bottom w:val="nil"/>
-              <w:right w:val="nil"/>
-            </w:tcBorders>
-            <w:shd w:val="clear" w:color="auto" w:fill="auto"/>
-            <w:vAlign w:val="center"/>
-            <w:hideMark/>
-          </w:tcPr>
-          <w:p>
-            <w:pPr>
-              <w:spacing w:after="0"/>
-              <w:rPr>
-                <w:rFonts w:eastAsia="Times New Roman" w:cs="Arial"/>
-                <w:color w:val="000000"/>
-                <w:sz w:val="22"/>
-                <w:szCs w:val="22"/>
-              </w:rPr>
-            </w:pPr>
-            <w:r>
-              <w:rPr>
-                <w:rFonts w:eastAsia="Times New Roman" w:cs="Arial"/>
-                <w:color w:val="000000"/>
-                <w:sz w:val="22"/>
-                <w:szCs w:val="22"/>
-              </w:rPr>
-              <w:t>Data field omission</w:t>
-            </w:r>
-          </w:p>
-        </w:tc>
-        <w:tc>
-          <w:tcPr>
-            <w:tcW w:w="2740" w:type="dxa"/>
-            <w:tcBorders>
-              <w:top w:val="nil"/>
-              <w:left w:val="nil"/>
-              <w:bottom w:val="nil"/>
-              <w:right w:val="nil"/>
-            </w:tcBorders>
-            <w:shd w:val="clear" w:color="auto" w:fill="auto"/>
-            <w:vAlign w:val="center"/>
-            <w:hideMark/>
-          </w:tcPr>
-          <w:p>
-            <w:pPr>
-              <w:spacing w:after="0"/>
-              <w:rPr>
-                <w:rFonts w:eastAsia="Times New Roman" w:cs="Arial"/>
-                <w:color w:val="000000"/>
-                <w:sz w:val="22"/>
-                <w:szCs w:val="22"/>
-              </w:rPr>
-            </w:pPr>
-            <w:r>
-              <w:rPr>
-                <w:rFonts w:eastAsia="Times New Roman" w:cs="Arial"/>
-                <w:color w:val="000000"/>
-                <w:sz w:val="22"/>
-                <w:szCs w:val="22"/>
-              </w:rPr>
-              <w:t>Use with caution in analysis</w:t>
-            </w:r>
-          </w:p>
-        </w:tc>
-      </w:tr>
-      <w:tr>
-        <w:trPr>
-          <w:trHeight w:val="780"/>
-        </w:trPr>
-        <w:tc>
-          <w:tcPr>
-            <w:tcW w:w="1600" w:type="dxa"/>
-            <w:tcBorders>
-              <w:top w:val="nil"/>
-              <w:left w:val="nil"/>
-              <w:bottom w:val="nil"/>
-              <w:right w:val="nil"/>
-            </w:tcBorders>
-            <w:shd w:val="clear" w:color="auto" w:fill="auto"/>
-            <w:vAlign w:val="center"/>
-            <w:hideMark/>
-          </w:tcPr>
-          <w:p>
-            <w:pPr>
-              <w:spacing w:after="0"/>
-              <w:rPr>
-                <w:rFonts w:eastAsia="Times New Roman" w:cs="Arial"/>
-                <w:color w:val="000000"/>
-                <w:sz w:val="22"/>
-                <w:szCs w:val="22"/>
-              </w:rPr>
-            </w:pPr>
-            <w:r>
-              <w:rPr>
-                <w:rFonts w:eastAsia="Times New Roman" w:cs="Arial"/>
-                <w:color w:val="000000"/>
-                <w:sz w:val="22"/>
-                <w:szCs w:val="22"/>
-              </w:rPr>
-              <w:t>ESBNA</w:t>
-            </w:r>
-          </w:p>
-        </w:tc>
-        <w:tc>
-          <w:tcPr>
-            <w:tcW w:w="5500" w:type="dxa"/>
-            <w:tcBorders>
-              <w:top w:val="nil"/>
-              <w:left w:val="nil"/>
-              <w:bottom w:val="nil"/>
-              <w:right w:val="nil"/>
-            </w:tcBorders>
-            <w:shd w:val="clear" w:color="auto" w:fill="auto"/>
-            <w:vAlign w:val="center"/>
-            <w:hideMark/>
-          </w:tcPr>
-          <w:p>
-            <w:pPr>
-              <w:spacing w:after="0"/>
-              <w:rPr>
-                <w:rFonts w:eastAsia="Times New Roman" w:cs="Arial"/>
-                <w:color w:val="000000"/>
-                <w:sz w:val="22"/>
-                <w:szCs w:val="22"/>
-              </w:rPr>
-            </w:pPr>
-            <w:r>
-              <w:rPr>
-                <w:rFonts w:eastAsia="Times New Roman" w:cs="Arial"/>
-                <w:color w:val="000000"/>
-                <w:sz w:val="22"/>
-                <w:szCs w:val="22"/>
-              </w:rPr>
-              <w:t xml:space="preserve">Event Summary Banded Number Not in Agreement with number of records for event in </w:t>
-            </w:r>
-            <w:proofErr w:type="spellStart"/>
-            <w:r>
-              <w:rPr>
-                <w:rFonts w:eastAsia="Times New Roman" w:cs="Arial"/>
-                <w:color w:val="000000"/>
-                <w:sz w:val="22"/>
-                <w:szCs w:val="22"/>
-              </w:rPr>
-              <w:t>tbl_SNPL_Banded</w:t>
-            </w:r>
-            <w:proofErr w:type="spellEnd"/>
-          </w:p>
-        </w:tc>
-        <w:tc>
-          <w:tcPr>
-            <w:tcW w:w="2740" w:type="dxa"/>
-            <w:tcBorders>
-              <w:top w:val="nil"/>
-              <w:left w:val="nil"/>
-              <w:bottom w:val="nil"/>
-              <w:right w:val="nil"/>
-            </w:tcBorders>
-            <w:shd w:val="clear" w:color="auto" w:fill="auto"/>
-            <w:vAlign w:val="center"/>
-            <w:hideMark/>
-          </w:tcPr>
-          <w:p>
-            <w:pPr>
-              <w:spacing w:after="0"/>
-              <w:rPr>
-                <w:rFonts w:eastAsia="Times New Roman" w:cs="Arial"/>
-                <w:color w:val="000000"/>
-                <w:sz w:val="22"/>
-                <w:szCs w:val="22"/>
-              </w:rPr>
-            </w:pPr>
-            <w:r>
-              <w:rPr>
-                <w:rFonts w:eastAsia="Times New Roman" w:cs="Arial"/>
-                <w:color w:val="000000"/>
-                <w:sz w:val="22"/>
-                <w:szCs w:val="22"/>
-              </w:rPr>
-              <w:t>Use with caution in analysis</w:t>
-            </w:r>
-          </w:p>
-        </w:tc>
-      </w:tr>
-      <w:tr>
-        <w:trPr>
-          <w:trHeight w:val="570"/>
-        </w:trPr>
-        <w:tc>
-          <w:tcPr>
-            <w:tcW w:w="1600" w:type="dxa"/>
-            <w:tcBorders>
-              <w:top w:val="nil"/>
-              <w:left w:val="nil"/>
-              <w:bottom w:val="nil"/>
-              <w:right w:val="nil"/>
-            </w:tcBorders>
-            <w:shd w:val="clear" w:color="auto" w:fill="auto"/>
-            <w:vAlign w:val="center"/>
-            <w:hideMark/>
-          </w:tcPr>
-          <w:p>
-            <w:pPr>
-              <w:spacing w:after="0"/>
-              <w:rPr>
-                <w:rFonts w:eastAsia="Times New Roman" w:cs="Arial"/>
-                <w:color w:val="000000"/>
-                <w:sz w:val="22"/>
-                <w:szCs w:val="22"/>
-              </w:rPr>
-            </w:pPr>
-            <w:r>
-              <w:rPr>
-                <w:rFonts w:eastAsia="Times New Roman" w:cs="Arial"/>
-                <w:color w:val="000000"/>
-                <w:sz w:val="22"/>
-                <w:szCs w:val="22"/>
-              </w:rPr>
-              <w:lastRenderedPageBreak/>
-              <w:t>LCAC</w:t>
-            </w:r>
-          </w:p>
-        </w:tc>
-        <w:tc>
-          <w:tcPr>
-            <w:tcW w:w="5500" w:type="dxa"/>
-            <w:tcBorders>
-              <w:top w:val="nil"/>
-              <w:left w:val="nil"/>
-              <w:bottom w:val="nil"/>
-              <w:right w:val="nil"/>
-            </w:tcBorders>
-            <w:shd w:val="clear" w:color="auto" w:fill="auto"/>
-            <w:vAlign w:val="center"/>
-            <w:hideMark/>
-          </w:tcPr>
-          <w:p>
-            <w:pPr>
-              <w:spacing w:after="0"/>
-              <w:rPr>
-                <w:rFonts w:eastAsia="Times New Roman" w:cs="Arial"/>
-                <w:color w:val="000000"/>
-                <w:sz w:val="22"/>
-                <w:szCs w:val="22"/>
-              </w:rPr>
-            </w:pPr>
-            <w:r>
-              <w:rPr>
-                <w:rFonts w:eastAsia="Times New Roman" w:cs="Arial"/>
-                <w:color w:val="000000"/>
-                <w:sz w:val="22"/>
-                <w:szCs w:val="22"/>
-              </w:rPr>
-              <w:t>Location code abbreviation changed</w:t>
-            </w:r>
-          </w:p>
-        </w:tc>
-        <w:tc>
-          <w:tcPr>
-            <w:tcW w:w="2740" w:type="dxa"/>
-            <w:tcBorders>
-              <w:top w:val="nil"/>
-              <w:left w:val="nil"/>
-              <w:bottom w:val="nil"/>
-              <w:right w:val="nil"/>
-            </w:tcBorders>
-            <w:shd w:val="clear" w:color="auto" w:fill="auto"/>
-            <w:vAlign w:val="center"/>
-            <w:hideMark/>
-          </w:tcPr>
-          <w:p>
-            <w:pPr>
-              <w:spacing w:after="0"/>
-              <w:rPr>
-                <w:rFonts w:eastAsia="Times New Roman" w:cs="Arial"/>
-                <w:color w:val="000000"/>
-                <w:sz w:val="22"/>
-                <w:szCs w:val="22"/>
-              </w:rPr>
-            </w:pPr>
-            <w:r>
-              <w:rPr>
-                <w:rFonts w:eastAsia="Times New Roman" w:cs="Arial"/>
-                <w:color w:val="000000"/>
-                <w:sz w:val="22"/>
-                <w:szCs w:val="22"/>
-              </w:rPr>
-              <w:t>No issues with use in analysis</w:t>
-            </w:r>
-          </w:p>
-        </w:tc>
-      </w:tr>
-      <w:tr>
-        <w:trPr>
-          <w:trHeight w:val="660"/>
-        </w:trPr>
-        <w:tc>
-          <w:tcPr>
-            <w:tcW w:w="1600" w:type="dxa"/>
-            <w:tcBorders>
-              <w:top w:val="nil"/>
-              <w:left w:val="nil"/>
-              <w:bottom w:val="nil"/>
-              <w:right w:val="nil"/>
-            </w:tcBorders>
-            <w:shd w:val="clear" w:color="auto" w:fill="auto"/>
-            <w:vAlign w:val="center"/>
-            <w:hideMark/>
-          </w:tcPr>
-          <w:p>
-            <w:pPr>
-              <w:spacing w:after="0"/>
-              <w:rPr>
-                <w:rFonts w:eastAsia="Times New Roman" w:cs="Arial"/>
-                <w:color w:val="000000"/>
-                <w:sz w:val="22"/>
-                <w:szCs w:val="22"/>
-              </w:rPr>
-            </w:pPr>
-            <w:r>
-              <w:rPr>
-                <w:rFonts w:eastAsia="Times New Roman" w:cs="Arial"/>
-                <w:color w:val="000000"/>
-                <w:sz w:val="22"/>
-                <w:szCs w:val="22"/>
-              </w:rPr>
-              <w:t>LCSBC</w:t>
-            </w:r>
-          </w:p>
-        </w:tc>
-        <w:tc>
-          <w:tcPr>
-            <w:tcW w:w="5500" w:type="dxa"/>
-            <w:tcBorders>
-              <w:top w:val="nil"/>
-              <w:left w:val="nil"/>
-              <w:bottom w:val="nil"/>
-              <w:right w:val="nil"/>
-            </w:tcBorders>
-            <w:shd w:val="clear" w:color="auto" w:fill="auto"/>
-            <w:vAlign w:val="center"/>
-            <w:hideMark/>
-          </w:tcPr>
-          <w:p>
-            <w:pPr>
-              <w:spacing w:after="0"/>
-              <w:rPr>
-                <w:rFonts w:eastAsia="Times New Roman" w:cs="Arial"/>
-                <w:color w:val="000000"/>
-                <w:sz w:val="22"/>
-                <w:szCs w:val="22"/>
-              </w:rPr>
-            </w:pPr>
-            <w:r>
-              <w:rPr>
-                <w:rFonts w:eastAsia="Times New Roman" w:cs="Arial"/>
-                <w:color w:val="000000"/>
-                <w:sz w:val="22"/>
-                <w:szCs w:val="22"/>
-              </w:rPr>
-              <w:t>Location coordinates set to beach centroid due to incorrect original data value</w:t>
-            </w:r>
-          </w:p>
-        </w:tc>
-        <w:tc>
-          <w:tcPr>
-            <w:tcW w:w="2740" w:type="dxa"/>
-            <w:tcBorders>
-              <w:top w:val="nil"/>
-              <w:left w:val="nil"/>
-              <w:bottom w:val="nil"/>
-              <w:right w:val="nil"/>
-            </w:tcBorders>
-            <w:shd w:val="clear" w:color="auto" w:fill="auto"/>
-            <w:vAlign w:val="center"/>
-            <w:hideMark/>
-          </w:tcPr>
-          <w:p>
-            <w:pPr>
-              <w:spacing w:after="0"/>
-              <w:rPr>
-                <w:rFonts w:eastAsia="Times New Roman" w:cs="Arial"/>
-                <w:color w:val="000000"/>
-                <w:sz w:val="22"/>
-                <w:szCs w:val="22"/>
-              </w:rPr>
-            </w:pPr>
-            <w:r>
-              <w:rPr>
-                <w:rFonts w:eastAsia="Times New Roman" w:cs="Arial"/>
-                <w:color w:val="000000"/>
-                <w:sz w:val="22"/>
-                <w:szCs w:val="22"/>
-              </w:rPr>
-              <w:t>Use with caution in a spatial analysis</w:t>
-            </w:r>
-          </w:p>
-        </w:tc>
-      </w:tr>
-      <w:tr>
-        <w:trPr>
-          <w:trHeight w:val="720"/>
-        </w:trPr>
-        <w:tc>
-          <w:tcPr>
-            <w:tcW w:w="1600" w:type="dxa"/>
-            <w:tcBorders>
-              <w:top w:val="nil"/>
-              <w:left w:val="nil"/>
-              <w:bottom w:val="nil"/>
-              <w:right w:val="nil"/>
-            </w:tcBorders>
-            <w:shd w:val="clear" w:color="auto" w:fill="auto"/>
-            <w:vAlign w:val="center"/>
-            <w:hideMark/>
-          </w:tcPr>
-          <w:p>
-            <w:pPr>
-              <w:spacing w:after="0"/>
-              <w:rPr>
-                <w:rFonts w:eastAsia="Times New Roman" w:cs="Arial"/>
-                <w:color w:val="000000"/>
-                <w:sz w:val="22"/>
-                <w:szCs w:val="22"/>
-              </w:rPr>
-            </w:pPr>
-            <w:r>
-              <w:rPr>
-                <w:rFonts w:eastAsia="Times New Roman" w:cs="Arial"/>
-                <w:color w:val="000000"/>
-                <w:sz w:val="22"/>
-                <w:szCs w:val="22"/>
-              </w:rPr>
-              <w:t>LEOT</w:t>
-            </w:r>
-          </w:p>
-        </w:tc>
-        <w:tc>
-          <w:tcPr>
-            <w:tcW w:w="5500" w:type="dxa"/>
-            <w:tcBorders>
-              <w:top w:val="nil"/>
-              <w:left w:val="nil"/>
-              <w:bottom w:val="nil"/>
-              <w:right w:val="nil"/>
-            </w:tcBorders>
-            <w:shd w:val="clear" w:color="auto" w:fill="auto"/>
-            <w:vAlign w:val="center"/>
-            <w:hideMark/>
-          </w:tcPr>
-          <w:p>
-            <w:pPr>
-              <w:spacing w:after="0"/>
-              <w:rPr>
-                <w:rFonts w:eastAsia="Times New Roman" w:cs="Arial"/>
-                <w:color w:val="000000"/>
-                <w:sz w:val="22"/>
-                <w:szCs w:val="22"/>
-              </w:rPr>
-            </w:pPr>
-            <w:r>
-              <w:rPr>
-                <w:rFonts w:eastAsia="Times New Roman" w:cs="Arial"/>
-                <w:color w:val="000000"/>
-                <w:sz w:val="22"/>
-                <w:szCs w:val="22"/>
-              </w:rPr>
-              <w:t>Logical Error Observation Time outside survey start or end time period.</w:t>
-            </w:r>
-          </w:p>
-        </w:tc>
-        <w:tc>
-          <w:tcPr>
-            <w:tcW w:w="2740" w:type="dxa"/>
-            <w:tcBorders>
-              <w:top w:val="nil"/>
-              <w:left w:val="nil"/>
-              <w:bottom w:val="nil"/>
-              <w:right w:val="nil"/>
-            </w:tcBorders>
-            <w:shd w:val="clear" w:color="auto" w:fill="auto"/>
-            <w:vAlign w:val="center"/>
-            <w:hideMark/>
-          </w:tcPr>
-          <w:p>
-            <w:pPr>
-              <w:spacing w:after="0"/>
-              <w:rPr>
-                <w:rFonts w:eastAsia="Times New Roman" w:cs="Arial"/>
-                <w:color w:val="000000"/>
-                <w:sz w:val="22"/>
-                <w:szCs w:val="22"/>
-              </w:rPr>
-            </w:pPr>
-            <w:r>
-              <w:rPr>
-                <w:rFonts w:eastAsia="Times New Roman" w:cs="Arial"/>
-                <w:color w:val="000000"/>
-                <w:sz w:val="22"/>
-                <w:szCs w:val="22"/>
-              </w:rPr>
-              <w:t>Use with caution in analysis</w:t>
-            </w:r>
-          </w:p>
-        </w:tc>
-      </w:tr>
-      <w:tr>
-        <w:trPr>
-          <w:trHeight w:val="675"/>
-        </w:trPr>
-        <w:tc>
-          <w:tcPr>
-            <w:tcW w:w="1600" w:type="dxa"/>
-            <w:tcBorders>
-              <w:top w:val="nil"/>
-              <w:left w:val="nil"/>
-              <w:bottom w:val="nil"/>
-              <w:right w:val="nil"/>
-            </w:tcBorders>
-            <w:shd w:val="clear" w:color="auto" w:fill="auto"/>
-            <w:vAlign w:val="center"/>
-            <w:hideMark/>
-          </w:tcPr>
-          <w:p>
-            <w:pPr>
-              <w:spacing w:after="0"/>
-              <w:rPr>
-                <w:rFonts w:eastAsia="Times New Roman" w:cs="Arial"/>
-                <w:color w:val="000000"/>
-                <w:sz w:val="22"/>
-                <w:szCs w:val="22"/>
-              </w:rPr>
-            </w:pPr>
-            <w:r>
-              <w:rPr>
-                <w:rFonts w:eastAsia="Times New Roman" w:cs="Arial"/>
-                <w:color w:val="000000"/>
-                <w:sz w:val="22"/>
-                <w:szCs w:val="22"/>
-              </w:rPr>
-              <w:t>LEPST</w:t>
-            </w:r>
-          </w:p>
-        </w:tc>
-        <w:tc>
-          <w:tcPr>
-            <w:tcW w:w="5500" w:type="dxa"/>
-            <w:tcBorders>
-              <w:top w:val="nil"/>
-              <w:left w:val="nil"/>
-              <w:bottom w:val="nil"/>
-              <w:right w:val="nil"/>
-            </w:tcBorders>
-            <w:shd w:val="clear" w:color="auto" w:fill="auto"/>
-            <w:vAlign w:val="center"/>
-            <w:hideMark/>
-          </w:tcPr>
-          <w:p>
-            <w:pPr>
-              <w:spacing w:after="0"/>
-              <w:rPr>
-                <w:rFonts w:eastAsia="Times New Roman" w:cs="Arial"/>
-                <w:color w:val="000000"/>
-                <w:sz w:val="22"/>
-                <w:szCs w:val="22"/>
-              </w:rPr>
-            </w:pPr>
-            <w:r>
-              <w:rPr>
-                <w:rFonts w:eastAsia="Times New Roman" w:cs="Arial"/>
-                <w:color w:val="000000"/>
-                <w:sz w:val="22"/>
-                <w:szCs w:val="22"/>
-              </w:rPr>
-              <w:t>Logical Error Predator Stop Time is more than the total survey time</w:t>
-            </w:r>
-          </w:p>
-        </w:tc>
-        <w:tc>
-          <w:tcPr>
-            <w:tcW w:w="2740" w:type="dxa"/>
-            <w:tcBorders>
-              <w:top w:val="nil"/>
-              <w:left w:val="nil"/>
-              <w:bottom w:val="nil"/>
-              <w:right w:val="nil"/>
-            </w:tcBorders>
-            <w:shd w:val="clear" w:color="auto" w:fill="auto"/>
-            <w:vAlign w:val="center"/>
-            <w:hideMark/>
-          </w:tcPr>
-          <w:p>
-            <w:pPr>
-              <w:spacing w:after="0"/>
-              <w:rPr>
-                <w:rFonts w:eastAsia="Times New Roman" w:cs="Arial"/>
-                <w:color w:val="000000"/>
-                <w:sz w:val="22"/>
-                <w:szCs w:val="22"/>
-              </w:rPr>
-            </w:pPr>
-            <w:r>
-              <w:rPr>
-                <w:rFonts w:eastAsia="Times New Roman" w:cs="Arial"/>
-                <w:color w:val="000000"/>
-                <w:sz w:val="22"/>
-                <w:szCs w:val="22"/>
-              </w:rPr>
-              <w:t>Use with caution in analysis</w:t>
-            </w:r>
-          </w:p>
-        </w:tc>
-      </w:tr>
-      <w:tr>
-        <w:trPr>
-          <w:trHeight w:val="585"/>
-        </w:trPr>
-        <w:tc>
-          <w:tcPr>
-            <w:tcW w:w="1600" w:type="dxa"/>
-            <w:tcBorders>
-              <w:top w:val="nil"/>
-              <w:left w:val="nil"/>
-              <w:bottom w:val="nil"/>
-              <w:right w:val="nil"/>
-            </w:tcBorders>
-            <w:shd w:val="clear" w:color="auto" w:fill="auto"/>
-            <w:vAlign w:val="center"/>
-            <w:hideMark/>
-          </w:tcPr>
-          <w:p>
-            <w:pPr>
-              <w:spacing w:after="0"/>
-              <w:rPr>
-                <w:rFonts w:eastAsia="Times New Roman" w:cs="Arial"/>
-                <w:color w:val="000000"/>
-                <w:sz w:val="22"/>
-                <w:szCs w:val="22"/>
-              </w:rPr>
-            </w:pPr>
-            <w:r>
-              <w:rPr>
-                <w:rFonts w:eastAsia="Times New Roman" w:cs="Arial"/>
-                <w:color w:val="000000"/>
-                <w:sz w:val="22"/>
-                <w:szCs w:val="22"/>
-              </w:rPr>
-              <w:t>LESPB</w:t>
-            </w:r>
-          </w:p>
-        </w:tc>
-        <w:tc>
-          <w:tcPr>
-            <w:tcW w:w="5500" w:type="dxa"/>
-            <w:tcBorders>
-              <w:top w:val="nil"/>
-              <w:left w:val="nil"/>
-              <w:bottom w:val="nil"/>
-              <w:right w:val="nil"/>
-            </w:tcBorders>
-            <w:shd w:val="clear" w:color="auto" w:fill="auto"/>
-            <w:vAlign w:val="center"/>
-            <w:hideMark/>
-          </w:tcPr>
-          <w:p>
-            <w:pPr>
-              <w:spacing w:after="0"/>
-              <w:rPr>
-                <w:rFonts w:eastAsia="Times New Roman" w:cs="Arial"/>
-                <w:color w:val="000000"/>
-                <w:sz w:val="22"/>
-                <w:szCs w:val="22"/>
-              </w:rPr>
-            </w:pPr>
-            <w:r>
-              <w:rPr>
-                <w:rFonts w:eastAsia="Times New Roman" w:cs="Arial"/>
-                <w:color w:val="000000"/>
-                <w:sz w:val="22"/>
-                <w:szCs w:val="22"/>
-              </w:rPr>
-              <w:t>Logical Error Snowy Plover Banded more than Total Snowy Plover</w:t>
-            </w:r>
-          </w:p>
-        </w:tc>
-        <w:tc>
-          <w:tcPr>
-            <w:tcW w:w="2740" w:type="dxa"/>
-            <w:tcBorders>
-              <w:top w:val="nil"/>
-              <w:left w:val="nil"/>
-              <w:bottom w:val="nil"/>
-              <w:right w:val="nil"/>
-            </w:tcBorders>
-            <w:shd w:val="clear" w:color="auto" w:fill="auto"/>
-            <w:vAlign w:val="center"/>
-            <w:hideMark/>
-          </w:tcPr>
-          <w:p>
-            <w:pPr>
-              <w:spacing w:after="0"/>
-              <w:rPr>
-                <w:rFonts w:eastAsia="Times New Roman" w:cs="Arial"/>
-                <w:color w:val="000000"/>
-                <w:sz w:val="22"/>
-                <w:szCs w:val="22"/>
-              </w:rPr>
-            </w:pPr>
-            <w:r>
-              <w:rPr>
-                <w:rFonts w:eastAsia="Times New Roman" w:cs="Arial"/>
-                <w:color w:val="000000"/>
-                <w:sz w:val="22"/>
-                <w:szCs w:val="22"/>
-              </w:rPr>
-              <w:t>Use with caution in analysis</w:t>
-            </w:r>
-          </w:p>
-        </w:tc>
-      </w:tr>
-      <w:tr>
-        <w:trPr>
-          <w:trHeight w:val="675"/>
-        </w:trPr>
-        <w:tc>
-          <w:tcPr>
-            <w:tcW w:w="1600" w:type="dxa"/>
-            <w:tcBorders>
-              <w:top w:val="nil"/>
-              <w:left w:val="nil"/>
-              <w:bottom w:val="nil"/>
-              <w:right w:val="nil"/>
-            </w:tcBorders>
-            <w:shd w:val="clear" w:color="auto" w:fill="auto"/>
-            <w:vAlign w:val="center"/>
-            <w:hideMark/>
-          </w:tcPr>
-          <w:p>
-            <w:pPr>
-              <w:spacing w:after="0"/>
-              <w:rPr>
-                <w:rFonts w:eastAsia="Times New Roman" w:cs="Arial"/>
-                <w:color w:val="000000"/>
-                <w:sz w:val="22"/>
-                <w:szCs w:val="22"/>
-              </w:rPr>
-            </w:pPr>
-            <w:r>
-              <w:rPr>
-                <w:rFonts w:eastAsia="Times New Roman" w:cs="Arial"/>
-                <w:color w:val="000000"/>
-                <w:sz w:val="22"/>
-                <w:szCs w:val="22"/>
-              </w:rPr>
-              <w:t>LESPC</w:t>
-            </w:r>
-          </w:p>
-        </w:tc>
-        <w:tc>
-          <w:tcPr>
-            <w:tcW w:w="5500" w:type="dxa"/>
-            <w:tcBorders>
-              <w:top w:val="nil"/>
-              <w:left w:val="nil"/>
-              <w:bottom w:val="nil"/>
-              <w:right w:val="nil"/>
-            </w:tcBorders>
-            <w:shd w:val="clear" w:color="auto" w:fill="auto"/>
-            <w:vAlign w:val="center"/>
-            <w:hideMark/>
-          </w:tcPr>
-          <w:p>
-            <w:pPr>
-              <w:spacing w:after="0"/>
-              <w:rPr>
-                <w:rFonts w:eastAsia="Times New Roman" w:cs="Arial"/>
-                <w:color w:val="000000"/>
-                <w:sz w:val="22"/>
-                <w:szCs w:val="22"/>
-              </w:rPr>
-            </w:pPr>
-            <w:r>
-              <w:rPr>
-                <w:rFonts w:eastAsia="Times New Roman" w:cs="Arial"/>
-                <w:color w:val="000000"/>
-                <w:sz w:val="22"/>
-                <w:szCs w:val="22"/>
-              </w:rPr>
-              <w:t>Logical Error Snowy Plover Checked more than Total Snowy Plover</w:t>
-            </w:r>
-          </w:p>
-        </w:tc>
-        <w:tc>
-          <w:tcPr>
-            <w:tcW w:w="2740" w:type="dxa"/>
-            <w:tcBorders>
-              <w:top w:val="nil"/>
-              <w:left w:val="nil"/>
-              <w:bottom w:val="nil"/>
-              <w:right w:val="nil"/>
-            </w:tcBorders>
-            <w:shd w:val="clear" w:color="auto" w:fill="auto"/>
-            <w:vAlign w:val="center"/>
-            <w:hideMark/>
-          </w:tcPr>
-          <w:p>
-            <w:pPr>
-              <w:spacing w:after="0"/>
-              <w:rPr>
-                <w:rFonts w:eastAsia="Times New Roman" w:cs="Arial"/>
-                <w:color w:val="000000"/>
-                <w:sz w:val="22"/>
-                <w:szCs w:val="22"/>
-              </w:rPr>
-            </w:pPr>
-            <w:r>
-              <w:rPr>
-                <w:rFonts w:eastAsia="Times New Roman" w:cs="Arial"/>
-                <w:color w:val="000000"/>
-                <w:sz w:val="22"/>
-                <w:szCs w:val="22"/>
-              </w:rPr>
-              <w:t>Use with caution in analysis</w:t>
-            </w:r>
-          </w:p>
-        </w:tc>
-      </w:tr>
-      <w:tr>
-        <w:trPr>
-          <w:trHeight w:val="615"/>
-        </w:trPr>
-        <w:tc>
-          <w:tcPr>
-            <w:tcW w:w="1600" w:type="dxa"/>
-            <w:tcBorders>
-              <w:top w:val="nil"/>
-              <w:left w:val="nil"/>
-              <w:bottom w:val="nil"/>
-              <w:right w:val="nil"/>
-            </w:tcBorders>
-            <w:shd w:val="clear" w:color="auto" w:fill="auto"/>
-            <w:vAlign w:val="center"/>
-            <w:hideMark/>
-          </w:tcPr>
-          <w:p>
-            <w:pPr>
-              <w:spacing w:after="0"/>
-              <w:rPr>
-                <w:rFonts w:eastAsia="Times New Roman" w:cs="Arial"/>
-                <w:color w:val="000000"/>
-                <w:sz w:val="22"/>
-                <w:szCs w:val="22"/>
-              </w:rPr>
-            </w:pPr>
-            <w:r>
-              <w:rPr>
-                <w:rFonts w:eastAsia="Times New Roman" w:cs="Arial"/>
-                <w:color w:val="000000"/>
-                <w:sz w:val="22"/>
-                <w:szCs w:val="22"/>
-              </w:rPr>
-              <w:t>NCD</w:t>
-            </w:r>
-          </w:p>
-        </w:tc>
-        <w:tc>
-          <w:tcPr>
-            <w:tcW w:w="5500" w:type="dxa"/>
-            <w:tcBorders>
-              <w:top w:val="nil"/>
-              <w:left w:val="nil"/>
-              <w:bottom w:val="nil"/>
-              <w:right w:val="nil"/>
-            </w:tcBorders>
-            <w:shd w:val="clear" w:color="auto" w:fill="auto"/>
-            <w:vAlign w:val="center"/>
-            <w:hideMark/>
-          </w:tcPr>
-          <w:p>
-            <w:pPr>
-              <w:spacing w:after="0"/>
-              <w:rPr>
-                <w:rFonts w:eastAsia="Times New Roman" w:cs="Arial"/>
-                <w:color w:val="000000"/>
-                <w:sz w:val="22"/>
-                <w:szCs w:val="22"/>
-              </w:rPr>
-            </w:pPr>
-            <w:r>
-              <w:rPr>
-                <w:rFonts w:eastAsia="Times New Roman" w:cs="Arial"/>
-                <w:color w:val="000000"/>
-                <w:sz w:val="22"/>
-                <w:szCs w:val="22"/>
-              </w:rPr>
-              <w:t>No Crew Defined</w:t>
-            </w:r>
-          </w:p>
-        </w:tc>
-        <w:tc>
-          <w:tcPr>
-            <w:tcW w:w="2740" w:type="dxa"/>
-            <w:tcBorders>
-              <w:top w:val="nil"/>
-              <w:left w:val="nil"/>
-              <w:bottom w:val="nil"/>
-              <w:right w:val="nil"/>
-            </w:tcBorders>
-            <w:shd w:val="clear" w:color="auto" w:fill="auto"/>
-            <w:vAlign w:val="center"/>
-            <w:hideMark/>
-          </w:tcPr>
-          <w:p>
-            <w:pPr>
-              <w:spacing w:after="0"/>
-              <w:rPr>
-                <w:rFonts w:eastAsia="Times New Roman" w:cs="Arial"/>
-                <w:color w:val="000000"/>
-                <w:sz w:val="22"/>
-                <w:szCs w:val="22"/>
-              </w:rPr>
-            </w:pPr>
-            <w:r>
-              <w:rPr>
-                <w:rFonts w:eastAsia="Times New Roman" w:cs="Arial"/>
-                <w:color w:val="000000"/>
-                <w:sz w:val="22"/>
-                <w:szCs w:val="22"/>
-              </w:rPr>
-              <w:t>No issues with use in analysis</w:t>
-            </w:r>
-          </w:p>
-        </w:tc>
-      </w:tr>
-      <w:tr>
-        <w:trPr>
-          <w:trHeight w:val="1095"/>
-        </w:trPr>
-        <w:tc>
-          <w:tcPr>
-            <w:tcW w:w="1600" w:type="dxa"/>
-            <w:tcBorders>
-              <w:top w:val="nil"/>
-              <w:left w:val="nil"/>
-              <w:bottom w:val="nil"/>
-              <w:right w:val="nil"/>
-            </w:tcBorders>
-            <w:shd w:val="clear" w:color="auto" w:fill="auto"/>
-            <w:vAlign w:val="center"/>
-            <w:hideMark/>
-          </w:tcPr>
-          <w:p>
-            <w:pPr>
-              <w:spacing w:after="0"/>
-              <w:rPr>
-                <w:rFonts w:eastAsia="Times New Roman" w:cs="Arial"/>
-                <w:color w:val="000000"/>
-                <w:sz w:val="22"/>
-                <w:szCs w:val="22"/>
-              </w:rPr>
-            </w:pPr>
-            <w:r>
-              <w:rPr>
-                <w:rFonts w:eastAsia="Times New Roman" w:cs="Arial"/>
-                <w:color w:val="000000"/>
-                <w:sz w:val="22"/>
-                <w:szCs w:val="22"/>
-              </w:rPr>
-              <w:t>NSBPLE</w:t>
-            </w:r>
-          </w:p>
-        </w:tc>
-        <w:tc>
-          <w:tcPr>
-            <w:tcW w:w="5500" w:type="dxa"/>
-            <w:tcBorders>
-              <w:top w:val="nil"/>
-              <w:left w:val="nil"/>
-              <w:bottom w:val="nil"/>
-              <w:right w:val="nil"/>
-            </w:tcBorders>
-            <w:shd w:val="clear" w:color="auto" w:fill="auto"/>
-            <w:vAlign w:val="center"/>
-            <w:hideMark/>
-          </w:tcPr>
-          <w:p>
-            <w:pPr>
-              <w:spacing w:after="0"/>
-              <w:rPr>
-                <w:rFonts w:eastAsia="Times New Roman" w:cs="Arial"/>
-                <w:color w:val="000000"/>
-                <w:sz w:val="22"/>
-                <w:szCs w:val="22"/>
-              </w:rPr>
-            </w:pPr>
-            <w:r>
-              <w:rPr>
-                <w:rFonts w:eastAsia="Times New Roman" w:cs="Arial"/>
-                <w:color w:val="000000"/>
-                <w:sz w:val="22"/>
-                <w:szCs w:val="22"/>
-              </w:rPr>
-              <w:t>Number of Summarized Banded Snowy Plovers Logical Error.  Summarized number of Bands Snowy Plovers is not the same as the tally of Banded observation records for the survey.</w:t>
-            </w:r>
-          </w:p>
-        </w:tc>
-        <w:tc>
-          <w:tcPr>
-            <w:tcW w:w="2740" w:type="dxa"/>
-            <w:tcBorders>
-              <w:top w:val="nil"/>
-              <w:left w:val="nil"/>
-              <w:bottom w:val="nil"/>
-              <w:right w:val="nil"/>
-            </w:tcBorders>
-            <w:shd w:val="clear" w:color="auto" w:fill="auto"/>
-            <w:vAlign w:val="center"/>
-            <w:hideMark/>
-          </w:tcPr>
-          <w:p>
-            <w:pPr>
-              <w:spacing w:after="0"/>
-              <w:rPr>
-                <w:rFonts w:eastAsia="Times New Roman" w:cs="Arial"/>
-                <w:color w:val="000000"/>
-                <w:sz w:val="22"/>
-                <w:szCs w:val="22"/>
-              </w:rPr>
-            </w:pPr>
-            <w:r>
-              <w:rPr>
-                <w:rFonts w:eastAsia="Times New Roman" w:cs="Arial"/>
-                <w:color w:val="000000"/>
-                <w:sz w:val="22"/>
-                <w:szCs w:val="22"/>
-              </w:rPr>
-              <w:t>Use with caution in analysis</w:t>
-            </w:r>
-          </w:p>
-        </w:tc>
-      </w:tr>
-      <w:tr>
-        <w:trPr>
-          <w:trHeight w:val="1080"/>
-        </w:trPr>
-        <w:tc>
-          <w:tcPr>
-            <w:tcW w:w="1600" w:type="dxa"/>
-            <w:tcBorders>
-              <w:top w:val="nil"/>
-              <w:left w:val="nil"/>
-              <w:bottom w:val="nil"/>
-              <w:right w:val="nil"/>
-            </w:tcBorders>
-            <w:shd w:val="clear" w:color="auto" w:fill="auto"/>
-            <w:vAlign w:val="center"/>
-            <w:hideMark/>
-          </w:tcPr>
-          <w:p>
-            <w:pPr>
-              <w:spacing w:after="0"/>
-              <w:rPr>
-                <w:rFonts w:eastAsia="Times New Roman" w:cs="Arial"/>
-                <w:color w:val="000000"/>
-                <w:sz w:val="22"/>
-                <w:szCs w:val="22"/>
-              </w:rPr>
-            </w:pPr>
-            <w:r>
-              <w:rPr>
-                <w:rFonts w:eastAsia="Times New Roman" w:cs="Arial"/>
-                <w:color w:val="000000"/>
-                <w:sz w:val="22"/>
-                <w:szCs w:val="22"/>
-              </w:rPr>
-              <w:t>NSPLE</w:t>
-            </w:r>
-          </w:p>
-        </w:tc>
-        <w:tc>
-          <w:tcPr>
-            <w:tcW w:w="5500" w:type="dxa"/>
-            <w:tcBorders>
-              <w:top w:val="nil"/>
-              <w:left w:val="nil"/>
-              <w:bottom w:val="nil"/>
-              <w:right w:val="nil"/>
-            </w:tcBorders>
-            <w:shd w:val="clear" w:color="auto" w:fill="auto"/>
-            <w:vAlign w:val="center"/>
-            <w:hideMark/>
-          </w:tcPr>
-          <w:p>
-            <w:pPr>
-              <w:spacing w:after="0"/>
-              <w:rPr>
-                <w:rFonts w:eastAsia="Times New Roman" w:cs="Arial"/>
-                <w:color w:val="000000"/>
-                <w:sz w:val="22"/>
-                <w:szCs w:val="22"/>
-              </w:rPr>
-            </w:pPr>
-            <w:r>
-              <w:rPr>
-                <w:rFonts w:eastAsia="Times New Roman" w:cs="Arial"/>
-                <w:color w:val="000000"/>
-                <w:sz w:val="22"/>
-                <w:szCs w:val="22"/>
-              </w:rPr>
-              <w:t>Number of Summarized Snowy Plovers Logical Error.  Summarized number of adults, hatchlings, or fledglings SNPL does not match the observed sum of adult (</w:t>
-            </w:r>
-            <w:proofErr w:type="spellStart"/>
-            <w:r>
-              <w:rPr>
-                <w:rFonts w:eastAsia="Times New Roman" w:cs="Arial"/>
-                <w:color w:val="000000"/>
-                <w:sz w:val="22"/>
-                <w:szCs w:val="22"/>
-              </w:rPr>
-              <w:t>Male+Female+Unk</w:t>
-            </w:r>
-            <w:proofErr w:type="spellEnd"/>
-            <w:r>
-              <w:rPr>
-                <w:rFonts w:eastAsia="Times New Roman" w:cs="Arial"/>
-                <w:color w:val="000000"/>
-                <w:sz w:val="22"/>
-                <w:szCs w:val="22"/>
-              </w:rPr>
-              <w:t>), hatchlings, or fledglings</w:t>
-            </w:r>
-          </w:p>
-        </w:tc>
-        <w:tc>
-          <w:tcPr>
-            <w:tcW w:w="2740" w:type="dxa"/>
-            <w:tcBorders>
-              <w:top w:val="nil"/>
-              <w:left w:val="nil"/>
-              <w:bottom w:val="nil"/>
-              <w:right w:val="nil"/>
-            </w:tcBorders>
-            <w:shd w:val="clear" w:color="auto" w:fill="auto"/>
-            <w:vAlign w:val="center"/>
-            <w:hideMark/>
-          </w:tcPr>
-          <w:p>
-            <w:pPr>
-              <w:spacing w:after="0"/>
-              <w:rPr>
-                <w:rFonts w:eastAsia="Times New Roman" w:cs="Arial"/>
-                <w:color w:val="000000"/>
-                <w:sz w:val="22"/>
-                <w:szCs w:val="22"/>
-              </w:rPr>
-            </w:pPr>
-            <w:r>
-              <w:rPr>
-                <w:rFonts w:eastAsia="Times New Roman" w:cs="Arial"/>
-                <w:color w:val="000000"/>
-                <w:sz w:val="22"/>
-                <w:szCs w:val="22"/>
-              </w:rPr>
-              <w:t>Use with caution in analysis</w:t>
-            </w:r>
-          </w:p>
-        </w:tc>
-      </w:tr>
-      <w:tr>
-        <w:trPr>
-          <w:trHeight w:val="705"/>
-        </w:trPr>
-        <w:tc>
-          <w:tcPr>
-            <w:tcW w:w="1600" w:type="dxa"/>
-            <w:tcBorders>
-              <w:top w:val="nil"/>
-              <w:left w:val="nil"/>
-              <w:bottom w:val="nil"/>
-              <w:right w:val="nil"/>
-            </w:tcBorders>
-            <w:shd w:val="clear" w:color="auto" w:fill="auto"/>
-            <w:vAlign w:val="center"/>
-            <w:hideMark/>
-          </w:tcPr>
-          <w:p>
-            <w:pPr>
-              <w:spacing w:after="0"/>
-              <w:rPr>
-                <w:rFonts w:eastAsia="Times New Roman" w:cs="Arial"/>
-                <w:color w:val="000000"/>
-                <w:sz w:val="22"/>
-                <w:szCs w:val="22"/>
-              </w:rPr>
-            </w:pPr>
-            <w:r>
-              <w:rPr>
-                <w:rFonts w:eastAsia="Times New Roman" w:cs="Arial"/>
-                <w:color w:val="000000"/>
-                <w:sz w:val="22"/>
-                <w:szCs w:val="22"/>
-              </w:rPr>
-              <w:t>ODEC</w:t>
-            </w:r>
-          </w:p>
-        </w:tc>
-        <w:tc>
-          <w:tcPr>
-            <w:tcW w:w="5500" w:type="dxa"/>
-            <w:tcBorders>
-              <w:top w:val="nil"/>
-              <w:left w:val="nil"/>
-              <w:bottom w:val="nil"/>
-              <w:right w:val="nil"/>
-            </w:tcBorders>
-            <w:shd w:val="clear" w:color="auto" w:fill="auto"/>
-            <w:vAlign w:val="center"/>
-            <w:hideMark/>
-          </w:tcPr>
-          <w:p>
-            <w:pPr>
-              <w:spacing w:after="0"/>
-              <w:rPr>
-                <w:rFonts w:eastAsia="Times New Roman" w:cs="Arial"/>
-                <w:color w:val="000000"/>
-                <w:sz w:val="22"/>
-                <w:szCs w:val="22"/>
-              </w:rPr>
-            </w:pPr>
-            <w:r>
-              <w:rPr>
-                <w:rFonts w:eastAsia="Times New Roman" w:cs="Arial"/>
-                <w:color w:val="000000"/>
-                <w:sz w:val="22"/>
-                <w:szCs w:val="22"/>
-              </w:rPr>
-              <w:t>Original data entry value corrected during data review</w:t>
-            </w:r>
-          </w:p>
-        </w:tc>
-        <w:tc>
-          <w:tcPr>
-            <w:tcW w:w="2740" w:type="dxa"/>
-            <w:tcBorders>
-              <w:top w:val="nil"/>
-              <w:left w:val="nil"/>
-              <w:bottom w:val="nil"/>
-              <w:right w:val="nil"/>
-            </w:tcBorders>
-            <w:shd w:val="clear" w:color="auto" w:fill="auto"/>
-            <w:vAlign w:val="center"/>
-            <w:hideMark/>
-          </w:tcPr>
-          <w:p>
-            <w:pPr>
-              <w:spacing w:after="0"/>
-              <w:rPr>
-                <w:rFonts w:eastAsia="Times New Roman" w:cs="Arial"/>
-                <w:color w:val="000000"/>
-                <w:sz w:val="22"/>
-                <w:szCs w:val="22"/>
-              </w:rPr>
-            </w:pPr>
-            <w:r>
-              <w:rPr>
-                <w:rFonts w:eastAsia="Times New Roman" w:cs="Arial"/>
-                <w:color w:val="000000"/>
-                <w:sz w:val="22"/>
-                <w:szCs w:val="22"/>
-              </w:rPr>
-              <w:t>No issues with use in analysis</w:t>
-            </w:r>
-          </w:p>
-        </w:tc>
-      </w:tr>
-      <w:tr>
-        <w:trPr>
-          <w:trHeight w:val="660"/>
-        </w:trPr>
-        <w:tc>
-          <w:tcPr>
-            <w:tcW w:w="1600" w:type="dxa"/>
-            <w:tcBorders>
-              <w:top w:val="nil"/>
-              <w:left w:val="nil"/>
-              <w:bottom w:val="nil"/>
-              <w:right w:val="nil"/>
-            </w:tcBorders>
-            <w:shd w:val="clear" w:color="auto" w:fill="auto"/>
-            <w:vAlign w:val="center"/>
-            <w:hideMark/>
-          </w:tcPr>
-          <w:p>
-            <w:pPr>
-              <w:spacing w:after="0"/>
-              <w:rPr>
-                <w:rFonts w:eastAsia="Times New Roman" w:cs="Arial"/>
-                <w:color w:val="000000"/>
-                <w:sz w:val="22"/>
-                <w:szCs w:val="22"/>
-              </w:rPr>
-            </w:pPr>
-            <w:r>
-              <w:rPr>
-                <w:rFonts w:eastAsia="Times New Roman" w:cs="Arial"/>
-                <w:color w:val="000000"/>
-                <w:sz w:val="22"/>
-                <w:szCs w:val="22"/>
-              </w:rPr>
-              <w:t>ODEU</w:t>
-            </w:r>
-          </w:p>
-        </w:tc>
-        <w:tc>
-          <w:tcPr>
-            <w:tcW w:w="5500" w:type="dxa"/>
-            <w:tcBorders>
-              <w:top w:val="nil"/>
-              <w:left w:val="nil"/>
-              <w:bottom w:val="nil"/>
-              <w:right w:val="nil"/>
-            </w:tcBorders>
-            <w:shd w:val="clear" w:color="auto" w:fill="auto"/>
-            <w:vAlign w:val="center"/>
-            <w:hideMark/>
-          </w:tcPr>
-          <w:p>
-            <w:pPr>
-              <w:spacing w:after="0"/>
-              <w:rPr>
-                <w:rFonts w:eastAsia="Times New Roman" w:cs="Arial"/>
-                <w:color w:val="000000"/>
-                <w:sz w:val="22"/>
-                <w:szCs w:val="22"/>
-              </w:rPr>
-            </w:pPr>
-            <w:r>
-              <w:rPr>
-                <w:rFonts w:eastAsia="Times New Roman" w:cs="Arial"/>
-                <w:color w:val="000000"/>
-                <w:sz w:val="22"/>
-                <w:szCs w:val="22"/>
-              </w:rPr>
-              <w:t>Original data entry value updated</w:t>
-            </w:r>
-          </w:p>
-        </w:tc>
-        <w:tc>
-          <w:tcPr>
-            <w:tcW w:w="2740" w:type="dxa"/>
-            <w:tcBorders>
-              <w:top w:val="nil"/>
-              <w:left w:val="nil"/>
-              <w:bottom w:val="nil"/>
-              <w:right w:val="nil"/>
-            </w:tcBorders>
-            <w:shd w:val="clear" w:color="auto" w:fill="auto"/>
-            <w:vAlign w:val="center"/>
-            <w:hideMark/>
-          </w:tcPr>
-          <w:p>
-            <w:pPr>
-              <w:spacing w:after="0"/>
-              <w:rPr>
-                <w:rFonts w:eastAsia="Times New Roman" w:cs="Arial"/>
-                <w:color w:val="000000"/>
-                <w:sz w:val="22"/>
-                <w:szCs w:val="22"/>
-              </w:rPr>
-            </w:pPr>
-            <w:r>
-              <w:rPr>
-                <w:rFonts w:eastAsia="Times New Roman" w:cs="Arial"/>
-                <w:color w:val="000000"/>
-                <w:sz w:val="22"/>
-                <w:szCs w:val="22"/>
-              </w:rPr>
-              <w:t>No issues with use in analysis</w:t>
-            </w:r>
-          </w:p>
-        </w:tc>
-      </w:tr>
-      <w:tr>
-        <w:trPr>
-          <w:trHeight w:val="1080"/>
-        </w:trPr>
-        <w:tc>
-          <w:tcPr>
-            <w:tcW w:w="1600" w:type="dxa"/>
-            <w:tcBorders>
-              <w:top w:val="nil"/>
-              <w:left w:val="nil"/>
-              <w:bottom w:val="nil"/>
-              <w:right w:val="nil"/>
-            </w:tcBorders>
-            <w:shd w:val="clear" w:color="auto" w:fill="auto"/>
-            <w:vAlign w:val="center"/>
-            <w:hideMark/>
-          </w:tcPr>
-          <w:p>
-            <w:pPr>
-              <w:spacing w:after="0"/>
-              <w:rPr>
-                <w:rFonts w:eastAsia="Times New Roman" w:cs="Arial"/>
-                <w:color w:val="000000"/>
-                <w:sz w:val="22"/>
-                <w:szCs w:val="22"/>
-              </w:rPr>
-            </w:pPr>
-            <w:r>
-              <w:rPr>
-                <w:rFonts w:eastAsia="Times New Roman" w:cs="Arial"/>
-                <w:color w:val="000000"/>
-                <w:sz w:val="22"/>
-                <w:szCs w:val="22"/>
-              </w:rPr>
-              <w:t>ONBLE</w:t>
-            </w:r>
-          </w:p>
-        </w:tc>
-        <w:tc>
-          <w:tcPr>
-            <w:tcW w:w="5500" w:type="dxa"/>
-            <w:tcBorders>
-              <w:top w:val="nil"/>
-              <w:left w:val="nil"/>
-              <w:bottom w:val="nil"/>
-              <w:right w:val="nil"/>
-            </w:tcBorders>
-            <w:shd w:val="clear" w:color="auto" w:fill="auto"/>
-            <w:vAlign w:val="center"/>
-            <w:hideMark/>
-          </w:tcPr>
-          <w:p>
-            <w:pPr>
-              <w:spacing w:after="0"/>
-              <w:rPr>
-                <w:rFonts w:eastAsia="Times New Roman" w:cs="Arial"/>
-                <w:color w:val="000000"/>
-                <w:sz w:val="22"/>
-                <w:szCs w:val="22"/>
-              </w:rPr>
-            </w:pPr>
-            <w:r>
-              <w:rPr>
-                <w:rFonts w:eastAsia="Times New Roman" w:cs="Arial"/>
-                <w:color w:val="000000"/>
-                <w:sz w:val="22"/>
-                <w:szCs w:val="22"/>
-              </w:rPr>
-              <w:t xml:space="preserve">Observation Number Banded Logical Error. Observation has banded data and summary field </w:t>
-            </w:r>
-            <w:proofErr w:type="spellStart"/>
-            <w:r>
-              <w:rPr>
-                <w:rFonts w:eastAsia="Times New Roman" w:cs="Arial"/>
-                <w:color w:val="000000"/>
-                <w:sz w:val="22"/>
-                <w:szCs w:val="22"/>
-              </w:rPr>
-              <w:t>SNPL_Banded</w:t>
-            </w:r>
-            <w:proofErr w:type="spellEnd"/>
-            <w:r>
-              <w:rPr>
-                <w:rFonts w:eastAsia="Times New Roman" w:cs="Arial"/>
-                <w:color w:val="000000"/>
-                <w:sz w:val="22"/>
-                <w:szCs w:val="22"/>
-              </w:rPr>
-              <w:t xml:space="preserve"> in observations is 0 or null. </w:t>
-            </w:r>
-          </w:p>
-        </w:tc>
-        <w:tc>
-          <w:tcPr>
-            <w:tcW w:w="2740" w:type="dxa"/>
-            <w:tcBorders>
-              <w:top w:val="nil"/>
-              <w:left w:val="nil"/>
-              <w:bottom w:val="nil"/>
-              <w:right w:val="nil"/>
-            </w:tcBorders>
-            <w:shd w:val="clear" w:color="auto" w:fill="auto"/>
-            <w:vAlign w:val="center"/>
-            <w:hideMark/>
-          </w:tcPr>
-          <w:p>
-            <w:pPr>
-              <w:spacing w:after="0"/>
-              <w:rPr>
-                <w:rFonts w:eastAsia="Times New Roman" w:cs="Arial"/>
-                <w:color w:val="000000"/>
-                <w:sz w:val="22"/>
-                <w:szCs w:val="22"/>
-              </w:rPr>
-            </w:pPr>
-            <w:r>
-              <w:rPr>
-                <w:rFonts w:eastAsia="Times New Roman" w:cs="Arial"/>
-                <w:color w:val="000000"/>
-                <w:sz w:val="22"/>
-                <w:szCs w:val="22"/>
-              </w:rPr>
-              <w:t>Use with caution in analysis</w:t>
-            </w:r>
-          </w:p>
-        </w:tc>
-      </w:tr>
-      <w:tr>
-        <w:trPr>
-          <w:trHeight w:val="1080"/>
-        </w:trPr>
-        <w:tc>
-          <w:tcPr>
-            <w:tcW w:w="1600" w:type="dxa"/>
-            <w:tcBorders>
-              <w:top w:val="nil"/>
-              <w:left w:val="nil"/>
-              <w:bottom w:val="nil"/>
-              <w:right w:val="nil"/>
-            </w:tcBorders>
-            <w:shd w:val="clear" w:color="auto" w:fill="auto"/>
-            <w:vAlign w:val="center"/>
-            <w:hideMark/>
-          </w:tcPr>
-          <w:p>
-            <w:pPr>
-              <w:spacing w:after="0"/>
-              <w:rPr>
-                <w:rFonts w:eastAsia="Times New Roman" w:cs="Arial"/>
-                <w:color w:val="000000"/>
-                <w:sz w:val="22"/>
-                <w:szCs w:val="22"/>
-              </w:rPr>
-            </w:pPr>
-            <w:r>
-              <w:rPr>
-                <w:rFonts w:eastAsia="Times New Roman" w:cs="Arial"/>
-                <w:color w:val="000000"/>
-                <w:sz w:val="22"/>
-                <w:szCs w:val="22"/>
-              </w:rPr>
-              <w:t>ONBM</w:t>
-            </w:r>
-          </w:p>
-        </w:tc>
-        <w:tc>
-          <w:tcPr>
-            <w:tcW w:w="5500" w:type="dxa"/>
-            <w:tcBorders>
-              <w:top w:val="nil"/>
-              <w:left w:val="nil"/>
-              <w:bottom w:val="nil"/>
-              <w:right w:val="nil"/>
-            </w:tcBorders>
-            <w:shd w:val="clear" w:color="auto" w:fill="auto"/>
-            <w:vAlign w:val="center"/>
-            <w:hideMark/>
-          </w:tcPr>
-          <w:p>
-            <w:pPr>
-              <w:spacing w:after="0"/>
-              <w:rPr>
-                <w:rFonts w:eastAsia="Times New Roman" w:cs="Arial"/>
-                <w:color w:val="000000"/>
-                <w:sz w:val="22"/>
-                <w:szCs w:val="22"/>
-              </w:rPr>
-            </w:pPr>
-            <w:r>
-              <w:rPr>
-                <w:rFonts w:eastAsia="Times New Roman" w:cs="Arial"/>
-                <w:color w:val="000000"/>
-                <w:sz w:val="22"/>
-                <w:szCs w:val="22"/>
-              </w:rPr>
-              <w:t xml:space="preserve">Observation Number Banded in plover observation </w:t>
-            </w:r>
-            <w:proofErr w:type="spellStart"/>
-            <w:r>
-              <w:rPr>
-                <w:rFonts w:eastAsia="Times New Roman" w:cs="Arial"/>
-                <w:color w:val="000000"/>
-                <w:sz w:val="22"/>
-                <w:szCs w:val="22"/>
-              </w:rPr>
-              <w:t>SNPL_Bands</w:t>
-            </w:r>
-            <w:proofErr w:type="spellEnd"/>
-            <w:r>
-              <w:rPr>
-                <w:rFonts w:eastAsia="Times New Roman" w:cs="Arial"/>
-                <w:color w:val="000000"/>
-                <w:sz w:val="22"/>
-                <w:szCs w:val="22"/>
-              </w:rPr>
-              <w:t xml:space="preserve"> fields does not Match the number of records in </w:t>
-            </w:r>
-            <w:proofErr w:type="spellStart"/>
-            <w:r>
-              <w:rPr>
-                <w:rFonts w:eastAsia="Times New Roman" w:cs="Arial"/>
-                <w:color w:val="000000"/>
-                <w:sz w:val="22"/>
-                <w:szCs w:val="22"/>
-              </w:rPr>
-              <w:t>tbl_SNPLBanded</w:t>
-            </w:r>
-            <w:proofErr w:type="spellEnd"/>
-            <w:r>
-              <w:rPr>
-                <w:rFonts w:eastAsia="Times New Roman" w:cs="Arial"/>
-                <w:color w:val="000000"/>
-                <w:sz w:val="22"/>
-                <w:szCs w:val="22"/>
-              </w:rPr>
-              <w:t xml:space="preserve"> for the survey data and time.</w:t>
-            </w:r>
-          </w:p>
-        </w:tc>
-        <w:tc>
-          <w:tcPr>
-            <w:tcW w:w="2740" w:type="dxa"/>
-            <w:tcBorders>
-              <w:top w:val="nil"/>
-              <w:left w:val="nil"/>
-              <w:bottom w:val="nil"/>
-              <w:right w:val="nil"/>
-            </w:tcBorders>
-            <w:shd w:val="clear" w:color="auto" w:fill="auto"/>
-            <w:vAlign w:val="center"/>
-            <w:hideMark/>
-          </w:tcPr>
-          <w:p>
-            <w:pPr>
-              <w:spacing w:after="0"/>
-              <w:rPr>
-                <w:rFonts w:eastAsia="Times New Roman" w:cs="Arial"/>
-                <w:color w:val="000000"/>
-                <w:sz w:val="22"/>
-                <w:szCs w:val="22"/>
-              </w:rPr>
-            </w:pPr>
-            <w:r>
-              <w:rPr>
-                <w:rFonts w:eastAsia="Times New Roman" w:cs="Arial"/>
-                <w:color w:val="000000"/>
-                <w:sz w:val="22"/>
-                <w:szCs w:val="22"/>
-              </w:rPr>
-              <w:t>Use with caution in analysis</w:t>
-            </w:r>
-          </w:p>
-        </w:tc>
-      </w:tr>
-      <w:tr>
-        <w:trPr>
-          <w:trHeight w:val="615"/>
-        </w:trPr>
-        <w:tc>
-          <w:tcPr>
-            <w:tcW w:w="1600" w:type="dxa"/>
-            <w:tcBorders>
-              <w:top w:val="nil"/>
-              <w:left w:val="nil"/>
-              <w:bottom w:val="nil"/>
-              <w:right w:val="nil"/>
-            </w:tcBorders>
-            <w:shd w:val="clear" w:color="auto" w:fill="auto"/>
-            <w:vAlign w:val="center"/>
-            <w:hideMark/>
-          </w:tcPr>
-          <w:p>
-            <w:pPr>
-              <w:spacing w:after="0"/>
-              <w:rPr>
-                <w:rFonts w:eastAsia="Times New Roman" w:cs="Arial"/>
-                <w:color w:val="000000"/>
-                <w:sz w:val="22"/>
-                <w:szCs w:val="22"/>
-              </w:rPr>
-            </w:pPr>
-            <w:r>
-              <w:rPr>
-                <w:rFonts w:eastAsia="Times New Roman" w:cs="Arial"/>
-                <w:color w:val="000000"/>
-                <w:sz w:val="22"/>
-                <w:szCs w:val="22"/>
-              </w:rPr>
-              <w:t>OUC</w:t>
-            </w:r>
-          </w:p>
-        </w:tc>
-        <w:tc>
-          <w:tcPr>
-            <w:tcW w:w="5500" w:type="dxa"/>
-            <w:tcBorders>
-              <w:top w:val="nil"/>
-              <w:left w:val="nil"/>
-              <w:bottom w:val="nil"/>
-              <w:right w:val="nil"/>
-            </w:tcBorders>
-            <w:shd w:val="clear" w:color="auto" w:fill="auto"/>
-            <w:vAlign w:val="center"/>
-            <w:hideMark/>
-          </w:tcPr>
-          <w:p>
-            <w:pPr>
-              <w:spacing w:after="0"/>
-              <w:rPr>
-                <w:rFonts w:eastAsia="Times New Roman" w:cs="Arial"/>
-                <w:color w:val="000000"/>
-                <w:sz w:val="22"/>
-                <w:szCs w:val="22"/>
-              </w:rPr>
-            </w:pPr>
-            <w:r>
-              <w:rPr>
-                <w:rFonts w:eastAsia="Times New Roman" w:cs="Arial"/>
-                <w:color w:val="000000"/>
-                <w:sz w:val="22"/>
-                <w:szCs w:val="22"/>
-              </w:rPr>
-              <w:t>Observation value not certain</w:t>
-            </w:r>
-          </w:p>
-        </w:tc>
-        <w:tc>
-          <w:tcPr>
-            <w:tcW w:w="2740" w:type="dxa"/>
-            <w:tcBorders>
-              <w:top w:val="nil"/>
-              <w:left w:val="nil"/>
-              <w:bottom w:val="nil"/>
-              <w:right w:val="nil"/>
-            </w:tcBorders>
-            <w:shd w:val="clear" w:color="auto" w:fill="auto"/>
-            <w:vAlign w:val="center"/>
-            <w:hideMark/>
-          </w:tcPr>
-          <w:p>
-            <w:pPr>
-              <w:spacing w:after="0"/>
-              <w:rPr>
-                <w:rFonts w:eastAsia="Times New Roman" w:cs="Arial"/>
-                <w:color w:val="000000"/>
-                <w:sz w:val="22"/>
-                <w:szCs w:val="22"/>
-              </w:rPr>
-            </w:pPr>
-            <w:r>
-              <w:rPr>
-                <w:rFonts w:eastAsia="Times New Roman" w:cs="Arial"/>
-                <w:color w:val="000000"/>
-                <w:sz w:val="22"/>
-                <w:szCs w:val="22"/>
-              </w:rPr>
-              <w:t>Use with caution in analysis</w:t>
-            </w:r>
-          </w:p>
-        </w:tc>
-      </w:tr>
-      <w:tr>
-        <w:trPr>
-          <w:trHeight w:val="570"/>
-        </w:trPr>
-        <w:tc>
-          <w:tcPr>
-            <w:tcW w:w="1600" w:type="dxa"/>
-            <w:tcBorders>
-              <w:top w:val="nil"/>
-              <w:left w:val="nil"/>
-              <w:bottom w:val="nil"/>
-              <w:right w:val="nil"/>
-            </w:tcBorders>
-            <w:shd w:val="clear" w:color="auto" w:fill="auto"/>
-            <w:vAlign w:val="center"/>
-            <w:hideMark/>
-          </w:tcPr>
-          <w:p>
-            <w:pPr>
-              <w:spacing w:after="0"/>
-              <w:rPr>
-                <w:rFonts w:eastAsia="Times New Roman" w:cs="Arial"/>
-                <w:color w:val="000000"/>
-                <w:sz w:val="22"/>
-                <w:szCs w:val="22"/>
-              </w:rPr>
-            </w:pPr>
-            <w:r>
-              <w:rPr>
-                <w:rFonts w:eastAsia="Times New Roman" w:cs="Arial"/>
-                <w:color w:val="000000"/>
-                <w:sz w:val="22"/>
-                <w:szCs w:val="22"/>
-              </w:rPr>
-              <w:t>RICNC</w:t>
-            </w:r>
-          </w:p>
-        </w:tc>
-        <w:tc>
-          <w:tcPr>
-            <w:tcW w:w="5500" w:type="dxa"/>
-            <w:tcBorders>
-              <w:top w:val="nil"/>
-              <w:left w:val="nil"/>
-              <w:bottom w:val="nil"/>
-              <w:right w:val="nil"/>
-            </w:tcBorders>
-            <w:shd w:val="clear" w:color="auto" w:fill="auto"/>
-            <w:vAlign w:val="center"/>
-            <w:hideMark/>
-          </w:tcPr>
-          <w:p>
-            <w:pPr>
-              <w:spacing w:after="0"/>
-              <w:rPr>
-                <w:rFonts w:eastAsia="Times New Roman" w:cs="Arial"/>
-                <w:color w:val="000000"/>
-                <w:sz w:val="22"/>
-                <w:szCs w:val="22"/>
-              </w:rPr>
-            </w:pPr>
-            <w:r>
-              <w:rPr>
-                <w:rFonts w:eastAsia="Times New Roman" w:cs="Arial"/>
-                <w:color w:val="000000"/>
-                <w:sz w:val="22"/>
-                <w:szCs w:val="22"/>
-              </w:rPr>
-              <w:t>Record imported from chick nest check table '</w:t>
-            </w:r>
-            <w:proofErr w:type="spellStart"/>
-            <w:r>
-              <w:rPr>
-                <w:rFonts w:eastAsia="Times New Roman" w:cs="Arial"/>
-                <w:color w:val="000000"/>
-                <w:sz w:val="22"/>
-                <w:szCs w:val="22"/>
-              </w:rPr>
-              <w:t>tbl_Nest_Checks_Legacy</w:t>
-            </w:r>
-            <w:proofErr w:type="spellEnd"/>
-            <w:r>
-              <w:rPr>
-                <w:rFonts w:eastAsia="Times New Roman" w:cs="Arial"/>
-                <w:color w:val="000000"/>
-                <w:sz w:val="22"/>
-                <w:szCs w:val="22"/>
-              </w:rPr>
-              <w:t>'</w:t>
-            </w:r>
-          </w:p>
-        </w:tc>
-        <w:tc>
-          <w:tcPr>
-            <w:tcW w:w="2740" w:type="dxa"/>
-            <w:tcBorders>
-              <w:top w:val="nil"/>
-              <w:left w:val="nil"/>
-              <w:bottom w:val="nil"/>
-              <w:right w:val="nil"/>
-            </w:tcBorders>
-            <w:shd w:val="clear" w:color="auto" w:fill="auto"/>
-            <w:vAlign w:val="center"/>
-            <w:hideMark/>
-          </w:tcPr>
-          <w:p>
-            <w:pPr>
-              <w:spacing w:after="0"/>
-              <w:rPr>
-                <w:rFonts w:eastAsia="Times New Roman" w:cs="Arial"/>
-                <w:color w:val="000000"/>
-                <w:sz w:val="22"/>
-                <w:szCs w:val="22"/>
-              </w:rPr>
-            </w:pPr>
-            <w:r>
-              <w:rPr>
-                <w:rFonts w:eastAsia="Times New Roman" w:cs="Arial"/>
-                <w:color w:val="000000"/>
-                <w:sz w:val="22"/>
-                <w:szCs w:val="22"/>
-              </w:rPr>
-              <w:t>No issues with use in analysis</w:t>
-            </w:r>
-          </w:p>
-        </w:tc>
-      </w:tr>
-      <w:tr>
-        <w:trPr>
-          <w:trHeight w:val="630"/>
-        </w:trPr>
-        <w:tc>
-          <w:tcPr>
-            <w:tcW w:w="1600" w:type="dxa"/>
-            <w:tcBorders>
-              <w:top w:val="nil"/>
-              <w:left w:val="nil"/>
-              <w:bottom w:val="nil"/>
-              <w:right w:val="nil"/>
-            </w:tcBorders>
-            <w:shd w:val="clear" w:color="auto" w:fill="auto"/>
-            <w:vAlign w:val="center"/>
-            <w:hideMark/>
-          </w:tcPr>
-          <w:p>
-            <w:pPr>
-              <w:spacing w:after="0"/>
-              <w:rPr>
-                <w:rFonts w:eastAsia="Times New Roman" w:cs="Arial"/>
-                <w:color w:val="000000"/>
-                <w:sz w:val="22"/>
-                <w:szCs w:val="22"/>
-              </w:rPr>
-            </w:pPr>
-            <w:r>
-              <w:rPr>
-                <w:rFonts w:eastAsia="Times New Roman" w:cs="Arial"/>
-                <w:color w:val="000000"/>
-                <w:sz w:val="22"/>
-                <w:szCs w:val="22"/>
-              </w:rPr>
-              <w:t>SNBO</w:t>
-            </w:r>
-          </w:p>
-        </w:tc>
-        <w:tc>
-          <w:tcPr>
-            <w:tcW w:w="5500" w:type="dxa"/>
-            <w:tcBorders>
-              <w:top w:val="nil"/>
-              <w:left w:val="nil"/>
-              <w:bottom w:val="nil"/>
-              <w:right w:val="nil"/>
-            </w:tcBorders>
-            <w:shd w:val="clear" w:color="auto" w:fill="auto"/>
-            <w:vAlign w:val="center"/>
-            <w:hideMark/>
-          </w:tcPr>
-          <w:p>
-            <w:pPr>
-              <w:spacing w:after="0"/>
-              <w:rPr>
-                <w:rFonts w:eastAsia="Times New Roman" w:cs="Arial"/>
-                <w:color w:val="000000"/>
-                <w:sz w:val="22"/>
-                <w:szCs w:val="22"/>
-              </w:rPr>
-            </w:pPr>
-            <w:r>
-              <w:rPr>
-                <w:rFonts w:eastAsia="Times New Roman" w:cs="Arial"/>
-                <w:color w:val="000000"/>
-                <w:sz w:val="22"/>
-                <w:szCs w:val="22"/>
-              </w:rPr>
-              <w:t>Snowy Plover Band Record Omission. Expecting record in Snowy Plover Bands but none are present.</w:t>
-            </w:r>
-          </w:p>
-        </w:tc>
-        <w:tc>
-          <w:tcPr>
-            <w:tcW w:w="2740" w:type="dxa"/>
-            <w:tcBorders>
-              <w:top w:val="nil"/>
-              <w:left w:val="nil"/>
-              <w:bottom w:val="nil"/>
-              <w:right w:val="nil"/>
-            </w:tcBorders>
-            <w:shd w:val="clear" w:color="auto" w:fill="auto"/>
-            <w:vAlign w:val="center"/>
-            <w:hideMark/>
-          </w:tcPr>
-          <w:p>
-            <w:pPr>
-              <w:spacing w:after="0"/>
-              <w:rPr>
-                <w:rFonts w:eastAsia="Times New Roman" w:cs="Arial"/>
-                <w:color w:val="000000"/>
-                <w:sz w:val="22"/>
-                <w:szCs w:val="22"/>
-              </w:rPr>
-            </w:pPr>
-            <w:r>
-              <w:rPr>
-                <w:rFonts w:eastAsia="Times New Roman" w:cs="Arial"/>
-                <w:color w:val="000000"/>
-                <w:sz w:val="22"/>
-                <w:szCs w:val="22"/>
-              </w:rPr>
-              <w:t>Use with caution in analysis</w:t>
-            </w:r>
-          </w:p>
-        </w:tc>
-      </w:tr>
-    </w:tbl>
-    <w:p>
-      <w:pPr>
-        <w:pStyle w:val="TableCaption"/>
-        <w:rPr>
-          <w:b/>
-          <w:bCs/>
-        </w:rPr>
-      </w:pPr>
     </w:p>
     <w:p>
       <w:pPr>
@@ -3760,6 +1560,7 @@
                 <w:sz w:val="22"/>
                 <w:szCs w:val="22"/>
               </w:rPr>
+              <w:lastRenderedPageBreak/>
               <w:t>Events</w:t>
             </w:r>
           </w:p>
@@ -4216,6 +2017,7 @@
         </w:rPr>
         <w:t xml:space="preserve"> </w:t>
       </w:r>
+      <w:proofErr w:type="gramStart"/>
       <w:r>
         <w:rPr>
           <w:sz w:val="22"/>
@@ -4224,12 +2026,29 @@
         </w:rPr>
         <w:t>a</w:t>
       </w:r>
+      <w:proofErr w:type="gramEnd"/>
       <w:r>
         <w:rPr>
           <w:sz w:val="22"/>
           <w:szCs w:val="22"/>
         </w:rPr>
-        <w:t xml:space="preserve"> The </w:t>
+        <w:t xml:space="preserve"> </w:t>
+      </w:r>
+      <w:proofErr w:type="gramStart"/>
+      <w:r>
+        <w:rPr>
+          <w:sz w:val="22"/>
+          <w:szCs w:val="22"/>
+        </w:rPr>
+        <w:t>The</w:t>
+      </w:r>
+      <w:proofErr w:type="gramEnd"/>
+      <w:r>
+        <w:rPr>
+          <w:sz w:val="22"/>
+          <w:szCs w:val="22"/>
+        </w:rPr>
+        <w:t xml:space="preserve"> </w:t>
       </w:r>
       <w:r>
         <w:rPr>
@@ -4312,6 +2131,7 @@
         <w:pStyle w:val="SourceCode"/>
       </w:pPr>
       <w:proofErr w:type="spellStart"/>
+      <w:proofErr w:type="gramStart"/>
       <w:r>
         <w:rPr>
           <w:rStyle w:val="VerbatimChar"/>
@@ -4326,6 +2146,7 @@
         <w:t>::</w:t>
       </w:r>
       <w:proofErr w:type="spellStart"/>
+      <w:proofErr w:type="gramEnd"/>
       <w:r>
         <w:rPr>
           <w:rStyle w:val="VerbatimChar"/>
@@ -4371,6 +2192,7 @@
         <w:br/>
       </w:r>
       <w:proofErr w:type="spellStart"/>
+      <w:proofErr w:type="gramStart"/>
       <w:r>
         <w:rPr>
           <w:rStyle w:val="VerbatimChar"/>
@@ -4385,11 +2207,19 @@
         <w:t>::</w:t>
       </w:r>
       <w:proofErr w:type="spellStart"/>
-      <w:r>
-        <w:rPr>
-          <w:rStyle w:val="VerbatimChar"/>
-        </w:rPr>
-        <w:t>get_data_packages</w:t>
+      <w:proofErr w:type="gramEnd"/>
+      <w:r>
+        <w:rPr>
+          <w:rStyle w:val="VerbatimChar"/>
+        </w:rPr>
+        <w:t>get_data_</w:t>
+      </w:r>
+      <w:proofErr w:type="gramStart"/>
+      <w:r>
+        <w:rPr>
+          <w:rStyle w:val="VerbatimChar"/>
+        </w:rPr>
+        <w:t>packages</w:t>
       </w:r>
       <w:proofErr w:type="spellEnd"/>
       <w:r>
@@ -4398,6 +2228,7 @@
         </w:rPr>
         <w:t>(</w:t>
       </w:r>
+      <w:proofErr w:type="gramEnd"/>
       <w:r>
         <w:rPr>
           <w:rStyle w:val="VerbatimChar"/>
@@ -4428,6 +2259,7 @@
         <w:t xml:space="preserve"> &lt;- </w:t>
       </w:r>
       <w:proofErr w:type="spellStart"/>
+      <w:proofErr w:type="gramStart"/>
       <w:r>
         <w:rPr>
           <w:rStyle w:val="VerbatimChar"/>
@@ -4442,11 +2274,19 @@
         <w:t>::</w:t>
       </w:r>
       <w:proofErr w:type="spellStart"/>
-      <w:r>
-        <w:rPr>
-          <w:rStyle w:val="VerbatimChar"/>
-        </w:rPr>
-        <w:t>load_data_package</w:t>
+      <w:proofErr w:type="gramEnd"/>
+      <w:r>
+        <w:rPr>
+          <w:rStyle w:val="VerbatimChar"/>
+        </w:rPr>
+        <w:t>load_data_</w:t>
+      </w:r>
+      <w:proofErr w:type="gramStart"/>
+      <w:r>
+        <w:rPr>
+          <w:rStyle w:val="VerbatimChar"/>
+        </w:rPr>
+        <w:t>package</w:t>
       </w:r>
       <w:proofErr w:type="spellEnd"/>
       <w:r>
@@ -4455,6 +2295,7 @@
         </w:rPr>
         <w:t>(</w:t>
       </w:r>
+      <w:proofErr w:type="gramEnd"/>
       <w:r>
         <w:rPr>
           <w:rStyle w:val="VerbatimChar"/>
@@ -4474,9 +2315,17 @@
         <w:rPr>
           <w:rStyle w:val="VerbatimChar"/>
         </w:rPr>
-        <w:t>list2env(</w:t>
+        <w:t>list2</w:t>
+      </w:r>
+      <w:proofErr w:type="gramStart"/>
+      <w:r>
+        <w:rPr>
+          <w:rStyle w:val="VerbatimChar"/>
+        </w:rPr>
+        <w:t>env(</w:t>
       </w:r>
       <w:proofErr w:type="spellStart"/>
+      <w:proofErr w:type="gramEnd"/>
       <w:r>
         <w:rPr>
           <w:rStyle w:val="VerbatimChar"/>
@@ -4502,7 +2351,14 @@
         <w:rPr>
           <w:rStyle w:val="VerbatimChar"/>
         </w:rPr>
-        <w:t xml:space="preserve"> = .</w:t>
+        <w:t xml:space="preserve"> </w:t>
+      </w:r>
+      <w:proofErr w:type="gramStart"/>
+      <w:r>
+        <w:rPr>
+          <w:rStyle w:val="VerbatimChar"/>
+        </w:rPr>
+        <w:t>= .</w:t>
       </w:r>
       <w:proofErr w:type="spellStart"/>
       <w:r>
@@ -4512,6 +2368,7 @@
         <w:t>GlobalEnv</w:t>
       </w:r>
       <w:proofErr w:type="spellEnd"/>
+      <w:proofErr w:type="gramEnd"/>
       <w:r>
         <w:rPr>
           <w:rStyle w:val="VerbatimChar"/>
@@ -4551,8 +2408,19 @@
         <w:pStyle w:val="BodyText"/>
       </w:pPr>
       <w:r>
+        <w:t xml:space="preserve">During surveys, observers walk along the shoreline of the survey area and keep the entire width of the beach in sight. Every 50-100 m, observers stop walking to scan the beach ahead of their location with binoculars. If a plover(s) is observed, observers approach the bird(s) no closer than 10 m away to record the age, sex, and leg band colors (if leg bands are present) of the bird(s). Additionally, observers record the date, location, and time of the sighting. After recording, observers walk around the birds to avoid disturbing the </w:t>
+      </w:r>
+      <w:r>
         <w:lastRenderedPageBreak/>
-        <w:t>During surveys, observers walk along the shoreline of the survey area and keep the entire width of the beach in sight. Every 50-100 m, observers stop walking to scan the beach ahead of their location with binoculars. If a plover(s) is observed, observers approach the bird(s) no closer than 10 m away to record the age, sex, and leg band colors (if leg bands are present) of the bird(s). Additionally, observers record the date, location, and time of the sighting. After recording, observers walk around the birds to avoid disturbing the birds/flushing, and continue their 50-100 m walking intervals along the shoreline of the survey area.</w:t>
+        <w:t>birds/</w:t>
+      </w:r>
+      <w:proofErr w:type="gramStart"/>
+      <w:r>
+        <w:t>flushing, and</w:t>
+      </w:r>
+      <w:proofErr w:type="gramEnd"/>
+      <w:r>
+        <w:t xml:space="preserve"> continue their 50-100 m walking intervals along the shoreline of the survey area.</w:t>
       </w:r>
     </w:p>
     <w:p>
@@ -4568,7 +2436,15 @@
         <w:pStyle w:val="BodyText"/>
       </w:pPr>
       <w:r>
-        <w:t>If a nest is found to be inactive during a visit, the cause of loss is determined and recorded. In the event that the adult plovers abandoned the nest, or the eggs in the nest have failed to hatch after 35 days, a plover biologist collects the unhatched eggs for further analysis.</w:t>
+        <w:t xml:space="preserve">If a nest is found to be inactive during a visit, the cause of loss is determined and recorded. </w:t>
+      </w:r>
+      <w:proofErr w:type="gramStart"/>
+      <w:r>
+        <w:t>In the event that</w:t>
+      </w:r>
+      <w:proofErr w:type="gramEnd"/>
+      <w:r>
+        <w:t xml:space="preserve"> the adult plovers abandoned the nest, or the eggs in the nest have failed to hatch after 35 days, a plover biologist collects the unhatched eggs for further analysis.</w:t>
       </w:r>
     </w:p>
     <w:p>
@@ -4654,7 +2530,15 @@
         <w:t>SNPL_Time</w:t>
       </w:r>
       <w:r>
-        <w:t xml:space="preserve"> column that contains the UTC time and offset, recommended by the IMD Data Cleanup SOP (Quevedo and Sherman 2023), while retaining a local time for easier reading for SFAN when referring back to these datasets. Please note that column </w:t>
+        <w:t xml:space="preserve"> column that contains the UTC time and offset, recommended by the IMD Data Cleanup SOP (Quevedo and Sherman 2023), while retaining a local time for easier reading for SFAN when </w:t>
+      </w:r>
+      <w:proofErr w:type="gramStart"/>
+      <w:r>
+        <w:t>referring back</w:t>
+      </w:r>
+      <w:proofErr w:type="gramEnd"/>
+      <w:r>
+        <w:t xml:space="preserve"> to these datasets. Please note that column </w:t>
       </w:r>
       <w:r>
         <w:rPr>
@@ -4689,42 +2573,53 @@
         <w:t>Unit_Code</w:t>
       </w:r>
       <w:r>
-        <w:t xml:space="preserve"> was added to explicitly state which park </w:t>
-      </w:r>
+        <w:t xml:space="preserve"> was added to explicitly state which park unit the observation was recorded in, in accordance with the IMD Data Cleanup SOP (Quevedo and Sherman 2023) guidance for datasets to be self-documenting.</w:t>
+      </w:r>
+    </w:p>
+    <w:p>
+      <w:pPr>
+        <w:pStyle w:val="BodyText"/>
+      </w:pPr>
+      <w:r>
+        <w:t xml:space="preserve">In datasets “SFAN_SNPL_ChickBands.csv” and “SFAN_SNPL_Events.csv”, column </w:t>
+      </w:r>
+      <w:r>
+        <w:rPr>
+          <w:rStyle w:val="VerbatimChar"/>
+        </w:rPr>
+        <w:t>Scientific_Name</w:t>
+      </w:r>
+      <w:r>
+        <w:t xml:space="preserve"> was added to explicitly state which organism was surveyed, in accordance with the IMD Data Cleanup SOP (Quevedo and Sherman 2023) guidance for datasets to be self-documenting.</w:t>
+      </w:r>
+    </w:p>
+    <w:p>
+      <w:pPr>
+        <w:pStyle w:val="BodyText"/>
+      </w:pPr>
       <w:r>
         <w:lastRenderedPageBreak/>
-        <w:t>unit the observation was recorded in, in accordance with the IMD Data Cleanup SOP (Quevedo and Sherman 2023) guidance for datasets to be self-documenting.</w:t>
-      </w:r>
-    </w:p>
-    <w:p>
-      <w:pPr>
-        <w:pStyle w:val="BodyText"/>
-      </w:pPr>
-      <w:r>
-        <w:t xml:space="preserve">In datasets “SFAN_SNPL_ChickBands.csv” and “SFAN_SNPL_Events.csv”, column </w:t>
-      </w:r>
-      <w:r>
-        <w:rPr>
-          <w:rStyle w:val="VerbatimChar"/>
-        </w:rPr>
-        <w:t>Scientific_Name</w:t>
-      </w:r>
-      <w:r>
-        <w:t xml:space="preserve"> was added to explicitly state which organism was surveyed, in accordance with the IMD Data Cleanup SOP (Quevedo and Sherman 2023) guidance for datasets to be self-documenting.</w:t>
-      </w:r>
-    </w:p>
-    <w:p>
-      <w:pPr>
-        <w:pStyle w:val="BodyText"/>
-      </w:pPr>
-      <w:r>
         <w:t xml:space="preserve">In datasets “SFAN_SNPL_Nesting.csv,” “SFAN_SNPL_Observations.csv,” and “SFAN_SNPL_Predators.csv,” columns and values for UTM coordinates were converted to latitude and longitude coordinates through usage of QCkit’s </w:t>
       </w:r>
       <w:r>
         <w:rPr>
           <w:rStyle w:val="VerbatimChar"/>
         </w:rPr>
-        <w:t>generate_ll_from_utm()</w:t>
+        <w:t>generate_ll_from_</w:t>
+      </w:r>
+      <w:proofErr w:type="gramStart"/>
+      <w:r>
+        <w:rPr>
+          <w:rStyle w:val="VerbatimChar"/>
+        </w:rPr>
+        <w:t>utm(</w:t>
+      </w:r>
+      <w:proofErr w:type="gramEnd"/>
+      <w:r>
+        <w:rPr>
+          <w:rStyle w:val="VerbatimChar"/>
+        </w:rPr>
+        <w:t>)</w:t>
       </w:r>
       <w:r>
         <w:t xml:space="preserve"> function (Baker et al. 2024b), as recommended by the IMD Data Cleanup SOP (Quevedo and Sherman 2023).</w:t>
@@ -4957,7 +2852,6 @@
       <w:bookmarkStart w:id="24" w:name="ref-QCkit"/>
       <w:bookmarkEnd w:id="23"/>
       <w:r>
-        <w:lastRenderedPageBreak/>
         <w:t xml:space="preserve">Baker, R., I. Quevedo, and J. Patterson. 2024b, February. QCkit v0.1.4. National Park Service; </w:t>
       </w:r>
       <w:hyperlink r:id="rId15">
@@ -5000,6 +2894,7 @@
       <w:bookmarkStart w:id="26" w:name="ref-package"/>
       <w:bookmarkEnd w:id="25"/>
       <w:r>
+        <w:lastRenderedPageBreak/>
         <w:t xml:space="preserve">Brown, J. R., and A. Ron. 2024a. Snowy Plover Monitoring at Point Reyes National Seashore, 1997-2023. National Park Service; </w:t>
       </w:r>
       <w:hyperlink r:id="rId17">
@@ -5145,7 +3040,23 @@
         <w:pStyle w:val="BodyText"/>
       </w:pPr>
       <w:r>
-        <w:t xml:space="preserve">qa_f132_MoreCheckedSNPL_ThanTotal - Returns surveys that have more SNPL checked for bands than the total SNPL (SNPL_Adult, SNPL_Hatchling,SNPL_Fledgling). QC default value is </w:t>
+        <w:t>qa_f132_MoreCheckedSNPL_ThanTotal - Returns surveys that have more SNPL checked for bands than the total SNPL (SNPL_Adult, SNPL_</w:t>
+      </w:r>
+      <w:proofErr w:type="gramStart"/>
+      <w:r>
+        <w:t>Hatchling,SNPL</w:t>
+      </w:r>
+      <w:proofErr w:type="gramEnd"/>
+      <w:r>
+        <w:t xml:space="preserve">_Fledgling). </w:t>
+      </w:r>
+      <w:proofErr w:type="gramStart"/>
+      <w:r>
+        <w:t>QC</w:t>
+      </w:r>
+      <w:proofErr w:type="gramEnd"/>
+      <w:r>
+        <w:t xml:space="preserve"> default value is </w:t>
       </w:r>
       <w:r>
         <w:rPr>
@@ -5196,14 +3107,56 @@
         <w:pStyle w:val="BodyText"/>
       </w:pPr>
       <w:r>
+        <w:t xml:space="preserve">qa_h102_Missing_Observers - Returns records where there is a blank observer field in for the survey or no observer has been provided. Delete the blank record in the survey form. QC default value is </w:t>
+      </w:r>
+      <w:r>
+        <w:rPr>
+          <w:rStyle w:val="VerbatimChar"/>
+        </w:rPr>
+        <w:t>NCD</w:t>
+      </w:r>
+      <w:r>
+        <w:t>.</w:t>
+      </w:r>
+    </w:p>
+    <w:p>
+      <w:pPr>
+        <w:pStyle w:val="BodyText"/>
+      </w:pPr>
+      <w:r>
+        <w:t xml:space="preserve">qa_j102_SNPL_ObservationTime_Error - Returns SNPL observation records where the observation time is outside the start or end times of survey event. Time should be entered in </w:t>
+      </w:r>
+      <w:proofErr w:type="gramStart"/>
+      <w:r>
+        <w:t>24 hour</w:t>
+      </w:r>
+      <w:proofErr w:type="gramEnd"/>
+      <w:r>
+        <w:t xml:space="preserve"> military format. QC default value is </w:t>
+      </w:r>
+      <w:r>
+        <w:rPr>
+          <w:rStyle w:val="VerbatimChar"/>
+        </w:rPr>
+        <w:t>LEOT</w:t>
+      </w:r>
+      <w:r>
+        <w:t>.</w:t>
+      </w:r>
+    </w:p>
+    <w:p>
+      <w:pPr>
+        <w:pStyle w:val="BodyText"/>
+      </w:pPr>
+      <w:r>
         <w:lastRenderedPageBreak/>
-        <w:t xml:space="preserve">qa_h102_Missing_Observers - Returns records where there is a blank observer field in for the survey or no observer has been provided. Delete the blank record in the survey form. QC default value is </w:t>
-      </w:r>
-      <w:r>
-        <w:rPr>
-          <w:rStyle w:val="VerbatimChar"/>
-        </w:rPr>
-        <w:t>NCD</w:t>
+        <w:t xml:space="preserve">qa_j132_NestID_Year_Mismatch - Returns records from SNPL_Obsevations where the survey year of the nest ID used does not match that in tblNestMaster. QC default value is </w:t>
+      </w:r>
+      <w:r>
+        <w:rPr>
+          <w:rStyle w:val="VerbatimChar"/>
+        </w:rPr>
+        <w:t>OEYDNM</w:t>
       </w:r>
       <w:r>
         <w:t>.</w:t>
@@ -5214,13 +3167,13 @@
         <w:pStyle w:val="BodyText"/>
       </w:pPr>
       <w:r>
-        <w:t xml:space="preserve">qa_j102_SNPL_ObservationTime_Error - Returns SNPL observation records where the observation time is outside the start or end times of survey event. Time should be entered in 24 hour military format. QC default value is </w:t>
-      </w:r>
-      <w:r>
-        <w:rPr>
-          <w:rStyle w:val="VerbatimChar"/>
-        </w:rPr>
-        <w:t>LEOT</w:t>
+        <w:t xml:space="preserve">qa_j142_Missing_Band_Totals - Returns records where there is data in tblSNPLBanded table for a specific observation time and the SNPL_Bands field in tblSNPLObservations is 0 or blank. QC default value is </w:t>
+      </w:r>
+      <w:r>
+        <w:rPr>
+          <w:rStyle w:val="VerbatimChar"/>
+        </w:rPr>
+        <w:t>ONBLE</w:t>
       </w:r>
       <w:r>
         <w:t>.</w:t>
@@ -5231,13 +3184,13 @@
         <w:pStyle w:val="BodyText"/>
       </w:pPr>
       <w:r>
-        <w:t xml:space="preserve">qa_j132_NestID_Year_Mismatch - Returns records from SNPL_Obsevations where the survey year of the nest ID used does not match that in tblNestMaster. QC default value is </w:t>
-      </w:r>
-      <w:r>
-        <w:rPr>
-          <w:rStyle w:val="VerbatimChar"/>
-        </w:rPr>
-        <w:t>OEYDNM</w:t>
+        <w:t xml:space="preserve">qa_j152_Missing_Band_Data_X - Returns records where there are no records in tblSNPLBanded, but where the SNPL_Bands field in tblSNPLObservations is greater than 0. QC default value is </w:t>
+      </w:r>
+      <w:r>
+        <w:rPr>
+          <w:rStyle w:val="VerbatimChar"/>
+        </w:rPr>
+        <w:t>SNBO</w:t>
       </w:r>
       <w:r>
         <w:t>.</w:t>
@@ -5248,41 +3201,15 @@
         <w:pStyle w:val="BodyText"/>
       </w:pPr>
       <w:r>
-        <w:t xml:space="preserve">qa_j142_Missing_Band_Totals - Returns records where there is data in tblSNPLBanded table for a specific observation time and the SNPL_Bands field in tblSNPLObservations is 0 or blank. QC default value is </w:t>
-      </w:r>
-      <w:r>
-        <w:rPr>
-          <w:rStyle w:val="VerbatimChar"/>
-        </w:rPr>
-        <w:t>ONBLE</w:t>
-      </w:r>
-      <w:r>
-        <w:t>.</w:t>
-      </w:r>
-    </w:p>
-    <w:p>
-      <w:pPr>
-        <w:pStyle w:val="BodyText"/>
-      </w:pPr>
-      <w:r>
-        <w:t xml:space="preserve">qa_j152_Missing_Band_Data_X - Returns records where there are no records in tblSNPLBanded, but where the SNPL_Bands field in tblSNPLObservations is greater than 0. QC default value is </w:t>
-      </w:r>
-      <w:r>
-        <w:rPr>
-          <w:rStyle w:val="VerbatimChar"/>
-        </w:rPr>
-        <w:t>SNBO</w:t>
-      </w:r>
-      <w:r>
-        <w:t>.</w:t>
-      </w:r>
-    </w:p>
-    <w:p>
-      <w:pPr>
-        <w:pStyle w:val="BodyText"/>
-      </w:pPr>
-      <w:r>
-        <w:t xml:space="preserve">qa_j162_Mismatched_Band_Obs - Returns records where there where the SNPL_Bands field in tblSNPLObservations does not match the number of records in tbl_SNPLBanded for the survey data and time. QC default value is </w:t>
+        <w:t xml:space="preserve">qa_j162_Mismatched_Band_Obs - Returns </w:t>
+      </w:r>
+      <w:proofErr w:type="gramStart"/>
+      <w:r>
+        <w:t>records where there</w:t>
+      </w:r>
+      <w:proofErr w:type="gramEnd"/>
+      <w:r>
+        <w:t xml:space="preserve"> where the SNPL_Bands field in tblSNPLObservations does not match the number of records in tbl_SNPLBanded for the survey data and time. QC default value is </w:t>
       </w:r>
       <w:r>
         <w:rPr>
@@ -5341,7 +3268,7 @@
 </file>
 
 <file path=word/endnotes.xml><?xml version="1.0" encoding="utf-8"?>
-<w:endnotes xmlns:wpc="http://schemas.microsoft.com/office/word/2010/wordprocessingCanvas" xmlns:cx="http://schemas.microsoft.com/office/drawing/2014/chartex" xmlns:cx1="http://schemas.microsoft.com/office/drawing/2015/9/8/chartex" xmlns:cx2="http://schemas.microsoft.com/office/drawing/2015/10/21/chartex" xmlns:cx3="http://schemas.microsoft.com/office/drawing/2016/5/9/chartex" xmlns:cx4="http://schemas.microsoft.com/office/drawing/2016/5/10/chartex" xmlns:cx5="http://schemas.microsoft.com/office/drawing/2016/5/11/chartex" xmlns:cx6="http://schemas.microsoft.com/office/drawing/2016/5/12/chartex" xmlns:cx7="http://schemas.microsoft.com/office/drawing/2016/5/13/chartex" xmlns:cx8="http://schemas.microsoft.com/office/drawing/2016/5/14/chartex" xmlns:mc="http://schemas.openxmlformats.org/markup-compatibility/2006" xmlns:aink="http://schemas.microsoft.com/office/drawing/2016/ink" xmlns:am3d="http://schemas.microsoft.com/office/drawing/2017/model3d" xmlns:o="urn:schemas-microsoft-com:office:office" xmlns:oel="http://schemas.microsoft.com/office/2019/extlst" xmlns:r="http://schemas.openxmlformats.org/officeDocument/2006/relationships" xmlns:m="http://schemas.openxmlformats.org/officeDocument/2006/math" xmlns:v="urn:schemas-microsoft-com:vml" xmlns:wp14="http://schemas.microsoft.com/office/word/2010/wordprocessingDrawing" xmlns:wp="http://schemas.openxmlformats.org/drawingml/2006/wordprocessingDrawing" xmlns:w10="urn:schemas-microsoft-com:office:word" xmlns:w="http://schemas.openxmlformats.org/wordprocessingml/2006/main" xmlns:w14="http://schemas.microsoft.com/office/word/2010/wordml" xmlns:w15="http://schemas.microsoft.com/office/word/2012/wordml" xmlns:w16cex="http://schemas.microsoft.com/office/word/2018/wordml/cex" xmlns:w16cid="http://schemas.microsoft.com/office/word/2016/wordml/cid" xmlns:w16="http://schemas.microsoft.com/office/word/2018/wordml" xmlns:w16sdtdh="http://schemas.microsoft.com/office/word/2020/wordml/sdtdatahash" xmlns:w16se="http://schemas.microsoft.com/office/word/2015/wordml/symex" xmlns:wpg="http://schemas.microsoft.com/office/word/2010/wordprocessingGroup" xmlns:wpi="http://schemas.microsoft.com/office/word/2010/wordprocessingInk" xmlns:wne="http://schemas.microsoft.com/office/word/2006/wordml" xmlns:wps="http://schemas.microsoft.com/office/word/2010/wordprocessingShape" mc:Ignorable="w14 w15 w16se w16cid w16 w16cex w16sdtdh wp14">
+<w:endnotes xmlns:wpc="http://schemas.microsoft.com/office/word/2010/wordprocessingCanvas" xmlns:cx="http://schemas.microsoft.com/office/drawing/2014/chartex" xmlns:cx1="http://schemas.microsoft.com/office/drawing/2015/9/8/chartex" xmlns:cx2="http://schemas.microsoft.com/office/drawing/2015/10/21/chartex" xmlns:cx3="http://schemas.microsoft.com/office/drawing/2016/5/9/chartex" xmlns:cx4="http://schemas.microsoft.com/office/drawing/2016/5/10/chartex" xmlns:cx5="http://schemas.microsoft.com/office/drawing/2016/5/11/chartex" xmlns:cx6="http://schemas.microsoft.com/office/drawing/2016/5/12/chartex" xmlns:cx7="http://schemas.microsoft.com/office/drawing/2016/5/13/chartex" xmlns:cx8="http://schemas.microsoft.com/office/drawing/2016/5/14/chartex" xmlns:mc="http://schemas.openxmlformats.org/markup-compatibility/2006" xmlns:aink="http://schemas.microsoft.com/office/drawing/2016/ink" xmlns:am3d="http://schemas.microsoft.com/office/drawing/2017/model3d" xmlns:o="urn:schemas-microsoft-com:office:office" xmlns:oel="http://schemas.microsoft.com/office/2019/extlst" xmlns:r="http://schemas.openxmlformats.org/officeDocument/2006/relationships" xmlns:m="http://schemas.openxmlformats.org/officeDocument/2006/math" xmlns:v="urn:schemas-microsoft-com:vml" xmlns:wp14="http://schemas.microsoft.com/office/word/2010/wordprocessingDrawing" xmlns:wp="http://schemas.openxmlformats.org/drawingml/2006/wordprocessingDrawing" xmlns:w10="urn:schemas-microsoft-com:office:word" xmlns:w="http://schemas.openxmlformats.org/wordprocessingml/2006/main" xmlns:w14="http://schemas.microsoft.com/office/word/2010/wordml" xmlns:w15="http://schemas.microsoft.com/office/word/2012/wordml" xmlns:w16cex="http://schemas.microsoft.com/office/word/2018/wordml/cex" xmlns:w16cid="http://schemas.microsoft.com/office/word/2016/wordml/cid" xmlns:w16="http://schemas.microsoft.com/office/word/2018/wordml" xmlns:w16du="http://schemas.microsoft.com/office/word/2023/wordml/word16du" xmlns:w16sdtdh="http://schemas.microsoft.com/office/word/2020/wordml/sdtdatahash" xmlns:w16sdtfl="http://schemas.microsoft.com/office/word/2024/wordml/sdtformatlock" xmlns:w16se="http://schemas.microsoft.com/office/word/2015/wordml/symex" xmlns:wpg="http://schemas.microsoft.com/office/word/2010/wordprocessingGroup" xmlns:wpi="http://schemas.microsoft.com/office/word/2010/wordprocessingInk" xmlns:wne="http://schemas.microsoft.com/office/word/2006/wordml" xmlns:wps="http://schemas.microsoft.com/office/word/2010/wordprocessingShape" mc:Ignorable="w14 w15 w16se w16cid w16 w16cex w16sdtdh w16sdtfl w16du wp14">
   <w:endnote w:type="separator" w:id="-1">
     <w:p>
       <w:pPr>
@@ -5366,7 +3293,7 @@
 </file>
 
 <file path=word/footer1.xml><?xml version="1.0" encoding="utf-8"?>
-<w:ftr xmlns:wpc="http://schemas.microsoft.com/office/word/2010/wordprocessingCanvas" xmlns:cx="http://schemas.microsoft.com/office/drawing/2014/chartex" xmlns:cx1="http://schemas.microsoft.com/office/drawing/2015/9/8/chartex" xmlns:cx2="http://schemas.microsoft.com/office/drawing/2015/10/21/chartex" xmlns:cx3="http://schemas.microsoft.com/office/drawing/2016/5/9/chartex" xmlns:cx4="http://schemas.microsoft.com/office/drawing/2016/5/10/chartex" xmlns:cx5="http://schemas.microsoft.com/office/drawing/2016/5/11/chartex" xmlns:cx6="http://schemas.microsoft.com/office/drawing/2016/5/12/chartex" xmlns:cx7="http://schemas.microsoft.com/office/drawing/2016/5/13/chartex" xmlns:cx8="http://schemas.microsoft.com/office/drawing/2016/5/14/chartex" xmlns:mc="http://schemas.openxmlformats.org/markup-compatibility/2006" xmlns:aink="http://schemas.microsoft.com/office/drawing/2016/ink" xmlns:am3d="http://schemas.microsoft.com/office/drawing/2017/model3d" xmlns:o="urn:schemas-microsoft-com:office:office" xmlns:oel="http://schemas.microsoft.com/office/2019/extlst" xmlns:r="http://schemas.openxmlformats.org/officeDocument/2006/relationships" xmlns:m="http://schemas.openxmlformats.org/officeDocument/2006/math" xmlns:v="urn:schemas-microsoft-com:vml" xmlns:wp14="http://schemas.microsoft.com/office/word/2010/wordprocessingDrawing" xmlns:wp="http://schemas.openxmlformats.org/drawingml/2006/wordprocessingDrawing" xmlns:w10="urn:schemas-microsoft-com:office:word" xmlns:w="http://schemas.openxmlformats.org/wordprocessingml/2006/main" xmlns:w14="http://schemas.microsoft.com/office/word/2010/wordml" xmlns:w15="http://schemas.microsoft.com/office/word/2012/wordml" xmlns:w16cex="http://schemas.microsoft.com/office/word/2018/wordml/cex" xmlns:w16cid="http://schemas.microsoft.com/office/word/2016/wordml/cid" xmlns:w16="http://schemas.microsoft.com/office/word/2018/wordml" xmlns:w16sdtdh="http://schemas.microsoft.com/office/word/2020/wordml/sdtdatahash" xmlns:w16se="http://schemas.microsoft.com/office/word/2015/wordml/symex" xmlns:wpg="http://schemas.microsoft.com/office/word/2010/wordprocessingGroup" xmlns:wpi="http://schemas.microsoft.com/office/word/2010/wordprocessingInk" xmlns:wne="http://schemas.microsoft.com/office/word/2006/wordml" xmlns:wps="http://schemas.microsoft.com/office/word/2010/wordprocessingShape" mc:Ignorable="w14 w15 w16se w16cid w16 w16cex w16sdtdh wp14">
+<w:ftr xmlns:wpc="http://schemas.microsoft.com/office/word/2010/wordprocessingCanvas" xmlns:cx="http://schemas.microsoft.com/office/drawing/2014/chartex" xmlns:cx1="http://schemas.microsoft.com/office/drawing/2015/9/8/chartex" xmlns:cx2="http://schemas.microsoft.com/office/drawing/2015/10/21/chartex" xmlns:cx3="http://schemas.microsoft.com/office/drawing/2016/5/9/chartex" xmlns:cx4="http://schemas.microsoft.com/office/drawing/2016/5/10/chartex" xmlns:cx5="http://schemas.microsoft.com/office/drawing/2016/5/11/chartex" xmlns:cx6="http://schemas.microsoft.com/office/drawing/2016/5/12/chartex" xmlns:cx7="http://schemas.microsoft.com/office/drawing/2016/5/13/chartex" xmlns:cx8="http://schemas.microsoft.com/office/drawing/2016/5/14/chartex" xmlns:mc="http://schemas.openxmlformats.org/markup-compatibility/2006" xmlns:aink="http://schemas.microsoft.com/office/drawing/2016/ink" xmlns:am3d="http://schemas.microsoft.com/office/drawing/2017/model3d" xmlns:o="urn:schemas-microsoft-com:office:office" xmlns:oel="http://schemas.microsoft.com/office/2019/extlst" xmlns:r="http://schemas.openxmlformats.org/officeDocument/2006/relationships" xmlns:m="http://schemas.openxmlformats.org/officeDocument/2006/math" xmlns:v="urn:schemas-microsoft-com:vml" xmlns:wp14="http://schemas.microsoft.com/office/word/2010/wordprocessingDrawing" xmlns:wp="http://schemas.openxmlformats.org/drawingml/2006/wordprocessingDrawing" xmlns:w10="urn:schemas-microsoft-com:office:word" xmlns:w="http://schemas.openxmlformats.org/wordprocessingml/2006/main" xmlns:w14="http://schemas.microsoft.com/office/word/2010/wordml" xmlns:w15="http://schemas.microsoft.com/office/word/2012/wordml" xmlns:w16cex="http://schemas.microsoft.com/office/word/2018/wordml/cex" xmlns:w16cid="http://schemas.microsoft.com/office/word/2016/wordml/cid" xmlns:w16="http://schemas.microsoft.com/office/word/2018/wordml" xmlns:w16du="http://schemas.microsoft.com/office/word/2023/wordml/word16du" xmlns:w16sdtdh="http://schemas.microsoft.com/office/word/2020/wordml/sdtdatahash" xmlns:w16sdtfl="http://schemas.microsoft.com/office/word/2024/wordml/sdtformatlock" xmlns:w16se="http://schemas.microsoft.com/office/word/2015/wordml/symex" xmlns:wpg="http://schemas.microsoft.com/office/word/2010/wordprocessingGroup" xmlns:wpi="http://schemas.microsoft.com/office/word/2010/wordprocessingInk" xmlns:wne="http://schemas.microsoft.com/office/word/2006/wordml" xmlns:wps="http://schemas.microsoft.com/office/word/2010/wordprocessingShape" mc:Ignorable="w14 w15 w16se w16cid w16 w16cex w16sdtdh w16sdtfl w16du wp14">
   <w:sdt>
     <w:sdtPr>
       <w:id w:val="683564432"/>
@@ -5419,7 +3346,7 @@
 </file>
 
 <file path=word/footnotes.xml><?xml version="1.0" encoding="utf-8"?>
-<w:footnotes xmlns:wpc="http://schemas.microsoft.com/office/word/2010/wordprocessingCanvas" xmlns:cx="http://schemas.microsoft.com/office/drawing/2014/chartex" xmlns:cx1="http://schemas.microsoft.com/office/drawing/2015/9/8/chartex" xmlns:cx2="http://schemas.microsoft.com/office/drawing/2015/10/21/chartex" xmlns:cx3="http://schemas.microsoft.com/office/drawing/2016/5/9/chartex" xmlns:cx4="http://schemas.microsoft.com/office/drawing/2016/5/10/chartex" xmlns:cx5="http://schemas.microsoft.com/office/drawing/2016/5/11/chartex" xmlns:cx6="http://schemas.microsoft.com/office/drawing/2016/5/12/chartex" xmlns:cx7="http://schemas.microsoft.com/office/drawing/2016/5/13/chartex" xmlns:cx8="http://schemas.microsoft.com/office/drawing/2016/5/14/chartex" xmlns:mc="http://schemas.openxmlformats.org/markup-compatibility/2006" xmlns:aink="http://schemas.microsoft.com/office/drawing/2016/ink" xmlns:am3d="http://schemas.microsoft.com/office/drawing/2017/model3d" xmlns:o="urn:schemas-microsoft-com:office:office" xmlns:oel="http://schemas.microsoft.com/office/2019/extlst" xmlns:r="http://schemas.openxmlformats.org/officeDocument/2006/relationships" xmlns:m="http://schemas.openxmlformats.org/officeDocument/2006/math" xmlns:v="urn:schemas-microsoft-com:vml" xmlns:wp14="http://schemas.microsoft.com/office/word/2010/wordprocessingDrawing" xmlns:wp="http://schemas.openxmlformats.org/drawingml/2006/wordprocessingDrawing" xmlns:w10="urn:schemas-microsoft-com:office:word" xmlns:w="http://schemas.openxmlformats.org/wordprocessingml/2006/main" xmlns:w14="http://schemas.microsoft.com/office/word/2010/wordml" xmlns:w15="http://schemas.microsoft.com/office/word/2012/wordml" xmlns:w16cex="http://schemas.microsoft.com/office/word/2018/wordml/cex" xmlns:w16cid="http://schemas.microsoft.com/office/word/2016/wordml/cid" xmlns:w16="http://schemas.microsoft.com/office/word/2018/wordml" xmlns:w16sdtdh="http://schemas.microsoft.com/office/word/2020/wordml/sdtdatahash" xmlns:w16se="http://schemas.microsoft.com/office/word/2015/wordml/symex" xmlns:wpg="http://schemas.microsoft.com/office/word/2010/wordprocessingGroup" xmlns:wpi="http://schemas.microsoft.com/office/word/2010/wordprocessingInk" xmlns:wne="http://schemas.microsoft.com/office/word/2006/wordml" xmlns:wps="http://schemas.microsoft.com/office/word/2010/wordprocessingShape" mc:Ignorable="w14 w15 w16se w16cid w16 w16cex w16sdtdh wp14">
+<w:footnotes xmlns:wpc="http://schemas.microsoft.com/office/word/2010/wordprocessingCanvas" xmlns:cx="http://schemas.microsoft.com/office/drawing/2014/chartex" xmlns:cx1="http://schemas.microsoft.com/office/drawing/2015/9/8/chartex" xmlns:cx2="http://schemas.microsoft.com/office/drawing/2015/10/21/chartex" xmlns:cx3="http://schemas.microsoft.com/office/drawing/2016/5/9/chartex" xmlns:cx4="http://schemas.microsoft.com/office/drawing/2016/5/10/chartex" xmlns:cx5="http://schemas.microsoft.com/office/drawing/2016/5/11/chartex" xmlns:cx6="http://schemas.microsoft.com/office/drawing/2016/5/12/chartex" xmlns:cx7="http://schemas.microsoft.com/office/drawing/2016/5/13/chartex" xmlns:cx8="http://schemas.microsoft.com/office/drawing/2016/5/14/chartex" xmlns:mc="http://schemas.openxmlformats.org/markup-compatibility/2006" xmlns:aink="http://schemas.microsoft.com/office/drawing/2016/ink" xmlns:am3d="http://schemas.microsoft.com/office/drawing/2017/model3d" xmlns:o="urn:schemas-microsoft-com:office:office" xmlns:oel="http://schemas.microsoft.com/office/2019/extlst" xmlns:r="http://schemas.openxmlformats.org/officeDocument/2006/relationships" xmlns:m="http://schemas.openxmlformats.org/officeDocument/2006/math" xmlns:v="urn:schemas-microsoft-com:vml" xmlns:wp14="http://schemas.microsoft.com/office/word/2010/wordprocessingDrawing" xmlns:wp="http://schemas.openxmlformats.org/drawingml/2006/wordprocessingDrawing" xmlns:w10="urn:schemas-microsoft-com:office:word" xmlns:w="http://schemas.openxmlformats.org/wordprocessingml/2006/main" xmlns:w14="http://schemas.microsoft.com/office/word/2010/wordml" xmlns:w15="http://schemas.microsoft.com/office/word/2012/wordml" xmlns:w16cex="http://schemas.microsoft.com/office/word/2018/wordml/cex" xmlns:w16cid="http://schemas.microsoft.com/office/word/2016/wordml/cid" xmlns:w16="http://schemas.microsoft.com/office/word/2018/wordml" xmlns:w16du="http://schemas.microsoft.com/office/word/2023/wordml/word16du" xmlns:w16sdtdh="http://schemas.microsoft.com/office/word/2020/wordml/sdtdatahash" xmlns:w16sdtfl="http://schemas.microsoft.com/office/word/2024/wordml/sdtformatlock" xmlns:w16se="http://schemas.microsoft.com/office/word/2015/wordml/symex" xmlns:wpg="http://schemas.microsoft.com/office/word/2010/wordprocessingGroup" xmlns:wpi="http://schemas.microsoft.com/office/word/2010/wordprocessingInk" xmlns:wne="http://schemas.microsoft.com/office/word/2006/wordml" xmlns:wps="http://schemas.microsoft.com/office/word/2010/wordprocessingShape" mc:Ignorable="w14 w15 w16se w16cid w16 w16cex w16sdtdh w16sdtfl w16du wp14">
   <w:footnote w:type="separator" w:id="-1">
     <w:p>
       <w:pPr>
@@ -5444,7 +3371,7 @@
 </file>
 
 <file path=word/numbering.xml><?xml version="1.0" encoding="utf-8"?>
-<w:numbering xmlns:wpc="http://schemas.microsoft.com/office/word/2010/wordprocessingCanvas" xmlns:cx="http://schemas.microsoft.com/office/drawing/2014/chartex" xmlns:cx1="http://schemas.microsoft.com/office/drawing/2015/9/8/chartex" xmlns:cx2="http://schemas.microsoft.com/office/drawing/2015/10/21/chartex" xmlns:cx3="http://schemas.microsoft.com/office/drawing/2016/5/9/chartex" xmlns:cx4="http://schemas.microsoft.com/office/drawing/2016/5/10/chartex" xmlns:cx5="http://schemas.microsoft.com/office/drawing/2016/5/11/chartex" xmlns:cx6="http://schemas.microsoft.com/office/drawing/2016/5/12/chartex" xmlns:cx7="http://schemas.microsoft.com/office/drawing/2016/5/13/chartex" xmlns:cx8="http://schemas.microsoft.com/office/drawing/2016/5/14/chartex" xmlns:mc="http://schemas.openxmlformats.org/markup-compatibility/2006" xmlns:aink="http://schemas.microsoft.com/office/drawing/2016/ink" xmlns:am3d="http://schemas.microsoft.com/office/drawing/2017/model3d" xmlns:o="urn:schemas-microsoft-com:office:office" xmlns:oel="http://schemas.microsoft.com/office/2019/extlst" xmlns:r="http://schemas.openxmlformats.org/officeDocument/2006/relationships" xmlns:m="http://schemas.openxmlformats.org/officeDocument/2006/math" xmlns:v="urn:schemas-microsoft-com:vml" xmlns:wp14="http://schemas.microsoft.com/office/word/2010/wordprocessingDrawing" xmlns:wp="http://schemas.openxmlformats.org/drawingml/2006/wordprocessingDrawing" xmlns:w10="urn:schemas-microsoft-com:office:word" xmlns:w="http://schemas.openxmlformats.org/wordprocessingml/2006/main" xmlns:w14="http://schemas.microsoft.com/office/word/2010/wordml" xmlns:w15="http://schemas.microsoft.com/office/word/2012/wordml" xmlns:w16cex="http://schemas.microsoft.com/office/word/2018/wordml/cex" xmlns:w16cid="http://schemas.microsoft.com/office/word/2016/wordml/cid" xmlns:w16="http://schemas.microsoft.com/office/word/2018/wordml" xmlns:w16sdtdh="http://schemas.microsoft.com/office/word/2020/wordml/sdtdatahash" xmlns:w16se="http://schemas.microsoft.com/office/word/2015/wordml/symex" xmlns:wpg="http://schemas.microsoft.com/office/word/2010/wordprocessingGroup" xmlns:wpi="http://schemas.microsoft.com/office/word/2010/wordprocessingInk" xmlns:wne="http://schemas.microsoft.com/office/word/2006/wordml" xmlns:wps="http://schemas.microsoft.com/office/word/2010/wordprocessingShape" mc:Ignorable="w14 w15 w16se w16cid w16 w16cex w16sdtdh wp14">
+<w:numbering xmlns:wpc="http://schemas.microsoft.com/office/word/2010/wordprocessingCanvas" xmlns:cx="http://schemas.microsoft.com/office/drawing/2014/chartex" xmlns:cx1="http://schemas.microsoft.com/office/drawing/2015/9/8/chartex" xmlns:cx2="http://schemas.microsoft.com/office/drawing/2015/10/21/chartex" xmlns:cx3="http://schemas.microsoft.com/office/drawing/2016/5/9/chartex" xmlns:cx4="http://schemas.microsoft.com/office/drawing/2016/5/10/chartex" xmlns:cx5="http://schemas.microsoft.com/office/drawing/2016/5/11/chartex" xmlns:cx6="http://schemas.microsoft.com/office/drawing/2016/5/12/chartex" xmlns:cx7="http://schemas.microsoft.com/office/drawing/2016/5/13/chartex" xmlns:cx8="http://schemas.microsoft.com/office/drawing/2016/5/14/chartex" xmlns:mc="http://schemas.openxmlformats.org/markup-compatibility/2006" xmlns:aink="http://schemas.microsoft.com/office/drawing/2016/ink" xmlns:am3d="http://schemas.microsoft.com/office/drawing/2017/model3d" xmlns:o="urn:schemas-microsoft-com:office:office" xmlns:oel="http://schemas.microsoft.com/office/2019/extlst" xmlns:r="http://schemas.openxmlformats.org/officeDocument/2006/relationships" xmlns:m="http://schemas.openxmlformats.org/officeDocument/2006/math" xmlns:v="urn:schemas-microsoft-com:vml" xmlns:wp14="http://schemas.microsoft.com/office/word/2010/wordprocessingDrawing" xmlns:wp="http://schemas.openxmlformats.org/drawingml/2006/wordprocessingDrawing" xmlns:w10="urn:schemas-microsoft-com:office:word" xmlns:w="http://schemas.openxmlformats.org/wordprocessingml/2006/main" xmlns:w14="http://schemas.microsoft.com/office/word/2010/wordml" xmlns:w15="http://schemas.microsoft.com/office/word/2012/wordml" xmlns:w16cex="http://schemas.microsoft.com/office/word/2018/wordml/cex" xmlns:w16cid="http://schemas.microsoft.com/office/word/2016/wordml/cid" xmlns:w16="http://schemas.microsoft.com/office/word/2018/wordml" xmlns:w16du="http://schemas.microsoft.com/office/word/2023/wordml/word16du" xmlns:w16sdtdh="http://schemas.microsoft.com/office/word/2020/wordml/sdtdatahash" xmlns:w16sdtfl="http://schemas.microsoft.com/office/word/2024/wordml/sdtformatlock" xmlns:w16se="http://schemas.microsoft.com/office/word/2015/wordml/symex" xmlns:wpg="http://schemas.microsoft.com/office/word/2010/wordprocessingGroup" xmlns:wpi="http://schemas.microsoft.com/office/word/2010/wordprocessingInk" xmlns:wne="http://schemas.microsoft.com/office/word/2006/wordml" xmlns:wps="http://schemas.microsoft.com/office/word/2010/wordprocessingShape" mc:Ignorable="w14 w15 w16se w16cid w16 w16cex w16sdtdh w16sdtfl w16du wp14">
   <w:abstractNum w:abstractNumId="0" w15:restartNumberingAfterBreak="0">
     <w:nsid w:val="0000A990"/>
     <w:multiLevelType w:val="multilevel"/>
@@ -5529,7 +3456,7 @@
 </file>
 
 <file path=word/styles.xml><?xml version="1.0" encoding="utf-8"?>
-<w:styles xmlns:mc="http://schemas.openxmlformats.org/markup-compatibility/2006" xmlns:r="http://schemas.openxmlformats.org/officeDocument/2006/relationships" xmlns:w="http://schemas.openxmlformats.org/wordprocessingml/2006/main" xmlns:w14="http://schemas.microsoft.com/office/word/2010/wordml" xmlns:w15="http://schemas.microsoft.com/office/word/2012/wordml" xmlns:w16cex="http://schemas.microsoft.com/office/word/2018/wordml/cex" xmlns:w16cid="http://schemas.microsoft.com/office/word/2016/wordml/cid" xmlns:w16="http://schemas.microsoft.com/office/word/2018/wordml" xmlns:w16sdtdh="http://schemas.microsoft.com/office/word/2020/wordml/sdtdatahash" xmlns:w16se="http://schemas.microsoft.com/office/word/2015/wordml/symex" mc:Ignorable="w14 w15 w16se w16cid w16 w16cex w16sdtdh">
+<w:styles xmlns:mc="http://schemas.openxmlformats.org/markup-compatibility/2006" xmlns:r="http://schemas.openxmlformats.org/officeDocument/2006/relationships" xmlns:w="http://schemas.openxmlformats.org/wordprocessingml/2006/main" xmlns:w14="http://schemas.microsoft.com/office/word/2010/wordml" xmlns:w15="http://schemas.microsoft.com/office/word/2012/wordml" xmlns:w16cex="http://schemas.microsoft.com/office/word/2018/wordml/cex" xmlns:w16cid="http://schemas.microsoft.com/office/word/2016/wordml/cid" xmlns:w16="http://schemas.microsoft.com/office/word/2018/wordml" xmlns:w16du="http://schemas.microsoft.com/office/word/2023/wordml/word16du" xmlns:w16sdtdh="http://schemas.microsoft.com/office/word/2020/wordml/sdtdatahash" xmlns:w16sdtfl="http://schemas.microsoft.com/office/word/2024/wordml/sdtformatlock" xmlns:w16se="http://schemas.microsoft.com/office/word/2015/wordml/symex" mc:Ignorable="w14 w15 w16se w16cid w16 w16cex w16sdtdh w16sdtfl w16du">
   <w:docDefaults>
     <w:rPrDefault>
       <w:rPr>
@@ -7132,26 +5059,6 @@
 </file>
 
 <file path=customXml/item1.xml><?xml version="1.0" encoding="utf-8"?>
-<p:properties xmlns:p="http://schemas.microsoft.com/office/2006/metadata/properties" xmlns:xsi="http://www.w3.org/2001/XMLSchema-instance" xmlns:pc="http://schemas.microsoft.com/office/infopath/2007/PartnerControls">
-  <documentManagement>
-    <lcf76f155ced4ddcb4097134ff3c332f xmlns="ad085b6c-7437-411b-8b38-47c968abd347">
-      <Terms xmlns="http://schemas.microsoft.com/office/infopath/2007/PartnerControls"/>
-    </lcf76f155ced4ddcb4097134ff3c332f>
-    <TaxCatchAll xmlns="31062a0d-ede8-4112-b4bb-00a9c1bc8e16" xsi:nil="true"/>
-  </documentManagement>
-</p:properties>
-</file>
-
-<file path=customXml/item2.xml><?xml version="1.0" encoding="utf-8"?>
-<?mso-contentType ?>
-<FormTemplates xmlns="http://schemas.microsoft.com/sharepoint/v3/contenttype/forms">
-  <Display>DocumentLibraryForm</Display>
-  <Edit>DocumentLibraryForm</Edit>
-  <New>DocumentLibraryForm</New>
-</FormTemplates>
-</file>
-
-<file path=customXml/item3.xml><?xml version="1.0" encoding="utf-8"?>
 <ct:contentTypeSchema xmlns:ct="http://schemas.microsoft.com/office/2006/metadata/contentType" xmlns:ma="http://schemas.microsoft.com/office/2006/metadata/properties/metaAttributes" ct:_="" ma:_="" ma:contentTypeName="Document" ma:contentTypeID="0x010100082CD3E31919CD4D8655811E15D5BC27" ma:contentTypeVersion="15" ma:contentTypeDescription="Create a new document." ma:contentTypeScope="" ma:versionID="729ac04ea1630219c040c2ff78caacb6">
   <xsd:schema xmlns:xsd="http://www.w3.org/2001/XMLSchema" xmlns:xs="http://www.w3.org/2001/XMLSchema" xmlns:p="http://schemas.microsoft.com/office/2006/metadata/properties" xmlns:ns2="ad085b6c-7437-411b-8b38-47c968abd347" xmlns:ns3="4671cff1-bb98-4362-b999-0807e48a599e" xmlns:ns4="31062a0d-ede8-4112-b4bb-00a9c1bc8e16" targetNamespace="http://schemas.microsoft.com/office/2006/metadata/properties" ma:root="true" ma:fieldsID="241d4379ad00e4ac2cac03ddcde72730" ns2:_="" ns3:_="" ns4:_="">
     <xsd:import namespace="ad085b6c-7437-411b-8b38-47c968abd347"/>
@@ -7391,26 +5298,27 @@
 </ct:contentTypeSchema>
 </file>
 
-<file path=customXml/itemProps1.xml><?xml version="1.0" encoding="utf-8"?>
-<ds:datastoreItem xmlns:ds="http://schemas.openxmlformats.org/officeDocument/2006/customXml" ds:itemID="{91F9EDDB-208F-4099-BB03-B0E33B4BAF4C}">
-  <ds:schemaRefs>
-    <ds:schemaRef ds:uri="http://schemas.microsoft.com/office/2006/metadata/properties"/>
-    <ds:schemaRef ds:uri="http://schemas.microsoft.com/office/infopath/2007/PartnerControls"/>
-    <ds:schemaRef ds:uri="ad085b6c-7437-411b-8b38-47c968abd347"/>
-    <ds:schemaRef ds:uri="31062a0d-ede8-4112-b4bb-00a9c1bc8e16"/>
-  </ds:schemaRefs>
-</ds:datastoreItem>
+<file path=customXml/item2.xml><?xml version="1.0" encoding="utf-8"?>
+<?mso-contentType ?>
+<FormTemplates xmlns="http://schemas.microsoft.com/sharepoint/v3/contenttype/forms">
+  <Display>DocumentLibraryForm</Display>
+  <Edit>DocumentLibraryForm</Edit>
+  <New>DocumentLibraryForm</New>
+</FormTemplates>
 </file>
 
-<file path=customXml/itemProps2.xml><?xml version="1.0" encoding="utf-8"?>
-<ds:datastoreItem xmlns:ds="http://schemas.openxmlformats.org/officeDocument/2006/customXml" ds:itemID="{1574FA4D-C623-4478-BD29-C9A7DCE7A61F}">
-  <ds:schemaRefs>
-    <ds:schemaRef ds:uri="http://schemas.microsoft.com/sharepoint/v3/contenttype/forms"/>
-  </ds:schemaRefs>
-</ds:datastoreItem>
+<file path=customXml/item3.xml><?xml version="1.0" encoding="utf-8"?>
+<p:properties xmlns:p="http://schemas.microsoft.com/office/2006/metadata/properties" xmlns:xsi="http://www.w3.org/2001/XMLSchema-instance" xmlns:pc="http://schemas.microsoft.com/office/infopath/2007/PartnerControls">
+  <documentManagement>
+    <lcf76f155ced4ddcb4097134ff3c332f xmlns="ad085b6c-7437-411b-8b38-47c968abd347">
+      <Terms xmlns="http://schemas.microsoft.com/office/infopath/2007/PartnerControls"/>
+    </lcf76f155ced4ddcb4097134ff3c332f>
+    <TaxCatchAll xmlns="31062a0d-ede8-4112-b4bb-00a9c1bc8e16" xsi:nil="true"/>
+  </documentManagement>
+</p:properties>
 </file>
 
-<file path=customXml/itemProps3.xml><?xml version="1.0" encoding="utf-8"?>
+<file path=customXml/itemProps1.xml><?xml version="1.0" encoding="utf-8"?>
 <ds:datastoreItem xmlns:ds="http://schemas.openxmlformats.org/officeDocument/2006/customXml" ds:itemID="{9C72E5BE-70BD-49BD-B0FF-C90E276FBC07}">
   <ds:schemaRefs>
     <ds:schemaRef ds:uri="http://schemas.microsoft.com/office/2006/metadata/contentType"/>
@@ -7428,4 +5336,29 @@
     <ds:schemaRef ds:uri="http://schemas.microsoft.com/internal/obd"/>
   </ds:schemaRefs>
 </ds:datastoreItem>
+</file>
+
+<file path=customXml/itemProps2.xml><?xml version="1.0" encoding="utf-8"?>
+<ds:datastoreItem xmlns:ds="http://schemas.openxmlformats.org/officeDocument/2006/customXml" ds:itemID="{1574FA4D-C623-4478-BD29-C9A7DCE7A61F}">
+  <ds:schemaRefs>
+    <ds:schemaRef ds:uri="http://schemas.microsoft.com/sharepoint/v3/contenttype/forms"/>
+  </ds:schemaRefs>
+</ds:datastoreItem>
+</file>
+
+<file path=customXml/itemProps3.xml><?xml version="1.0" encoding="utf-8"?>
+<ds:datastoreItem xmlns:ds="http://schemas.openxmlformats.org/officeDocument/2006/customXml" ds:itemID="{91F9EDDB-208F-4099-BB03-B0E33B4BAF4C}">
+  <ds:schemaRefs>
+    <ds:schemaRef ds:uri="http://schemas.microsoft.com/office/2006/metadata/properties"/>
+    <ds:schemaRef ds:uri="http://schemas.microsoft.com/office/infopath/2007/PartnerControls"/>
+    <ds:schemaRef ds:uri="ad085b6c-7437-411b-8b38-47c968abd347"/>
+    <ds:schemaRef ds:uri="31062a0d-ede8-4112-b4bb-00a9c1bc8e16"/>
+  </ds:schemaRefs>
+</ds:datastoreItem>
+</file>
+
+<file path=docMetadata/LabelInfo.xml><?xml version="1.0" encoding="utf-8"?>
+<clbl:labelList xmlns:clbl="http://schemas.microsoft.com/office/2020/mipLabelMetadata">
+  <clbl:label id="{6dd02d64-b7f3-43f7-a145-cfd68d338edf}" enabled="1" method="Standard" siteId="{0693b5ba-4b18-4d7b-9341-f32f400a5494}" contentBits="0" removed="0"/>
+</clbl:labelList>
 </file>
</xml_diff>